<commit_message>
Add redacted secret configuration evidence
Co-authored-by: Copilot App <223556219+Copilot@users.noreply.github.com>
</commit_message>
<xml_diff>
--- a/submission/CBE204_Week6_Lab_Sheet_Completed_DRAFT.docx
+++ b/submission/CBE204_Week6_Lab_Sheet_Completed_DRAFT.docx
@@ -21225,7 +21225,7 @@
     </w:p>
     <w:p>
       <w:r>
-        <w:t>Evidence integrity: E02 is a copy of the successful-login screenshot with the entire bearer-token value covered by an opaque black rectangle. No screenshots exposing JWT_SECRET, raw successful tokens, stale failed attempts, or Postman password variables are included. Evidence files are under submission/evidence/.</w:t>
+        <w:t>Evidence integrity: E02 redacts the full login bearer token; E18 redacts the JWT signing secret in both the terminal and .env editor; E19 redacts the Postman password value and the entire saved-token variable row. The original E18/E19 images contain credentials and are intentionally excluded from this submission. The local ignored secure-api/.env signing secret was rotated after the exposure; its new value was not printed or committed. Evidence copies are under submission/evidence/.</w:t>
       </w:r>
     </w:p>
     <w:p>
@@ -22961,7 +22961,7 @@
     </w:p>
     <w:p>
       <w:r>
-        <w:t>The committed collection groups authentication/CRUD and security checks. It includes registration, login, current user, protected access, task CRUD, invalid registration/password, missing authentication, modified/malformed token, student admin denial, second-student task denial, logout and revoked-token denial. It does not include an expired-token request although the lab’s suggested collection structure lists one.</w:t>
+        <w:t>The committed collection groups authentication/CRUD and security checks. It includes registration, login, current user, protected access, task CRUD, invalid registration/password, missing authentication, modified/malformed token, student admin denial, second-student task denial, logout and revoked-token denial. It does not include an expired-token request although the lab’s suggested collection structure lists one. Exhibit E19 shows the collection variables with the default password value and saved-token row redacted.</w:t>
       </w:r>
     </w:p>
     <w:p>
@@ -24594,7 +24594,7 @@
           </w:tcPr>
           <w:p>
             <w:r>
-              <w:t>JWT_SECRET from environment; vulnerable-api deliberately insecure and local-only.</w:t>
+              <w:t>JWT_SECRET from environment; vulnerable-api deliberately insecure and local-only. Redacted configuration screenshot E18; exposed local key was rotated and not committed.</w:t>
             </w:r>
           </w:p>
         </w:tc>
@@ -25510,11 +25510,75 @@
           </w:p>
         </w:tc>
       </w:tr>
+      <w:tr>
+        <w:tc>
+          <w:tcPr>
+            <w:tcW w:type="dxa" w:w="3120"/>
+          </w:tcPr>
+          <w:p>
+            <w:r>
+              <w:t>E18</w:t>
+            </w:r>
+          </w:p>
+        </w:tc>
+        <w:tc>
+          <w:tcPr>
+            <w:tcW w:type="dxa" w:w="3120"/>
+          </w:tcPr>
+          <w:p>
+            <w:r>
+              <w:t>JWT_SECRET configuration shown; terminal and .env values redacted</w:t>
+            </w:r>
+          </w:p>
+        </w:tc>
+        <w:tc>
+          <w:tcPr>
+            <w:tcW w:type="dxa" w:w="3120"/>
+          </w:tcPr>
+          <w:p>
+            <w:r>
+              <w:t>evidence/E18.png</w:t>
+            </w:r>
+          </w:p>
+        </w:tc>
+      </w:tr>
+      <w:tr>
+        <w:tc>
+          <w:tcPr>
+            <w:tcW w:type="dxa" w:w="3120"/>
+          </w:tcPr>
+          <w:p>
+            <w:r>
+              <w:t>E19</w:t>
+            </w:r>
+          </w:p>
+        </w:tc>
+        <w:tc>
+          <w:tcPr>
+            <w:tcW w:type="dxa" w:w="3120"/>
+          </w:tcPr>
+          <w:p>
+            <w:r>
+              <w:t>Postman collection variables; password and saved-token variable row redacted</w:t>
+            </w:r>
+          </w:p>
+        </w:tc>
+        <w:tc>
+          <w:tcPr>
+            <w:tcW w:type="dxa" w:w="3120"/>
+          </w:tcPr>
+          <w:p>
+            <w:r>
+              <w:t>evidence/E19.png</w:t>
+            </w:r>
+          </w:p>
+        </w:tc>
+      </w:tr>
     </w:tbl>
     <w:p/>
     <w:p>
       <w:r>
-        <w:t>Not supplied/not claimed: persistent database hash inspection, expired-token Postman response, successful administrator-route response, or a student-authored personal reflection.</w:t>
+        <w:t>Not supplied/not claimed: persistent database hash inspection, expired-token Postman response, successful administrator-route response, or a student-authored personal reflection. The original E18/E19 attachments are excluded because they disclose credentials; only the redacted evidence copies are included.</w:t>
       </w:r>
     </w:p>
     <w:sectPr>

</xml_diff>

<commit_message>
Remove credential-related screenshot evidence
Co-authored-by: Copilot App <223556219+Copilot@users.noreply.github.com>
</commit_message>
<xml_diff>
--- a/submission/CBE204_Week6_Lab_Sheet_Completed_DRAFT.docx
+++ b/submission/CBE204_Week6_Lab_Sheet_Completed_DRAFT.docx
@@ -21225,7 +21225,7 @@
     </w:p>
     <w:p>
       <w:r>
-        <w:t>Evidence integrity: E02 redacts the full login bearer token; E18 redacts the JWT signing secret in both the terminal and .env editor; E19 redacts the Postman password value and the entire saved-token variable row. The original E18/E19 images contain credentials and are intentionally excluded from this submission. The local ignored secure-api/.env signing secret was rotated after the exposure; its new value was not printed or committed. Evidence copies are under submission/evidence/.</w:t>
+        <w:t>Evidence integrity: E02 is a copy of the successful-login screenshot with the entire bearer-token value covered by an opaque black rectangle. Other supplied screenshots containing credentials are excluded from this submission. The local ignored secure-api/.env signing secret was rotated after it was exposed; its new value was not printed or committed. Evidence copies are under submission/evidence/.</w:t>
       </w:r>
     </w:p>
     <w:p>
@@ -22961,7 +22961,7 @@
     </w:p>
     <w:p>
       <w:r>
-        <w:t>The committed collection groups authentication/CRUD and security checks. It includes registration, login, current user, protected access, task CRUD, invalid registration/password, missing authentication, modified/malformed token, student admin denial, second-student task denial, logout and revoked-token denial. It does not include an expired-token request although the lab’s suggested collection structure lists one. Exhibit E19 shows the collection variables with the default password value and saved-token row redacted.</w:t>
+        <w:t>The committed collection groups authentication/CRUD and security checks. It includes registration, login, current user, protected access, task CRUD, invalid registration/password, missing authentication, modified/malformed token, student admin denial, second-student task denial, logout and revoked-token denial. It does not include an expired-token request although the lab?s suggested collection structure lists one.</w:t>
       </w:r>
     </w:p>
     <w:p>
@@ -24594,7 +24594,7 @@
           </w:tcPr>
           <w:p>
             <w:r>
-              <w:t>JWT_SECRET from environment; vulnerable-api deliberately insecure and local-only. Redacted configuration screenshot E18; exposed local key was rotated and not committed.</w:t>
+              <w:t>JWT_SECRET from environment; vulnerable-api deliberately insecure and local-only. Exposed local key rotated and not committed.</w:t>
             </w:r>
           </w:p>
         </w:tc>
@@ -25510,75 +25510,11 @@
           </w:p>
         </w:tc>
       </w:tr>
-      <w:tr>
-        <w:tc>
-          <w:tcPr>
-            <w:tcW w:type="dxa" w:w="3120"/>
-          </w:tcPr>
-          <w:p>
-            <w:r>
-              <w:t>E18</w:t>
-            </w:r>
-          </w:p>
-        </w:tc>
-        <w:tc>
-          <w:tcPr>
-            <w:tcW w:type="dxa" w:w="3120"/>
-          </w:tcPr>
-          <w:p>
-            <w:r>
-              <w:t>JWT_SECRET configuration shown; terminal and .env values redacted</w:t>
-            </w:r>
-          </w:p>
-        </w:tc>
-        <w:tc>
-          <w:tcPr>
-            <w:tcW w:type="dxa" w:w="3120"/>
-          </w:tcPr>
-          <w:p>
-            <w:r>
-              <w:t>evidence/E18.png</w:t>
-            </w:r>
-          </w:p>
-        </w:tc>
-      </w:tr>
-      <w:tr>
-        <w:tc>
-          <w:tcPr>
-            <w:tcW w:type="dxa" w:w="3120"/>
-          </w:tcPr>
-          <w:p>
-            <w:r>
-              <w:t>E19</w:t>
-            </w:r>
-          </w:p>
-        </w:tc>
-        <w:tc>
-          <w:tcPr>
-            <w:tcW w:type="dxa" w:w="3120"/>
-          </w:tcPr>
-          <w:p>
-            <w:r>
-              <w:t>Postman collection variables; password and saved-token variable row redacted</w:t>
-            </w:r>
-          </w:p>
-        </w:tc>
-        <w:tc>
-          <w:tcPr>
-            <w:tcW w:type="dxa" w:w="3120"/>
-          </w:tcPr>
-          <w:p>
-            <w:r>
-              <w:t>evidence/E19.png</w:t>
-            </w:r>
-          </w:p>
-        </w:tc>
-      </w:tr>
     </w:tbl>
     <w:p/>
     <w:p>
       <w:r>
-        <w:t>Not supplied/not claimed: persistent database hash inspection, expired-token Postman response, successful administrator-route response, or a student-authored personal reflection. The original E18/E19 attachments are excluded because they disclose credentials; only the redacted evidence copies are included.</w:t>
+        <w:t>Not supplied/not claimed: persistent database hash inspection, expired-token Postman response, successful administrator-route response, or a student-authored personal reflection. Supplied screenshots that disclose credentials are excluded; only safe evidence copies are included.</w:t>
       </w:r>
     </w:p>
     <w:sectPr>

</xml_diff>

<commit_message>
Complete Week 6 lab answers and evidence gaps
Co-authored-by: Copilot App <223556219+Copilot@users.noreply.github.com>
</commit_message>
<xml_diff>
--- a/submission/CBE204_Week6_Lab_Sheet_Completed_DRAFT.docx
+++ b/submission/CBE204_Week6_Lab_Sheet_Completed_DRAFT.docx
@@ -7375,6 +7375,34 @@
         <w:pict w14:anchorId="61EE38DD">
           <v:rect id="_x0000_i1043" style="width:0;height:1.5pt" o:hralign="center" o:hrstd="t" o:hr="t" fillcolor="#a0a0a0" stroked="f"/>
         </w:pict>
+      </w:r>
+    </w:p>
+    <w:p>
+      <w:pPr>
+        <w:pStyle w:val="Heading3"/>
+      </w:pPr>
+      <w:r>
+        <w:t>Task D2 - Is a JWT payload secret?</w:t>
+      </w:r>
+    </w:p>
+    <w:p>
+      <w:pPr/>
+      <w:r>
+        <w:t>No. A normal signed JWT payload is Base64URL-encoded, not encrypted. Anyone who obtains the token can decode its payload; the signature helps detect changes but does not make claims confidential. Do not put passwords, signing secrets or other confidential data in the payload.</w:t>
+      </w:r>
+    </w:p>
+    <w:p>
+      <w:pPr>
+        <w:pStyle w:val="Heading3"/>
+      </w:pPr>
+      <w:r>
+        <w:t>Task D4 - JWT authentication middleware</w:t>
+      </w:r>
+    </w:p>
+    <w:p>
+      <w:pPr/>
+      <w:r>
+        <w:t>For protected routes, the client sends Authorization: Bearer &lt;token&gt;. Middleware rejects a missing header with 401, verifies the token against the fixed HS256 allow-list and expected issuer (with expiry checked by the JWT library), checks subject/jti/expiry claims and the process-local revocation map, then looks up the current user from the subject. It builds req.user from the current user record rather than trusting a token role, and continues to server-side authorization. Invalid, expired, revoked or malformed credentials receive 401. A valid authenticated request to the protected endpoint is shown as 200 in E04.</w:t>
       </w:r>
     </w:p>
     <w:p>
@@ -12952,11 +12980,14 @@
     <w:tbl>
       <w:tblPr>
         <w:tblW w:w="5000" w:type="pct"/>
+        <w:jc w:val="center"/>
         <w:tblBorders>
-          <w:top w:val="single" w:sz="6" w:space="0" w:color="auto"/>
-          <w:left w:val="single" w:sz="6" w:space="0" w:color="auto"/>
-          <w:bottom w:val="single" w:sz="6" w:space="0" w:color="auto"/>
-          <w:right w:val="single" w:sz="6" w:space="0" w:color="auto"/>
+          <w:top w:val="single" w:sz="4" w:space="0" w:color="A6A6A6"/>
+          <w:left w:val="single" w:sz="4" w:space="0" w:color="A6A6A6"/>
+          <w:bottom w:val="single" w:sz="4" w:space="0" w:color="A6A6A6"/>
+          <w:right w:val="single" w:sz="4" w:space="0" w:color="A6A6A6"/>
+          <w:insideH w:val="single" w:sz="4" w:color="A6A6A6"/>
+          <w:insideV w:val="single" w:sz="4" w:color="A6A6A6"/>
         </w:tblBorders>
         <w:tblCellMar>
           <w:top w:w="160" w:type="dxa"/>
@@ -12998,27 +13029,14 @@
           </w:tcPr>
           <w:p>
             <w:pPr>
-              <w:spacing w:before="100" w:beforeAutospacing="1" w:after="100" w:afterAutospacing="1"/>
-              <w:jc w:val="center"/>
+              <w:spacing w:after="20"/>
+            </w:pPr>
+            <w:r>
               <w:rPr>
-                <w:rFonts w:ascii="Times New Roman" w:eastAsia="Times New Roman" w:hAnsi="Times New Roman" w:cs="Times New Roman"/>
+                <w:rFonts w:ascii="Arial" w:hAnsi="Arial"/>
                 <w:b/>
-                <w:bCs/>
-                <w:kern w:val="0"/>
-                <w:szCs w:val="24"/>
-                <w14:ligatures w14:val="none"/>
+                <w:sz w:val="14"/>
               </w:rPr>
-            </w:pPr>
-            <w:r>
-              <w:rPr>
-                <w:rFonts w:ascii="Times New Roman" w:eastAsia="Times New Roman" w:hAnsi="Times New Roman" w:cs="Times New Roman"/>
-                <w:b/>
-                <w:bCs/>
-                <w:kern w:val="0"/>
-                <w:szCs w:val="24"/>
-                <w14:ligatures w14:val="none"/>
-              </w:rPr>
-              <w:lastRenderedPageBreak/>
               <w:t>#</w:t>
             </w:r>
           </w:p>
@@ -13044,25 +13062,13 @@
           </w:tcPr>
           <w:p>
             <w:pPr>
-              <w:spacing w:before="100" w:beforeAutospacing="1" w:after="100" w:afterAutospacing="1"/>
-              <w:jc w:val="center"/>
+              <w:spacing w:after="20"/>
+            </w:pPr>
+            <w:r>
               <w:rPr>
-                <w:rFonts w:ascii="Times New Roman" w:eastAsia="Times New Roman" w:hAnsi="Times New Roman" w:cs="Times New Roman"/>
+                <w:rFonts w:ascii="Arial" w:hAnsi="Arial"/>
                 <w:b/>
-                <w:bCs/>
-                <w:kern w:val="0"/>
-                <w:szCs w:val="24"/>
-                <w14:ligatures w14:val="none"/>
-              </w:rPr>
-            </w:pPr>
-            <w:r>
-              <w:rPr>
-                <w:rFonts w:ascii="Times New Roman" w:eastAsia="Times New Roman" w:hAnsi="Times New Roman" w:cs="Times New Roman"/>
-                <w:b/>
-                <w:bCs/>
-                <w:kern w:val="0"/>
-                <w:szCs w:val="24"/>
-                <w14:ligatures w14:val="none"/>
+                <w:sz w:val="14"/>
               </w:rPr>
               <w:t>Security Test</w:t>
             </w:r>
@@ -13089,25 +13095,13 @@
           </w:tcPr>
           <w:p>
             <w:pPr>
-              <w:spacing w:before="100" w:beforeAutospacing="1" w:after="100" w:afterAutospacing="1"/>
-              <w:jc w:val="center"/>
+              <w:spacing w:after="20"/>
+            </w:pPr>
+            <w:r>
               <w:rPr>
-                <w:rFonts w:ascii="Times New Roman" w:eastAsia="Times New Roman" w:hAnsi="Times New Roman" w:cs="Times New Roman"/>
+                <w:rFonts w:ascii="Arial" w:hAnsi="Arial"/>
                 <w:b/>
-                <w:bCs/>
-                <w:kern w:val="0"/>
-                <w:szCs w:val="24"/>
-                <w14:ligatures w14:val="none"/>
-              </w:rPr>
-            </w:pPr>
-            <w:r>
-              <w:rPr>
-                <w:rFonts w:ascii="Times New Roman" w:eastAsia="Times New Roman" w:hAnsi="Times New Roman" w:cs="Times New Roman"/>
-                <w:b/>
-                <w:bCs/>
-                <w:kern w:val="0"/>
-                <w:szCs w:val="24"/>
-                <w14:ligatures w14:val="none"/>
+                <w:sz w:val="14"/>
               </w:rPr>
               <w:t>Expected</w:t>
             </w:r>
@@ -13134,25 +13128,13 @@
           </w:tcPr>
           <w:p>
             <w:pPr>
-              <w:spacing w:before="100" w:beforeAutospacing="1" w:after="100" w:afterAutospacing="1"/>
-              <w:jc w:val="center"/>
+              <w:spacing w:after="20"/>
+            </w:pPr>
+            <w:r>
               <w:rPr>
-                <w:rFonts w:ascii="Times New Roman" w:eastAsia="Times New Roman" w:hAnsi="Times New Roman" w:cs="Times New Roman"/>
+                <w:rFonts w:ascii="Arial" w:hAnsi="Arial"/>
                 <w:b/>
-                <w:bCs/>
-                <w:kern w:val="0"/>
-                <w:szCs w:val="24"/>
-                <w14:ligatures w14:val="none"/>
-              </w:rPr>
-            </w:pPr>
-            <w:r>
-              <w:rPr>
-                <w:rFonts w:ascii="Times New Roman" w:eastAsia="Times New Roman" w:hAnsi="Times New Roman" w:cs="Times New Roman"/>
-                <w:b/>
-                <w:bCs/>
-                <w:kern w:val="0"/>
-                <w:szCs w:val="24"/>
-                <w14:ligatures w14:val="none"/>
+                <w:sz w:val="14"/>
               </w:rPr>
               <w:t>Actual</w:t>
             </w:r>
@@ -13179,27 +13161,15 @@
           </w:tcPr>
           <w:p>
             <w:pPr>
-              <w:spacing w:before="100" w:beforeAutospacing="1" w:after="100" w:afterAutospacing="1"/>
-              <w:jc w:val="center"/>
+              <w:spacing w:after="20"/>
+            </w:pPr>
+            <w:r>
               <w:rPr>
-                <w:rFonts w:ascii="Times New Roman" w:eastAsia="Times New Roman" w:hAnsi="Times New Roman" w:cs="Times New Roman"/>
+                <w:rFonts w:ascii="Arial" w:hAnsi="Arial"/>
                 <w:b/>
-                <w:bCs/>
-                <w:kern w:val="0"/>
-                <w:szCs w:val="24"/>
-                <w14:ligatures w14:val="none"/>
+                <w:sz w:val="14"/>
               </w:rPr>
-            </w:pPr>
-            <w:r>
-              <w:rPr>
-                <w:rFonts w:ascii="Times New Roman" w:eastAsia="Times New Roman" w:hAnsi="Times New Roman" w:cs="Times New Roman"/>
-                <w:b/>
-                <w:bCs/>
-                <w:kern w:val="0"/>
-                <w:szCs w:val="24"/>
-                <w14:ligatures w14:val="none"/>
-              </w:rPr>
-              <w:t>Pass/Fail</w:t>
+              <w:t>Pass/Fail / Evidence</w:t>
             </w:r>
           </w:p>
         </w:tc>
@@ -13226,20 +13196,12 @@
           </w:tcPr>
           <w:p>
             <w:pPr>
-              <w:spacing w:before="100" w:beforeAutospacing="1" w:after="100" w:afterAutospacing="1"/>
+              <w:spacing w:after="20"/>
+            </w:pPr>
+            <w:r>
               <w:rPr>
-                <w:rFonts w:ascii="Times New Roman" w:eastAsia="Times New Roman" w:hAnsi="Times New Roman" w:cs="Times New Roman"/>
-                <w:kern w:val="0"/>
-                <w:szCs w:val="24"/>
-                <w14:ligatures w14:val="none"/>
-              </w:rPr>
-            </w:pPr>
-            <w:r>
-              <w:rPr>
-                <w:rFonts w:ascii="Times New Roman" w:eastAsia="Times New Roman" w:hAnsi="Times New Roman" w:cs="Times New Roman"/>
-                <w:kern w:val="0"/>
-                <w:szCs w:val="24"/>
-                <w14:ligatures w14:val="none"/>
+                <w:rFonts w:ascii="Arial" w:hAnsi="Arial"/>
+                <w:sz w:val="14"/>
               </w:rPr>
               <w:t>1</w:t>
             </w:r>
@@ -13266,20 +13228,12 @@
           </w:tcPr>
           <w:p>
             <w:pPr>
-              <w:spacing w:before="100" w:beforeAutospacing="1" w:after="100" w:afterAutospacing="1"/>
+              <w:spacing w:after="20"/>
+            </w:pPr>
+            <w:r>
               <w:rPr>
-                <w:rFonts w:ascii="Times New Roman" w:eastAsia="Times New Roman" w:hAnsi="Times New Roman" w:cs="Times New Roman"/>
-                <w:kern w:val="0"/>
-                <w:szCs w:val="24"/>
-                <w14:ligatures w14:val="none"/>
-              </w:rPr>
-            </w:pPr>
-            <w:r>
-              <w:rPr>
-                <w:rFonts w:ascii="Times New Roman" w:eastAsia="Times New Roman" w:hAnsi="Times New Roman" w:cs="Times New Roman"/>
-                <w:kern w:val="0"/>
-                <w:szCs w:val="24"/>
-                <w14:ligatures w14:val="none"/>
+                <w:rFonts w:ascii="Arial" w:hAnsi="Arial"/>
+                <w:sz w:val="14"/>
               </w:rPr>
               <w:t>Protected endpoint without login</w:t>
             </w:r>
@@ -13306,20 +13260,12 @@
           </w:tcPr>
           <w:p>
             <w:pPr>
-              <w:spacing w:before="100" w:beforeAutospacing="1" w:after="100" w:afterAutospacing="1"/>
+              <w:spacing w:after="20"/>
+            </w:pPr>
+            <w:r>
               <w:rPr>
-                <w:rFonts w:ascii="Times New Roman" w:eastAsia="Times New Roman" w:hAnsi="Times New Roman" w:cs="Times New Roman"/>
-                <w:kern w:val="0"/>
-                <w:szCs w:val="24"/>
-                <w14:ligatures w14:val="none"/>
-              </w:rPr>
-            </w:pPr>
-            <w:r>
-              <w:rPr>
-                <w:rFonts w:ascii="Times New Roman" w:eastAsia="Times New Roman" w:hAnsi="Times New Roman" w:cs="Times New Roman"/>
-                <w:kern w:val="0"/>
-                <w:szCs w:val="24"/>
-                <w14:ligatures w14:val="none"/>
+                <w:rFonts w:ascii="Arial" w:hAnsi="Arial"/>
+                <w:sz w:val="14"/>
               </w:rPr>
               <w:t>401</w:t>
             </w:r>
@@ -13346,13 +13292,15 @@
           </w:tcPr>
           <w:p>
             <w:pPr>
+              <w:spacing w:after="20"/>
+            </w:pPr>
+            <w:r>
               <w:rPr>
-                <w:rFonts w:ascii="Times New Roman" w:eastAsia="Times New Roman" w:hAnsi="Times New Roman" w:cs="Times New Roman"/>
-                <w:kern w:val="0"/>
-                <w:szCs w:val="24"/>
-                <w14:ligatures w14:val="none"/>
+                <w:rFonts w:ascii="Arial" w:hAnsi="Arial"/>
+                <w:sz w:val="14"/>
               </w:rPr>
-            </w:pPr>
+              <w:t>401 Unauthorized (E09)</w:t>
+            </w:r>
           </w:p>
         </w:tc>
         <w:tc>
@@ -13376,14 +13324,15 @@
           </w:tcPr>
           <w:p>
             <w:pPr>
+              <w:spacing w:after="20"/>
+            </w:pPr>
+            <w:r>
               <w:rPr>
-                <w:rFonts w:ascii="Times New Roman" w:eastAsia="Times New Roman" w:hAnsi="Times New Roman" w:cs="Times New Roman"/>
-                <w:kern w:val="0"/>
-                <w:sz w:val="20"/>
-                <w:szCs w:val="20"/>
-                <w14:ligatures w14:val="none"/>
+                <w:rFonts w:ascii="Arial" w:hAnsi="Arial"/>
+                <w:sz w:val="14"/>
               </w:rPr>
-            </w:pPr>
+              <w:t>PASS - screenshot</w:t>
+            </w:r>
           </w:p>
         </w:tc>
       </w:tr>
@@ -13409,20 +13358,12 @@
           </w:tcPr>
           <w:p>
             <w:pPr>
-              <w:spacing w:before="100" w:beforeAutospacing="1" w:after="100" w:afterAutospacing="1"/>
+              <w:spacing w:after="20"/>
+            </w:pPr>
+            <w:r>
               <w:rPr>
-                <w:rFonts w:ascii="Times New Roman" w:eastAsia="Times New Roman" w:hAnsi="Times New Roman" w:cs="Times New Roman"/>
-                <w:kern w:val="0"/>
-                <w:szCs w:val="24"/>
-                <w14:ligatures w14:val="none"/>
-              </w:rPr>
-            </w:pPr>
-            <w:r>
-              <w:rPr>
-                <w:rFonts w:ascii="Times New Roman" w:eastAsia="Times New Roman" w:hAnsi="Times New Roman" w:cs="Times New Roman"/>
-                <w:kern w:val="0"/>
-                <w:szCs w:val="24"/>
-                <w14:ligatures w14:val="none"/>
+                <w:rFonts w:ascii="Arial" w:hAnsi="Arial"/>
+                <w:sz w:val="14"/>
               </w:rPr>
               <w:t>2</w:t>
             </w:r>
@@ -13449,20 +13390,12 @@
           </w:tcPr>
           <w:p>
             <w:pPr>
-              <w:spacing w:before="100" w:beforeAutospacing="1" w:after="100" w:afterAutospacing="1"/>
+              <w:spacing w:after="20"/>
+            </w:pPr>
+            <w:r>
               <w:rPr>
-                <w:rFonts w:ascii="Times New Roman" w:eastAsia="Times New Roman" w:hAnsi="Times New Roman" w:cs="Times New Roman"/>
-                <w:kern w:val="0"/>
-                <w:szCs w:val="24"/>
-                <w14:ligatures w14:val="none"/>
-              </w:rPr>
-            </w:pPr>
-            <w:r>
-              <w:rPr>
-                <w:rFonts w:ascii="Times New Roman" w:eastAsia="Times New Roman" w:hAnsi="Times New Roman" w:cs="Times New Roman"/>
-                <w:kern w:val="0"/>
-                <w:szCs w:val="24"/>
-                <w14:ligatures w14:val="none"/>
+                <w:rFonts w:ascii="Arial" w:hAnsi="Arial"/>
+                <w:sz w:val="14"/>
               </w:rPr>
               <w:t>Incorrect password</w:t>
             </w:r>
@@ -13489,22 +13422,14 @@
           </w:tcPr>
           <w:p>
             <w:pPr>
-              <w:spacing w:before="100" w:beforeAutospacing="1" w:after="100" w:afterAutospacing="1"/>
+              <w:spacing w:after="20"/>
+            </w:pPr>
+            <w:r>
               <w:rPr>
-                <w:rFonts w:ascii="Times New Roman" w:eastAsia="Times New Roman" w:hAnsi="Times New Roman" w:cs="Times New Roman"/>
-                <w:kern w:val="0"/>
-                <w:szCs w:val="24"/>
-                <w14:ligatures w14:val="none"/>
+                <w:rFonts w:ascii="Arial" w:hAnsi="Arial"/>
+                <w:sz w:val="14"/>
               </w:rPr>
-            </w:pPr>
-            <w:r>
-              <w:rPr>
-                <w:rFonts w:ascii="Times New Roman" w:eastAsia="Times New Roman" w:hAnsi="Times New Roman" w:cs="Times New Roman"/>
-                <w:kern w:val="0"/>
-                <w:szCs w:val="24"/>
-                <w14:ligatures w14:val="none"/>
-              </w:rPr>
-              <w:t>Authentication failure</w:t>
+              <w:t>Authentication failure / 401</w:t>
             </w:r>
           </w:p>
         </w:tc>
@@ -13529,13 +13454,15 @@
           </w:tcPr>
           <w:p>
             <w:pPr>
+              <w:spacing w:after="20"/>
+            </w:pPr>
+            <w:r>
               <w:rPr>
-                <w:rFonts w:ascii="Times New Roman" w:eastAsia="Times New Roman" w:hAnsi="Times New Roman" w:cs="Times New Roman"/>
-                <w:kern w:val="0"/>
-                <w:szCs w:val="24"/>
-                <w14:ligatures w14:val="none"/>
+                <w:rFonts w:ascii="Arial" w:hAnsi="Arial"/>
+                <w:sz w:val="14"/>
               </w:rPr>
-            </w:pPr>
+              <w:t>401 Invalid credentials (E11)</w:t>
+            </w:r>
           </w:p>
         </w:tc>
         <w:tc>
@@ -13559,14 +13486,15 @@
           </w:tcPr>
           <w:p>
             <w:pPr>
+              <w:spacing w:after="20"/>
+            </w:pPr>
+            <w:r>
               <w:rPr>
-                <w:rFonts w:ascii="Times New Roman" w:eastAsia="Times New Roman" w:hAnsi="Times New Roman" w:cs="Times New Roman"/>
-                <w:kern w:val="0"/>
-                <w:sz w:val="20"/>
-                <w:szCs w:val="20"/>
-                <w14:ligatures w14:val="none"/>
+                <w:rFonts w:ascii="Arial" w:hAnsi="Arial"/>
+                <w:sz w:val="14"/>
               </w:rPr>
-            </w:pPr>
+              <w:t>PASS - screenshot</w:t>
+            </w:r>
           </w:p>
         </w:tc>
       </w:tr>
@@ -13592,20 +13520,12 @@
           </w:tcPr>
           <w:p>
             <w:pPr>
-              <w:spacing w:before="100" w:beforeAutospacing="1" w:after="100" w:afterAutospacing="1"/>
+              <w:spacing w:after="20"/>
+            </w:pPr>
+            <w:r>
               <w:rPr>
-                <w:rFonts w:ascii="Times New Roman" w:eastAsia="Times New Roman" w:hAnsi="Times New Roman" w:cs="Times New Roman"/>
-                <w:kern w:val="0"/>
-                <w:szCs w:val="24"/>
-                <w14:ligatures w14:val="none"/>
-              </w:rPr>
-            </w:pPr>
-            <w:r>
-              <w:rPr>
-                <w:rFonts w:ascii="Times New Roman" w:eastAsia="Times New Roman" w:hAnsi="Times New Roman" w:cs="Times New Roman"/>
-                <w:kern w:val="0"/>
-                <w:szCs w:val="24"/>
-                <w14:ligatures w14:val="none"/>
+                <w:rFonts w:ascii="Arial" w:hAnsi="Arial"/>
+                <w:sz w:val="14"/>
               </w:rPr>
               <w:t>3</w:t>
             </w:r>
@@ -13632,20 +13552,12 @@
           </w:tcPr>
           <w:p>
             <w:pPr>
-              <w:spacing w:before="100" w:beforeAutospacing="1" w:after="100" w:afterAutospacing="1"/>
+              <w:spacing w:after="20"/>
+            </w:pPr>
+            <w:r>
               <w:rPr>
-                <w:rFonts w:ascii="Times New Roman" w:eastAsia="Times New Roman" w:hAnsi="Times New Roman" w:cs="Times New Roman"/>
-                <w:kern w:val="0"/>
-                <w:szCs w:val="24"/>
-                <w14:ligatures w14:val="none"/>
-              </w:rPr>
-            </w:pPr>
-            <w:r>
-              <w:rPr>
-                <w:rFonts w:ascii="Times New Roman" w:eastAsia="Times New Roman" w:hAnsi="Times New Roman" w:cs="Times New Roman"/>
-                <w:kern w:val="0"/>
-                <w:szCs w:val="24"/>
-                <w14:ligatures w14:val="none"/>
+                <w:rFonts w:ascii="Arial" w:hAnsi="Arial"/>
+                <w:sz w:val="14"/>
               </w:rPr>
               <w:t>Valid login</w:t>
             </w:r>
@@ -13672,22 +13584,14 @@
           </w:tcPr>
           <w:p>
             <w:pPr>
-              <w:spacing w:before="100" w:beforeAutospacing="1" w:after="100" w:afterAutospacing="1"/>
+              <w:spacing w:after="20"/>
+            </w:pPr>
+            <w:r>
               <w:rPr>
-                <w:rFonts w:ascii="Times New Roman" w:eastAsia="Times New Roman" w:hAnsi="Times New Roman" w:cs="Times New Roman"/>
-                <w:kern w:val="0"/>
-                <w:szCs w:val="24"/>
-                <w14:ligatures w14:val="none"/>
+                <w:rFonts w:ascii="Arial" w:hAnsi="Arial"/>
+                <w:sz w:val="14"/>
               </w:rPr>
-            </w:pPr>
-            <w:r>
-              <w:rPr>
-                <w:rFonts w:ascii="Times New Roman" w:eastAsia="Times New Roman" w:hAnsi="Times New Roman" w:cs="Times New Roman"/>
-                <w:kern w:val="0"/>
-                <w:szCs w:val="24"/>
-                <w14:ligatures w14:val="none"/>
-              </w:rPr>
-              <w:t>Success</w:t>
+              <w:t>Success / 200</w:t>
             </w:r>
           </w:p>
         </w:tc>
@@ -13712,13 +13616,15 @@
           </w:tcPr>
           <w:p>
             <w:pPr>
+              <w:spacing w:after="20"/>
+            </w:pPr>
+            <w:r>
               <w:rPr>
-                <w:rFonts w:ascii="Times New Roman" w:eastAsia="Times New Roman" w:hAnsi="Times New Roman" w:cs="Times New Roman"/>
-                <w:kern w:val="0"/>
-                <w:szCs w:val="24"/>
-                <w14:ligatures w14:val="none"/>
+                <w:rFonts w:ascii="Arial" w:hAnsi="Arial"/>
+                <w:sz w:val="14"/>
               </w:rPr>
-            </w:pPr>
+              <w:t>200 OK (E02; token redacted)</w:t>
+            </w:r>
           </w:p>
         </w:tc>
         <w:tc>
@@ -13742,14 +13648,15 @@
           </w:tcPr>
           <w:p>
             <w:pPr>
+              <w:spacing w:after="20"/>
+            </w:pPr>
+            <w:r>
               <w:rPr>
-                <w:rFonts w:ascii="Times New Roman" w:eastAsia="Times New Roman" w:hAnsi="Times New Roman" w:cs="Times New Roman"/>
-                <w:kern w:val="0"/>
-                <w:sz w:val="20"/>
-                <w:szCs w:val="20"/>
-                <w14:ligatures w14:val="none"/>
+                <w:rFonts w:ascii="Arial" w:hAnsi="Arial"/>
+                <w:sz w:val="14"/>
               </w:rPr>
-            </w:pPr>
+              <w:t>PASS - screenshot</w:t>
+            </w:r>
           </w:p>
         </w:tc>
       </w:tr>
@@ -13775,20 +13682,12 @@
           </w:tcPr>
           <w:p>
             <w:pPr>
-              <w:spacing w:before="100" w:beforeAutospacing="1" w:after="100" w:afterAutospacing="1"/>
+              <w:spacing w:after="20"/>
+            </w:pPr>
+            <w:r>
               <w:rPr>
-                <w:rFonts w:ascii="Times New Roman" w:eastAsia="Times New Roman" w:hAnsi="Times New Roman" w:cs="Times New Roman"/>
-                <w:kern w:val="0"/>
-                <w:szCs w:val="24"/>
-                <w14:ligatures w14:val="none"/>
-              </w:rPr>
-            </w:pPr>
-            <w:r>
-              <w:rPr>
-                <w:rFonts w:ascii="Times New Roman" w:eastAsia="Times New Roman" w:hAnsi="Times New Roman" w:cs="Times New Roman"/>
-                <w:kern w:val="0"/>
-                <w:szCs w:val="24"/>
-                <w14:ligatures w14:val="none"/>
+                <w:rFonts w:ascii="Arial" w:hAnsi="Arial"/>
+                <w:sz w:val="14"/>
               </w:rPr>
               <w:t>4</w:t>
             </w:r>
@@ -13815,20 +13714,12 @@
           </w:tcPr>
           <w:p>
             <w:pPr>
-              <w:spacing w:before="100" w:beforeAutospacing="1" w:after="100" w:afterAutospacing="1"/>
+              <w:spacing w:after="20"/>
+            </w:pPr>
+            <w:r>
               <w:rPr>
-                <w:rFonts w:ascii="Times New Roman" w:eastAsia="Times New Roman" w:hAnsi="Times New Roman" w:cs="Times New Roman"/>
-                <w:kern w:val="0"/>
-                <w:szCs w:val="24"/>
-                <w14:ligatures w14:val="none"/>
-              </w:rPr>
-            </w:pPr>
-            <w:r>
-              <w:rPr>
-                <w:rFonts w:ascii="Times New Roman" w:eastAsia="Times New Roman" w:hAnsi="Times New Roman" w:cs="Times New Roman"/>
-                <w:kern w:val="0"/>
-                <w:szCs w:val="24"/>
-                <w14:ligatures w14:val="none"/>
+                <w:rFonts w:ascii="Arial" w:hAnsi="Arial"/>
+                <w:sz w:val="14"/>
               </w:rPr>
               <w:t>Valid authenticated request</w:t>
             </w:r>
@@ -13855,20 +13746,12 @@
           </w:tcPr>
           <w:p>
             <w:pPr>
-              <w:spacing w:before="100" w:beforeAutospacing="1" w:after="100" w:afterAutospacing="1"/>
+              <w:spacing w:after="20"/>
+            </w:pPr>
+            <w:r>
               <w:rPr>
-                <w:rFonts w:ascii="Times New Roman" w:eastAsia="Times New Roman" w:hAnsi="Times New Roman" w:cs="Times New Roman"/>
-                <w:kern w:val="0"/>
-                <w:szCs w:val="24"/>
-                <w14:ligatures w14:val="none"/>
-              </w:rPr>
-            </w:pPr>
-            <w:r>
-              <w:rPr>
-                <w:rFonts w:ascii="Times New Roman" w:eastAsia="Times New Roman" w:hAnsi="Times New Roman" w:cs="Times New Roman"/>
-                <w:kern w:val="0"/>
-                <w:szCs w:val="24"/>
-                <w14:ligatures w14:val="none"/>
+                <w:rFonts w:ascii="Arial" w:hAnsi="Arial"/>
+                <w:sz w:val="14"/>
               </w:rPr>
               <w:t>200</w:t>
             </w:r>
@@ -13895,13 +13778,15 @@
           </w:tcPr>
           <w:p>
             <w:pPr>
+              <w:spacing w:after="20"/>
+            </w:pPr>
+            <w:r>
               <w:rPr>
-                <w:rFonts w:ascii="Times New Roman" w:eastAsia="Times New Roman" w:hAnsi="Times New Roman" w:cs="Times New Roman"/>
-                <w:kern w:val="0"/>
-                <w:szCs w:val="24"/>
-                <w14:ligatures w14:val="none"/>
+                <w:rFonts w:ascii="Arial" w:hAnsi="Arial"/>
+                <w:sz w:val="14"/>
               </w:rPr>
-            </w:pPr>
+              <w:t>200 OK (E04)</w:t>
+            </w:r>
           </w:p>
         </w:tc>
         <w:tc>
@@ -13925,14 +13810,15 @@
           </w:tcPr>
           <w:p>
             <w:pPr>
+              <w:spacing w:after="20"/>
+            </w:pPr>
+            <w:r>
               <w:rPr>
-                <w:rFonts w:ascii="Times New Roman" w:eastAsia="Times New Roman" w:hAnsi="Times New Roman" w:cs="Times New Roman"/>
-                <w:kern w:val="0"/>
-                <w:sz w:val="20"/>
-                <w:szCs w:val="20"/>
-                <w14:ligatures w14:val="none"/>
+                <w:rFonts w:ascii="Arial" w:hAnsi="Arial"/>
+                <w:sz w:val="14"/>
               </w:rPr>
-            </w:pPr>
+              <w:t>PASS - screenshot</w:t>
+            </w:r>
           </w:p>
         </w:tc>
       </w:tr>
@@ -13958,20 +13844,12 @@
           </w:tcPr>
           <w:p>
             <w:pPr>
-              <w:spacing w:before="100" w:beforeAutospacing="1" w:after="100" w:afterAutospacing="1"/>
+              <w:spacing w:after="20"/>
+            </w:pPr>
+            <w:r>
               <w:rPr>
-                <w:rFonts w:ascii="Times New Roman" w:eastAsia="Times New Roman" w:hAnsi="Times New Roman" w:cs="Times New Roman"/>
-                <w:kern w:val="0"/>
-                <w:szCs w:val="24"/>
-                <w14:ligatures w14:val="none"/>
-              </w:rPr>
-            </w:pPr>
-            <w:r>
-              <w:rPr>
-                <w:rFonts w:ascii="Times New Roman" w:eastAsia="Times New Roman" w:hAnsi="Times New Roman" w:cs="Times New Roman"/>
-                <w:kern w:val="0"/>
-                <w:szCs w:val="24"/>
-                <w14:ligatures w14:val="none"/>
+                <w:rFonts w:ascii="Arial" w:hAnsi="Arial"/>
+                <w:sz w:val="14"/>
               </w:rPr>
               <w:t>5</w:t>
             </w:r>
@@ -13998,22 +13876,14 @@
           </w:tcPr>
           <w:p>
             <w:pPr>
-              <w:spacing w:before="100" w:beforeAutospacing="1" w:after="100" w:afterAutospacing="1"/>
+              <w:spacing w:after="20"/>
+            </w:pPr>
+            <w:r>
               <w:rPr>
-                <w:rFonts w:ascii="Times New Roman" w:eastAsia="Times New Roman" w:hAnsi="Times New Roman" w:cs="Times New Roman"/>
-                <w:kern w:val="0"/>
-                <w:szCs w:val="24"/>
-                <w14:ligatures w14:val="none"/>
+                <w:rFonts w:ascii="Arial" w:hAnsi="Arial"/>
+                <w:sz w:val="14"/>
               </w:rPr>
-            </w:pPr>
-            <w:r>
-              <w:rPr>
-                <w:rFonts w:ascii="Times New Roman" w:eastAsia="Times New Roman" w:hAnsi="Times New Roman" w:cs="Times New Roman"/>
-                <w:kern w:val="0"/>
-                <w:szCs w:val="24"/>
-                <w14:ligatures w14:val="none"/>
-              </w:rPr>
-              <w:t>Access another user’s resource</w:t>
+              <w:t>Access another user resource</w:t>
             </w:r>
           </w:p>
         </w:tc>
@@ -14038,20 +13908,12 @@
           </w:tcPr>
           <w:p>
             <w:pPr>
-              <w:spacing w:before="100" w:beforeAutospacing="1" w:after="100" w:afterAutospacing="1"/>
+              <w:spacing w:after="20"/>
+            </w:pPr>
+            <w:r>
               <w:rPr>
-                <w:rFonts w:ascii="Times New Roman" w:eastAsia="Times New Roman" w:hAnsi="Times New Roman" w:cs="Times New Roman"/>
-                <w:kern w:val="0"/>
-                <w:szCs w:val="24"/>
-                <w14:ligatures w14:val="none"/>
-              </w:rPr>
-            </w:pPr>
-            <w:r>
-              <w:rPr>
-                <w:rFonts w:ascii="Times New Roman" w:eastAsia="Times New Roman" w:hAnsi="Times New Roman" w:cs="Times New Roman"/>
-                <w:kern w:val="0"/>
-                <w:szCs w:val="24"/>
-                <w14:ligatures w14:val="none"/>
+                <w:rFonts w:ascii="Arial" w:hAnsi="Arial"/>
+                <w:sz w:val="14"/>
               </w:rPr>
               <w:t>Denied where appropriate</w:t>
             </w:r>
@@ -14078,13 +13940,15 @@
           </w:tcPr>
           <w:p>
             <w:pPr>
+              <w:spacing w:after="20"/>
+            </w:pPr>
+            <w:r>
               <w:rPr>
-                <w:rFonts w:ascii="Times New Roman" w:eastAsia="Times New Roman" w:hAnsi="Times New Roman" w:cs="Times New Roman"/>
-                <w:kern w:val="0"/>
-                <w:szCs w:val="24"/>
-                <w14:ligatures w14:val="none"/>
+                <w:rFonts w:ascii="Arial" w:hAnsi="Arial"/>
+                <w:sz w:val="14"/>
               </w:rPr>
-            </w:pPr>
+              <w:t>404 for another student task (E15)</w:t>
+            </w:r>
           </w:p>
         </w:tc>
         <w:tc>
@@ -14108,14 +13972,15 @@
           </w:tcPr>
           <w:p>
             <w:pPr>
+              <w:spacing w:after="20"/>
+            </w:pPr>
+            <w:r>
               <w:rPr>
-                <w:rFonts w:ascii="Times New Roman" w:eastAsia="Times New Roman" w:hAnsi="Times New Roman" w:cs="Times New Roman"/>
-                <w:kern w:val="0"/>
-                <w:sz w:val="20"/>
-                <w:szCs w:val="20"/>
-                <w14:ligatures w14:val="none"/>
+                <w:rFonts w:ascii="Arial" w:hAnsi="Arial"/>
+                <w:sz w:val="14"/>
               </w:rPr>
-            </w:pPr>
+              <w:t>PASS - screenshot</w:t>
+            </w:r>
           </w:p>
         </w:tc>
       </w:tr>
@@ -14141,20 +14006,12 @@
           </w:tcPr>
           <w:p>
             <w:pPr>
-              <w:spacing w:before="100" w:beforeAutospacing="1" w:after="100" w:afterAutospacing="1"/>
+              <w:spacing w:after="20"/>
+            </w:pPr>
+            <w:r>
               <w:rPr>
-                <w:rFonts w:ascii="Times New Roman" w:eastAsia="Times New Roman" w:hAnsi="Times New Roman" w:cs="Times New Roman"/>
-                <w:kern w:val="0"/>
-                <w:szCs w:val="24"/>
-                <w14:ligatures w14:val="none"/>
-              </w:rPr>
-            </w:pPr>
-            <w:r>
-              <w:rPr>
-                <w:rFonts w:ascii="Times New Roman" w:eastAsia="Times New Roman" w:hAnsi="Times New Roman" w:cs="Times New Roman"/>
-                <w:kern w:val="0"/>
-                <w:szCs w:val="24"/>
-                <w14:ligatures w14:val="none"/>
+                <w:rFonts w:ascii="Arial" w:hAnsi="Arial"/>
+                <w:sz w:val="14"/>
               </w:rPr>
               <w:t>6</w:t>
             </w:r>
@@ -14181,20 +14038,12 @@
           </w:tcPr>
           <w:p>
             <w:pPr>
-              <w:spacing w:before="100" w:beforeAutospacing="1" w:after="100" w:afterAutospacing="1"/>
+              <w:spacing w:after="20"/>
+            </w:pPr>
+            <w:r>
               <w:rPr>
-                <w:rFonts w:ascii="Times New Roman" w:eastAsia="Times New Roman" w:hAnsi="Times New Roman" w:cs="Times New Roman"/>
-                <w:kern w:val="0"/>
-                <w:szCs w:val="24"/>
-                <w14:ligatures w14:val="none"/>
-              </w:rPr>
-            </w:pPr>
-            <w:r>
-              <w:rPr>
-                <w:rFonts w:ascii="Times New Roman" w:eastAsia="Times New Roman" w:hAnsi="Times New Roman" w:cs="Times New Roman"/>
-                <w:kern w:val="0"/>
-                <w:szCs w:val="24"/>
-                <w14:ligatures w14:val="none"/>
+                <w:rFonts w:ascii="Arial" w:hAnsi="Arial"/>
+                <w:sz w:val="14"/>
               </w:rPr>
               <w:t>Student performs admin operation</w:t>
             </w:r>
@@ -14221,22 +14070,14 @@
           </w:tcPr>
           <w:p>
             <w:pPr>
-              <w:spacing w:before="100" w:beforeAutospacing="1" w:after="100" w:afterAutospacing="1"/>
+              <w:spacing w:after="20"/>
+            </w:pPr>
+            <w:r>
               <w:rPr>
-                <w:rFonts w:ascii="Times New Roman" w:eastAsia="Times New Roman" w:hAnsi="Times New Roman" w:cs="Times New Roman"/>
-                <w:kern w:val="0"/>
-                <w:szCs w:val="24"/>
-                <w14:ligatures w14:val="none"/>
+                <w:rFonts w:ascii="Arial" w:hAnsi="Arial"/>
+                <w:sz w:val="14"/>
               </w:rPr>
-            </w:pPr>
-            <w:r>
-              <w:rPr>
-                <w:rFonts w:ascii="Times New Roman" w:eastAsia="Times New Roman" w:hAnsi="Times New Roman" w:cs="Times New Roman"/>
-                <w:kern w:val="0"/>
-                <w:szCs w:val="24"/>
-                <w14:ligatures w14:val="none"/>
-              </w:rPr>
-              <w:t>403/denied</w:t>
+              <w:t>403 / denied</w:t>
             </w:r>
           </w:p>
         </w:tc>
@@ -14261,13 +14102,15 @@
           </w:tcPr>
           <w:p>
             <w:pPr>
+              <w:spacing w:after="20"/>
+            </w:pPr>
+            <w:r>
               <w:rPr>
-                <w:rFonts w:ascii="Times New Roman" w:eastAsia="Times New Roman" w:hAnsi="Times New Roman" w:cs="Times New Roman"/>
-                <w:kern w:val="0"/>
-                <w:szCs w:val="24"/>
-                <w14:ligatures w14:val="none"/>
+                <w:rFonts w:ascii="Arial" w:hAnsi="Arial"/>
+                <w:sz w:val="14"/>
               </w:rPr>
-            </w:pPr>
+              <w:t>403 Forbidden (E14)</w:t>
+            </w:r>
           </w:p>
         </w:tc>
         <w:tc>
@@ -14291,14 +14134,15 @@
           </w:tcPr>
           <w:p>
             <w:pPr>
+              <w:spacing w:after="20"/>
+            </w:pPr>
+            <w:r>
               <w:rPr>
-                <w:rFonts w:ascii="Times New Roman" w:eastAsia="Times New Roman" w:hAnsi="Times New Roman" w:cs="Times New Roman"/>
-                <w:kern w:val="0"/>
-                <w:sz w:val="20"/>
-                <w:szCs w:val="20"/>
-                <w14:ligatures w14:val="none"/>
+                <w:rFonts w:ascii="Arial" w:hAnsi="Arial"/>
+                <w:sz w:val="14"/>
               </w:rPr>
-            </w:pPr>
+              <w:t>PASS - screenshot</w:t>
+            </w:r>
           </w:p>
         </w:tc>
       </w:tr>
@@ -14324,20 +14168,12 @@
           </w:tcPr>
           <w:p>
             <w:pPr>
-              <w:spacing w:before="100" w:beforeAutospacing="1" w:after="100" w:afterAutospacing="1"/>
+              <w:spacing w:after="20"/>
+            </w:pPr>
+            <w:r>
               <w:rPr>
-                <w:rFonts w:ascii="Times New Roman" w:eastAsia="Times New Roman" w:hAnsi="Times New Roman" w:cs="Times New Roman"/>
-                <w:kern w:val="0"/>
-                <w:szCs w:val="24"/>
-                <w14:ligatures w14:val="none"/>
-              </w:rPr>
-            </w:pPr>
-            <w:r>
-              <w:rPr>
-                <w:rFonts w:ascii="Times New Roman" w:eastAsia="Times New Roman" w:hAnsi="Times New Roman" w:cs="Times New Roman"/>
-                <w:kern w:val="0"/>
-                <w:szCs w:val="24"/>
-                <w14:ligatures w14:val="none"/>
+                <w:rFonts w:ascii="Arial" w:hAnsi="Arial"/>
+                <w:sz w:val="14"/>
               </w:rPr>
               <w:t>7</w:t>
             </w:r>
@@ -14364,20 +14200,12 @@
           </w:tcPr>
           <w:p>
             <w:pPr>
-              <w:spacing w:before="100" w:beforeAutospacing="1" w:after="100" w:afterAutospacing="1"/>
+              <w:spacing w:after="20"/>
+            </w:pPr>
+            <w:r>
               <w:rPr>
-                <w:rFonts w:ascii="Times New Roman" w:eastAsia="Times New Roman" w:hAnsi="Times New Roman" w:cs="Times New Roman"/>
-                <w:kern w:val="0"/>
-                <w:szCs w:val="24"/>
-                <w14:ligatures w14:val="none"/>
-              </w:rPr>
-            </w:pPr>
-            <w:r>
-              <w:rPr>
-                <w:rFonts w:ascii="Times New Roman" w:eastAsia="Times New Roman" w:hAnsi="Times New Roman" w:cs="Times New Roman"/>
-                <w:kern w:val="0"/>
-                <w:szCs w:val="24"/>
-                <w14:ligatures w14:val="none"/>
+                <w:rFonts w:ascii="Arial" w:hAnsi="Arial"/>
+                <w:sz w:val="14"/>
               </w:rPr>
               <w:t>Modified JWT</w:t>
             </w:r>
@@ -14404,20 +14232,12 @@
           </w:tcPr>
           <w:p>
             <w:pPr>
-              <w:spacing w:before="100" w:beforeAutospacing="1" w:after="100" w:afterAutospacing="1"/>
+              <w:spacing w:after="20"/>
+            </w:pPr>
+            <w:r>
               <w:rPr>
-                <w:rFonts w:ascii="Times New Roman" w:eastAsia="Times New Roman" w:hAnsi="Times New Roman" w:cs="Times New Roman"/>
-                <w:kern w:val="0"/>
-                <w:szCs w:val="24"/>
-                <w14:ligatures w14:val="none"/>
-              </w:rPr>
-            </w:pPr>
-            <w:r>
-              <w:rPr>
-                <w:rFonts w:ascii="Times New Roman" w:eastAsia="Times New Roman" w:hAnsi="Times New Roman" w:cs="Times New Roman"/>
-                <w:kern w:val="0"/>
-                <w:szCs w:val="24"/>
-                <w14:ligatures w14:val="none"/>
+                <w:rFonts w:ascii="Arial" w:hAnsi="Arial"/>
+                <w:sz w:val="14"/>
               </w:rPr>
               <w:t>401</w:t>
             </w:r>
@@ -14444,13 +14264,15 @@
           </w:tcPr>
           <w:p>
             <w:pPr>
+              <w:spacing w:after="20"/>
+            </w:pPr>
+            <w:r>
               <w:rPr>
-                <w:rFonts w:ascii="Times New Roman" w:eastAsia="Times New Roman" w:hAnsi="Times New Roman" w:cs="Times New Roman"/>
-                <w:kern w:val="0"/>
-                <w:szCs w:val="24"/>
-                <w14:ligatures w14:val="none"/>
+                <w:rFonts w:ascii="Arial" w:hAnsi="Arial"/>
+                <w:sz w:val="14"/>
               </w:rPr>
-            </w:pPr>
+              <w:t>401 Unauthorized (E12)</w:t>
+            </w:r>
           </w:p>
         </w:tc>
         <w:tc>
@@ -14474,14 +14296,15 @@
           </w:tcPr>
           <w:p>
             <w:pPr>
+              <w:spacing w:after="20"/>
+            </w:pPr>
+            <w:r>
               <w:rPr>
-                <w:rFonts w:ascii="Times New Roman" w:eastAsia="Times New Roman" w:hAnsi="Times New Roman" w:cs="Times New Roman"/>
-                <w:kern w:val="0"/>
-                <w:sz w:val="20"/>
-                <w:szCs w:val="20"/>
-                <w14:ligatures w14:val="none"/>
+                <w:rFonts w:ascii="Arial" w:hAnsi="Arial"/>
+                <w:sz w:val="14"/>
               </w:rPr>
-            </w:pPr>
+              <w:t>PASS - screenshot</w:t>
+            </w:r>
           </w:p>
         </w:tc>
       </w:tr>
@@ -14507,20 +14330,12 @@
           </w:tcPr>
           <w:p>
             <w:pPr>
-              <w:spacing w:before="100" w:beforeAutospacing="1" w:after="100" w:afterAutospacing="1"/>
+              <w:spacing w:after="20"/>
+            </w:pPr>
+            <w:r>
               <w:rPr>
-                <w:rFonts w:ascii="Times New Roman" w:eastAsia="Times New Roman" w:hAnsi="Times New Roman" w:cs="Times New Roman"/>
-                <w:kern w:val="0"/>
-                <w:szCs w:val="24"/>
-                <w14:ligatures w14:val="none"/>
-              </w:rPr>
-            </w:pPr>
-            <w:r>
-              <w:rPr>
-                <w:rFonts w:ascii="Times New Roman" w:eastAsia="Times New Roman" w:hAnsi="Times New Roman" w:cs="Times New Roman"/>
-                <w:kern w:val="0"/>
-                <w:szCs w:val="24"/>
-                <w14:ligatures w14:val="none"/>
+                <w:rFonts w:ascii="Arial" w:hAnsi="Arial"/>
+                <w:sz w:val="14"/>
               </w:rPr>
               <w:t>8</w:t>
             </w:r>
@@ -14547,20 +14362,12 @@
           </w:tcPr>
           <w:p>
             <w:pPr>
-              <w:spacing w:before="100" w:beforeAutospacing="1" w:after="100" w:afterAutospacing="1"/>
+              <w:spacing w:after="20"/>
+            </w:pPr>
+            <w:r>
               <w:rPr>
-                <w:rFonts w:ascii="Times New Roman" w:eastAsia="Times New Roman" w:hAnsi="Times New Roman" w:cs="Times New Roman"/>
-                <w:kern w:val="0"/>
-                <w:szCs w:val="24"/>
-                <w14:ligatures w14:val="none"/>
-              </w:rPr>
-            </w:pPr>
-            <w:r>
-              <w:rPr>
-                <w:rFonts w:ascii="Times New Roman" w:eastAsia="Times New Roman" w:hAnsi="Times New Roman" w:cs="Times New Roman"/>
-                <w:kern w:val="0"/>
-                <w:szCs w:val="24"/>
-                <w14:ligatures w14:val="none"/>
+                <w:rFonts w:ascii="Arial" w:hAnsi="Arial"/>
+                <w:sz w:val="14"/>
               </w:rPr>
               <w:t>Expired JWT</w:t>
             </w:r>
@@ -14587,20 +14394,12 @@
           </w:tcPr>
           <w:p>
             <w:pPr>
-              <w:spacing w:before="100" w:beforeAutospacing="1" w:after="100" w:afterAutospacing="1"/>
+              <w:spacing w:after="20"/>
+            </w:pPr>
+            <w:r>
               <w:rPr>
-                <w:rFonts w:ascii="Times New Roman" w:eastAsia="Times New Roman" w:hAnsi="Times New Roman" w:cs="Times New Roman"/>
-                <w:kern w:val="0"/>
-                <w:szCs w:val="24"/>
-                <w14:ligatures w14:val="none"/>
-              </w:rPr>
-            </w:pPr>
-            <w:r>
-              <w:rPr>
-                <w:rFonts w:ascii="Times New Roman" w:eastAsia="Times New Roman" w:hAnsi="Times New Roman" w:cs="Times New Roman"/>
-                <w:kern w:val="0"/>
-                <w:szCs w:val="24"/>
-                <w14:ligatures w14:val="none"/>
+                <w:rFonts w:ascii="Arial" w:hAnsi="Arial"/>
+                <w:sz w:val="14"/>
               </w:rPr>
               <w:t>401</w:t>
             </w:r>
@@ -14627,13 +14426,15 @@
           </w:tcPr>
           <w:p>
             <w:pPr>
+              <w:spacing w:after="20"/>
+            </w:pPr>
+            <w:r>
               <w:rPr>
-                <w:rFonts w:ascii="Times New Roman" w:eastAsia="Times New Roman" w:hAnsi="Times New Roman" w:cs="Times New Roman"/>
-                <w:kern w:val="0"/>
-                <w:szCs w:val="24"/>
-                <w14:ligatures w14:val="none"/>
+                <w:rFonts w:ascii="Arial" w:hAnsi="Arial"/>
+                <w:sz w:val="14"/>
               </w:rPr>
-            </w:pPr>
+              <w:t>No Postman expiry response supplied</w:t>
+            </w:r>
           </w:p>
         </w:tc>
         <w:tc>
@@ -14657,14 +14458,15 @@
           </w:tcPr>
           <w:p>
             <w:pPr>
+              <w:spacing w:after="20"/>
+            </w:pPr>
+            <w:r>
               <w:rPr>
-                <w:rFonts w:ascii="Times New Roman" w:eastAsia="Times New Roman" w:hAnsi="Times New Roman" w:cs="Times New Roman"/>
-                <w:kern w:val="0"/>
-                <w:sz w:val="20"/>
-                <w:szCs w:val="20"/>
-                <w14:ligatures w14:val="none"/>
+                <w:rFonts w:ascii="Arial" w:hAnsi="Arial"/>
+                <w:sz w:val="14"/>
               </w:rPr>
-            </w:pPr>
+              <w:t>NOT TESTED - no evidence</w:t>
+            </w:r>
           </w:p>
         </w:tc>
       </w:tr>
@@ -14690,20 +14492,12 @@
           </w:tcPr>
           <w:p>
             <w:pPr>
-              <w:spacing w:before="100" w:beforeAutospacing="1" w:after="100" w:afterAutospacing="1"/>
+              <w:spacing w:after="20"/>
+            </w:pPr>
+            <w:r>
               <w:rPr>
-                <w:rFonts w:ascii="Times New Roman" w:eastAsia="Times New Roman" w:hAnsi="Times New Roman" w:cs="Times New Roman"/>
-                <w:kern w:val="0"/>
-                <w:szCs w:val="24"/>
-                <w14:ligatures w14:val="none"/>
-              </w:rPr>
-            </w:pPr>
-            <w:r>
-              <w:rPr>
-                <w:rFonts w:ascii="Times New Roman" w:eastAsia="Times New Roman" w:hAnsi="Times New Roman" w:cs="Times New Roman"/>
-                <w:kern w:val="0"/>
-                <w:szCs w:val="24"/>
-                <w14:ligatures w14:val="none"/>
+                <w:rFonts w:ascii="Arial" w:hAnsi="Arial"/>
+                <w:sz w:val="14"/>
               </w:rPr>
               <w:t>9</w:t>
             </w:r>
@@ -14730,20 +14524,12 @@
           </w:tcPr>
           <w:p>
             <w:pPr>
-              <w:spacing w:before="100" w:beforeAutospacing="1" w:after="100" w:afterAutospacing="1"/>
+              <w:spacing w:after="20"/>
+            </w:pPr>
+            <w:r>
               <w:rPr>
-                <w:rFonts w:ascii="Times New Roman" w:eastAsia="Times New Roman" w:hAnsi="Times New Roman" w:cs="Times New Roman"/>
-                <w:kern w:val="0"/>
-                <w:szCs w:val="24"/>
-                <w14:ligatures w14:val="none"/>
-              </w:rPr>
-            </w:pPr>
-            <w:r>
-              <w:rPr>
-                <w:rFonts w:ascii="Times New Roman" w:eastAsia="Times New Roman" w:hAnsi="Times New Roman" w:cs="Times New Roman"/>
-                <w:kern w:val="0"/>
-                <w:szCs w:val="24"/>
-                <w14:ligatures w14:val="none"/>
+                <w:rFonts w:ascii="Arial" w:hAnsi="Arial"/>
+                <w:sz w:val="14"/>
               </w:rPr>
               <w:t>Logout then access protected resource</w:t>
             </w:r>
@@ -14770,22 +14556,14 @@
           </w:tcPr>
           <w:p>
             <w:pPr>
-              <w:spacing w:before="100" w:beforeAutospacing="1" w:after="100" w:afterAutospacing="1"/>
+              <w:spacing w:after="20"/>
+            </w:pPr>
+            <w:r>
               <w:rPr>
-                <w:rFonts w:ascii="Times New Roman" w:eastAsia="Times New Roman" w:hAnsi="Times New Roman" w:cs="Times New Roman"/>
-                <w:kern w:val="0"/>
-                <w:szCs w:val="24"/>
-                <w14:ligatures w14:val="none"/>
+                <w:rFonts w:ascii="Arial" w:hAnsi="Arial"/>
+                <w:sz w:val="14"/>
               </w:rPr>
-            </w:pPr>
-            <w:r>
-              <w:rPr>
-                <w:rFonts w:ascii="Times New Roman" w:eastAsia="Times New Roman" w:hAnsi="Times New Roman" w:cs="Times New Roman"/>
-                <w:kern w:val="0"/>
-                <w:szCs w:val="24"/>
-                <w14:ligatures w14:val="none"/>
-              </w:rPr>
-              <w:t>401</w:t>
+              <w:t>401 after logout</w:t>
             </w:r>
           </w:p>
         </w:tc>
@@ -14810,13 +14588,15 @@
           </w:tcPr>
           <w:p>
             <w:pPr>
+              <w:spacing w:after="20"/>
+            </w:pPr>
+            <w:r>
               <w:rPr>
-                <w:rFonts w:ascii="Times New Roman" w:eastAsia="Times New Roman" w:hAnsi="Times New Roman" w:cs="Times New Roman"/>
-                <w:kern w:val="0"/>
-                <w:szCs w:val="24"/>
-                <w14:ligatures w14:val="none"/>
+                <w:rFonts w:ascii="Arial" w:hAnsi="Arial"/>
+                <w:sz w:val="14"/>
               </w:rPr>
-            </w:pPr>
+              <w:t>Logout 200 then revoked-token 401 (E16,E17)</w:t>
+            </w:r>
           </w:p>
         </w:tc>
         <w:tc>
@@ -14840,14 +14620,15 @@
           </w:tcPr>
           <w:p>
             <w:pPr>
+              <w:spacing w:after="20"/>
+            </w:pPr>
+            <w:r>
               <w:rPr>
-                <w:rFonts w:ascii="Times New Roman" w:eastAsia="Times New Roman" w:hAnsi="Times New Roman" w:cs="Times New Roman"/>
-                <w:kern w:val="0"/>
-                <w:sz w:val="20"/>
-                <w:szCs w:val="20"/>
-                <w14:ligatures w14:val="none"/>
+                <w:rFonts w:ascii="Arial" w:hAnsi="Arial"/>
+                <w:sz w:val="14"/>
               </w:rPr>
-            </w:pPr>
+              <w:t>PASS - screenshots</w:t>
+            </w:r>
           </w:p>
         </w:tc>
       </w:tr>
@@ -14873,20 +14654,12 @@
           </w:tcPr>
           <w:p>
             <w:pPr>
-              <w:spacing w:before="100" w:beforeAutospacing="1" w:after="100" w:afterAutospacing="1"/>
+              <w:spacing w:after="20"/>
+            </w:pPr>
+            <w:r>
               <w:rPr>
-                <w:rFonts w:ascii="Times New Roman" w:eastAsia="Times New Roman" w:hAnsi="Times New Roman" w:cs="Times New Roman"/>
-                <w:kern w:val="0"/>
-                <w:szCs w:val="24"/>
-                <w14:ligatures w14:val="none"/>
-              </w:rPr>
-            </w:pPr>
-            <w:r>
-              <w:rPr>
-                <w:rFonts w:ascii="Times New Roman" w:eastAsia="Times New Roman" w:hAnsi="Times New Roman" w:cs="Times New Roman"/>
-                <w:kern w:val="0"/>
-                <w:szCs w:val="24"/>
-                <w14:ligatures w14:val="none"/>
+                <w:rFonts w:ascii="Arial" w:hAnsi="Arial"/>
+                <w:sz w:val="14"/>
               </w:rPr>
               <w:t>10</w:t>
             </w:r>
@@ -14913,20 +14686,12 @@
           </w:tcPr>
           <w:p>
             <w:pPr>
-              <w:spacing w:before="100" w:beforeAutospacing="1" w:after="100" w:afterAutospacing="1"/>
+              <w:spacing w:after="20"/>
+            </w:pPr>
+            <w:r>
               <w:rPr>
-                <w:rFonts w:ascii="Times New Roman" w:eastAsia="Times New Roman" w:hAnsi="Times New Roman" w:cs="Times New Roman"/>
-                <w:kern w:val="0"/>
-                <w:szCs w:val="24"/>
-                <w14:ligatures w14:val="none"/>
-              </w:rPr>
-            </w:pPr>
-            <w:r>
-              <w:rPr>
-                <w:rFonts w:ascii="Times New Roman" w:eastAsia="Times New Roman" w:hAnsi="Times New Roman" w:cs="Times New Roman"/>
-                <w:kern w:val="0"/>
-                <w:szCs w:val="24"/>
-                <w14:ligatures w14:val="none"/>
+                <w:rFonts w:ascii="Arial" w:hAnsi="Arial"/>
+                <w:sz w:val="14"/>
               </w:rPr>
               <w:t>Invalid input</w:t>
             </w:r>
@@ -14953,20 +14718,12 @@
           </w:tcPr>
           <w:p>
             <w:pPr>
-              <w:spacing w:before="100" w:beforeAutospacing="1" w:after="100" w:afterAutospacing="1"/>
+              <w:spacing w:after="20"/>
+            </w:pPr>
+            <w:r>
               <w:rPr>
-                <w:rFonts w:ascii="Times New Roman" w:eastAsia="Times New Roman" w:hAnsi="Times New Roman" w:cs="Times New Roman"/>
-                <w:kern w:val="0"/>
-                <w:szCs w:val="24"/>
-                <w14:ligatures w14:val="none"/>
-              </w:rPr>
-            </w:pPr>
-            <w:r>
-              <w:rPr>
-                <w:rFonts w:ascii="Times New Roman" w:eastAsia="Times New Roman" w:hAnsi="Times New Roman" w:cs="Times New Roman"/>
-                <w:kern w:val="0"/>
-                <w:szCs w:val="24"/>
-                <w14:ligatures w14:val="none"/>
+                <w:rFonts w:ascii="Arial" w:hAnsi="Arial"/>
+                <w:sz w:val="14"/>
               </w:rPr>
               <w:t>4xx</w:t>
             </w:r>
@@ -14993,13 +14750,15 @@
           </w:tcPr>
           <w:p>
             <w:pPr>
+              <w:spacing w:after="20"/>
+            </w:pPr>
+            <w:r>
               <w:rPr>
-                <w:rFonts w:ascii="Times New Roman" w:eastAsia="Times New Roman" w:hAnsi="Times New Roman" w:cs="Times New Roman"/>
-                <w:kern w:val="0"/>
-                <w:szCs w:val="24"/>
-                <w14:ligatures w14:val="none"/>
+                <w:rFonts w:ascii="Arial" w:hAnsi="Arial"/>
+                <w:sz w:val="14"/>
               </w:rPr>
-            </w:pPr>
+              <w:t>400 invalid registration (E10)</w:t>
+            </w:r>
           </w:p>
         </w:tc>
         <w:tc>
@@ -15023,14 +14782,107 @@
           </w:tcPr>
           <w:p>
             <w:pPr>
+              <w:spacing w:after="20"/>
+            </w:pPr>
+            <w:r>
               <w:rPr>
-                <w:rFonts w:ascii="Times New Roman" w:eastAsia="Times New Roman" w:hAnsi="Times New Roman" w:cs="Times New Roman"/>
-                <w:kern w:val="0"/>
-                <w:sz w:val="20"/>
-                <w:szCs w:val="20"/>
-                <w14:ligatures w14:val="none"/>
+                <w:rFonts w:ascii="Arial" w:hAnsi="Arial"/>
+                <w:sz w:val="14"/>
               </w:rPr>
+              <w:t>PASS - screenshot</w:t>
+            </w:r>
+          </w:p>
+        </w:tc>
+      </w:tr>
+      <w:tr>
+        <w:tc>
+          <w:tcPr>
+            <w:tcW w:type="dxa" w:w="586"/>
+            <w:vAlign w:val="center"/>
+          </w:tcPr>
+          <w:p>
+            <w:pPr>
+              <w:spacing w:after="20"/>
             </w:pPr>
+            <w:r>
+              <w:rPr>
+                <w:rFonts w:ascii="Arial" w:hAnsi="Arial"/>
+                <w:sz w:val="14"/>
+              </w:rPr>
+              <w:t>11</w:t>
+            </w:r>
+          </w:p>
+        </w:tc>
+        <w:tc>
+          <w:tcPr>
+            <w:tcW w:type="dxa" w:w="3817"/>
+            <w:vAlign w:val="center"/>
+          </w:tcPr>
+          <w:p>
+            <w:pPr>
+              <w:spacing w:after="20"/>
+            </w:pPr>
+            <w:r>
+              <w:rPr>
+                <w:rFonts w:ascii="Arial" w:hAnsi="Arial"/>
+                <w:sz w:val="14"/>
+              </w:rPr>
+              <w:t>Administrator access with valid admin token</w:t>
+            </w:r>
+          </w:p>
+        </w:tc>
+        <w:tc>
+          <w:tcPr>
+            <w:tcW w:type="dxa" w:w="2711"/>
+            <w:vAlign w:val="center"/>
+          </w:tcPr>
+          <w:p>
+            <w:pPr>
+              <w:spacing w:after="20"/>
+            </w:pPr>
+            <w:r>
+              <w:rPr>
+                <w:rFonts w:ascii="Arial" w:hAnsi="Arial"/>
+                <w:sz w:val="14"/>
+              </w:rPr>
+              <w:t>200 OK for configured admin</w:t>
+            </w:r>
+          </w:p>
+        </w:tc>
+        <w:tc>
+          <w:tcPr>
+            <w:tcW w:type="dxa" w:w="1001"/>
+            <w:vAlign w:val="center"/>
+          </w:tcPr>
+          <w:p>
+            <w:pPr>
+              <w:spacing w:after="20"/>
+            </w:pPr>
+            <w:r>
+              <w:rPr>
+                <w:rFonts w:ascii="Arial" w:hAnsi="Arial"/>
+                <w:sz w:val="14"/>
+              </w:rPr>
+              <w:t>No successful admin response supplied. Reported admin-login 401 and unauthenticated-route 401 are not proof of admin authorization.</w:t>
+            </w:r>
+          </w:p>
+        </w:tc>
+        <w:tc>
+          <w:tcPr>
+            <w:tcW w:type="dxa" w:w="1229"/>
+            <w:vAlign w:val="center"/>
+          </w:tcPr>
+          <w:p>
+            <w:pPr>
+              <w:spacing w:after="20"/>
+            </w:pPr>
+            <w:r>
+              <w:rPr>
+                <w:rFonts w:ascii="Arial" w:hAnsi="Arial"/>
+                <w:sz w:val="14"/>
+              </w:rPr>
+              <w:t>NOT TESTED / NOT CAPTURED</w:t>
+            </w:r>
           </w:p>
         </w:tc>
       </w:tr>
@@ -15587,6 +15439,1221 @@
         </w:pict>
       </w:r>
     </w:p>
+    <w:tbl>
+      <w:tblPr>
+        <w:tblW w:type="auto" w:w="0"/>
+        <w:jc w:val="center"/>
+        <w:tblLook w:firstColumn="1" w:firstRow="1" w:lastColumn="0" w:lastRow="0" w:noHBand="0" w:noVBand="1" w:val="04A0"/>
+        <w:tblBorders>
+          <w:top w:val="single" w:sz="4" w:color="A6A6A6"/>
+          <w:left w:val="single" w:sz="4" w:color="A6A6A6"/>
+          <w:bottom w:val="single" w:sz="4" w:color="A6A6A6"/>
+          <w:right w:val="single" w:sz="4" w:color="A6A6A6"/>
+          <w:insideH w:val="single" w:sz="4" w:color="A6A6A6"/>
+          <w:insideV w:val="single" w:sz="4" w:color="A6A6A6"/>
+        </w:tblBorders>
+      </w:tblPr>
+      <w:tblGrid>
+        <w:gridCol w:w="2340"/>
+        <w:gridCol w:w="2340"/>
+        <w:gridCol w:w="2340"/>
+        <w:gridCol w:w="2340"/>
+      </w:tblGrid>
+      <w:tr>
+        <w:tc>
+          <w:tcPr>
+            <w:tcW w:type="dxa" w:w="2340"/>
+            <w:vAlign w:val="center"/>
+          </w:tcPr>
+          <w:p>
+            <w:pPr>
+              <w:spacing w:after="20"/>
+            </w:pPr>
+            <w:r>
+              <w:rPr>
+                <w:rFonts w:ascii="Arial" w:hAnsi="Arial"/>
+                <w:b/>
+                <w:sz w:val="14"/>
+              </w:rPr>
+              <w:t>Endpoint</w:t>
+            </w:r>
+          </w:p>
+        </w:tc>
+        <w:tc>
+          <w:tcPr>
+            <w:tcW w:type="dxa" w:w="2340"/>
+            <w:vAlign w:val="center"/>
+          </w:tcPr>
+          <w:p>
+            <w:pPr>
+              <w:spacing w:after="20"/>
+            </w:pPr>
+            <w:r>
+              <w:rPr>
+                <w:rFonts w:ascii="Arial" w:hAnsi="Arial"/>
+                <w:b/>
+                <w:sz w:val="14"/>
+              </w:rPr>
+              <w:t>J1: who may call?</w:t>
+            </w:r>
+          </w:p>
+        </w:tc>
+        <w:tc>
+          <w:tcPr>
+            <w:tcW w:type="dxa" w:w="2340"/>
+            <w:vAlign w:val="center"/>
+          </w:tcPr>
+          <w:p>
+            <w:pPr>
+              <w:spacing w:after="20"/>
+            </w:pPr>
+            <w:r>
+              <w:rPr>
+                <w:rFonts w:ascii="Arial" w:hAnsi="Arial"/>
+                <w:b/>
+                <w:sz w:val="14"/>
+              </w:rPr>
+              <w:t>J2: allowed operation / denial</w:t>
+            </w:r>
+          </w:p>
+        </w:tc>
+        <w:tc>
+          <w:tcPr>
+            <w:tcW w:type="dxa" w:w="2340"/>
+            <w:vAlign w:val="center"/>
+          </w:tcPr>
+          <w:p>
+            <w:pPr>
+              <w:spacing w:after="20"/>
+            </w:pPr>
+            <w:r>
+              <w:rPr>
+                <w:rFonts w:ascii="Arial" w:hAnsi="Arial"/>
+                <w:b/>
+                <w:sz w:val="14"/>
+              </w:rPr>
+              <w:t>Input, response sensitivity and evidence status</w:t>
+            </w:r>
+          </w:p>
+        </w:tc>
+      </w:tr>
+      <w:tr>
+        <w:tc>
+          <w:tcPr>
+            <w:tcW w:type="dxa" w:w="2340"/>
+            <w:vAlign w:val="center"/>
+          </w:tcPr>
+          <w:p>
+            <w:pPr>
+              <w:spacing w:after="20"/>
+            </w:pPr>
+            <w:r>
+              <w:rPr>
+                <w:rFonts w:ascii="Arial" w:hAnsi="Arial"/>
+                <w:sz w:val="14"/>
+              </w:rPr>
+              <w:t>GET /</w:t>
+            </w:r>
+          </w:p>
+        </w:tc>
+        <w:tc>
+          <w:tcPr>
+            <w:tcW w:type="dxa" w:w="2340"/>
+            <w:vAlign w:val="center"/>
+          </w:tcPr>
+          <w:p>
+            <w:pPr>
+              <w:spacing w:after="20"/>
+            </w:pPr>
+            <w:r>
+              <w:rPr>
+                <w:rFonts w:ascii="Arial" w:hAnsi="Arial"/>
+                <w:sz w:val="14"/>
+              </w:rPr>
+              <w:t>Anyone; API information.</w:t>
+            </w:r>
+          </w:p>
+        </w:tc>
+        <w:tc>
+          <w:tcPr>
+            <w:tcW w:type="dxa" w:w="2340"/>
+            <w:vAlign w:val="center"/>
+          </w:tcPr>
+          <w:p>
+            <w:pPr>
+              <w:spacing w:after="20"/>
+            </w:pPr>
+            <w:r>
+              <w:rPr>
+                <w:rFonts w:ascii="Arial" w:hAnsi="Arial"/>
+                <w:sz w:val="14"/>
+              </w:rPr>
+              <w:t>Public by design.</w:t>
+            </w:r>
+          </w:p>
+        </w:tc>
+        <w:tc>
+          <w:tcPr>
+            <w:tcW w:type="dxa" w:w="2340"/>
+            <w:vAlign w:val="center"/>
+          </w:tcPr>
+          <w:p>
+            <w:pPr>
+              <w:spacing w:after="20"/>
+            </w:pPr>
+            <w:r>
+              <w:rPr>
+                <w:rFonts w:ascii="Arial" w:hAnsi="Arial"/>
+                <w:sz w:val="14"/>
+              </w:rPr>
+              <w:t>No user data returned.</w:t>
+            </w:r>
+          </w:p>
+        </w:tc>
+      </w:tr>
+      <w:tr>
+        <w:tc>
+          <w:tcPr>
+            <w:tcW w:type="dxa" w:w="2340"/>
+            <w:vAlign w:val="center"/>
+          </w:tcPr>
+          <w:p>
+            <w:pPr>
+              <w:spacing w:after="20"/>
+            </w:pPr>
+            <w:r>
+              <w:rPr>
+                <w:rFonts w:ascii="Arial" w:hAnsi="Arial"/>
+                <w:sz w:val="14"/>
+              </w:rPr>
+              <w:t>POST /auth/register</w:t>
+            </w:r>
+          </w:p>
+        </w:tc>
+        <w:tc>
+          <w:tcPr>
+            <w:tcW w:type="dxa" w:w="2340"/>
+            <w:vAlign w:val="center"/>
+          </w:tcPr>
+          <w:p>
+            <w:pPr>
+              <w:spacing w:after="20"/>
+            </w:pPr>
+            <w:r>
+              <w:rPr>
+                <w:rFonts w:ascii="Arial" w:hAnsi="Arial"/>
+                <w:sz w:val="14"/>
+              </w:rPr>
+              <w:t>Public; creates student only.</w:t>
+            </w:r>
+          </w:p>
+        </w:tc>
+        <w:tc>
+          <w:tcPr>
+            <w:tcW w:type="dxa" w:w="2340"/>
+            <w:vAlign w:val="center"/>
+          </w:tcPr>
+          <w:p>
+            <w:pPr>
+              <w:spacing w:after="20"/>
+            </w:pPr>
+            <w:r>
+              <w:rPr>
+                <w:rFonts w:ascii="Arial" w:hAnsi="Arial"/>
+                <w:sz w:val="14"/>
+              </w:rPr>
+              <w:t>Public by design.</w:t>
+            </w:r>
+          </w:p>
+        </w:tc>
+        <w:tc>
+          <w:tcPr>
+            <w:tcW w:type="dxa" w:w="2340"/>
+            <w:vAlign w:val="center"/>
+          </w:tcPr>
+          <w:p>
+            <w:pPr>
+              <w:spacing w:after="20"/>
+            </w:pPr>
+            <w:r>
+              <w:rPr>
+                <w:rFonts w:ascii="Arial" w:hAnsi="Arial"/>
+                <w:sz w:val="14"/>
+              </w:rPr>
+              <w:t>Bad fields/limits 400; duplicate username 409; role input ignored; hash omitted. E01/E10.</w:t>
+            </w:r>
+          </w:p>
+        </w:tc>
+      </w:tr>
+      <w:tr>
+        <w:tc>
+          <w:tcPr>
+            <w:tcW w:type="dxa" w:w="2340"/>
+            <w:vAlign w:val="center"/>
+          </w:tcPr>
+          <w:p>
+            <w:pPr>
+              <w:spacing w:after="20"/>
+            </w:pPr>
+            <w:r>
+              <w:rPr>
+                <w:rFonts w:ascii="Arial" w:hAnsi="Arial"/>
+                <w:sz w:val="14"/>
+              </w:rPr>
+              <w:t>POST /auth/login</w:t>
+            </w:r>
+          </w:p>
+        </w:tc>
+        <w:tc>
+          <w:tcPr>
+            <w:tcW w:type="dxa" w:w="2340"/>
+            <w:vAlign w:val="center"/>
+          </w:tcPr>
+          <w:p>
+            <w:pPr>
+              <w:spacing w:after="20"/>
+            </w:pPr>
+            <w:r>
+              <w:rPr>
+                <w:rFonts w:ascii="Arial" w:hAnsi="Arial"/>
+                <w:sz w:val="14"/>
+              </w:rPr>
+              <w:t>Public; valid credentials.</w:t>
+            </w:r>
+          </w:p>
+        </w:tc>
+        <w:tc>
+          <w:tcPr>
+            <w:tcW w:type="dxa" w:w="2340"/>
+            <w:vAlign w:val="center"/>
+          </w:tcPr>
+          <w:p>
+            <w:pPr>
+              <w:spacing w:after="20"/>
+            </w:pPr>
+            <w:r>
+              <w:rPr>
+                <w:rFonts w:ascii="Arial" w:hAnsi="Arial"/>
+                <w:sz w:val="14"/>
+              </w:rPr>
+              <w:t>Public by design.</w:t>
+            </w:r>
+          </w:p>
+        </w:tc>
+        <w:tc>
+          <w:tcPr>
+            <w:tcW w:type="dxa" w:w="2340"/>
+            <w:vAlign w:val="center"/>
+          </w:tcPr>
+          <w:p>
+            <w:pPr>
+              <w:spacing w:after="20"/>
+            </w:pPr>
+            <w:r>
+              <w:rPr>
+                <w:rFonts w:ascii="Arial" w:hAnsi="Arial"/>
+                <w:sz w:val="14"/>
+              </w:rPr>
+              <w:t>Wrong/unknown credentials generic 401. Token is bearer secret (E02 redacted). No rate limiting.</w:t>
+            </w:r>
+          </w:p>
+        </w:tc>
+      </w:tr>
+      <w:tr>
+        <w:tc>
+          <w:tcPr>
+            <w:tcW w:type="dxa" w:w="2340"/>
+            <w:vAlign w:val="center"/>
+          </w:tcPr>
+          <w:p>
+            <w:pPr>
+              <w:spacing w:after="20"/>
+            </w:pPr>
+            <w:r>
+              <w:rPr>
+                <w:rFonts w:ascii="Arial" w:hAnsi="Arial"/>
+                <w:sz w:val="14"/>
+              </w:rPr>
+              <w:t>GET /auth/me</w:t>
+            </w:r>
+          </w:p>
+        </w:tc>
+        <w:tc>
+          <w:tcPr>
+            <w:tcW w:type="dxa" w:w="2340"/>
+            <w:vAlign w:val="center"/>
+          </w:tcPr>
+          <w:p>
+            <w:pPr>
+              <w:spacing w:after="20"/>
+            </w:pPr>
+            <w:r>
+              <w:rPr>
+                <w:rFonts w:ascii="Arial" w:hAnsi="Arial"/>
+                <w:sz w:val="14"/>
+              </w:rPr>
+              <w:t>Authenticated current user.</w:t>
+            </w:r>
+          </w:p>
+        </w:tc>
+        <w:tc>
+          <w:tcPr>
+            <w:tcW w:type="dxa" w:w="2340"/>
+            <w:vAlign w:val="center"/>
+          </w:tcPr>
+          <w:p>
+            <w:pPr>
+              <w:spacing w:after="20"/>
+            </w:pPr>
+            <w:r>
+              <w:rPr>
+                <w:rFonts w:ascii="Arial" w:hAnsi="Arial"/>
+                <w:sz w:val="14"/>
+              </w:rPr>
+              <w:t>Missing/invalid/revoked token 401.</w:t>
+            </w:r>
+          </w:p>
+        </w:tc>
+        <w:tc>
+          <w:tcPr>
+            <w:tcW w:type="dxa" w:w="2340"/>
+            <w:vAlign w:val="center"/>
+          </w:tcPr>
+          <w:p>
+            <w:pPr>
+              <w:spacing w:after="20"/>
+            </w:pPr>
+            <w:r>
+              <w:rPr>
+                <w:rFonts w:ascii="Arial" w:hAnsi="Arial"/>
+                <w:sz w:val="14"/>
+              </w:rPr>
+              <w:t>Public user fields only; 200 E03.</w:t>
+            </w:r>
+          </w:p>
+        </w:tc>
+      </w:tr>
+      <w:tr>
+        <w:tc>
+          <w:tcPr>
+            <w:tcW w:type="dxa" w:w="2340"/>
+            <w:vAlign w:val="center"/>
+          </w:tcPr>
+          <w:p>
+            <w:pPr>
+              <w:spacing w:after="20"/>
+            </w:pPr>
+            <w:r>
+              <w:rPr>
+                <w:rFonts w:ascii="Arial" w:hAnsi="Arial"/>
+                <w:sz w:val="14"/>
+              </w:rPr>
+              <w:t>POST /auth/logout</w:t>
+            </w:r>
+          </w:p>
+        </w:tc>
+        <w:tc>
+          <w:tcPr>
+            <w:tcW w:type="dxa" w:w="2340"/>
+            <w:vAlign w:val="center"/>
+          </w:tcPr>
+          <w:p>
+            <w:pPr>
+              <w:spacing w:after="20"/>
+            </w:pPr>
+            <w:r>
+              <w:rPr>
+                <w:rFonts w:ascii="Arial" w:hAnsi="Arial"/>
+                <w:sz w:val="14"/>
+              </w:rPr>
+              <w:t>Authenticated token holder.</w:t>
+            </w:r>
+          </w:p>
+        </w:tc>
+        <w:tc>
+          <w:tcPr>
+            <w:tcW w:type="dxa" w:w="2340"/>
+            <w:vAlign w:val="center"/>
+          </w:tcPr>
+          <w:p>
+            <w:pPr>
+              <w:spacing w:after="20"/>
+            </w:pPr>
+            <w:r>
+              <w:rPr>
+                <w:rFonts w:ascii="Arial" w:hAnsi="Arial"/>
+                <w:sz w:val="14"/>
+              </w:rPr>
+              <w:t>Missing/invalid token 401; revoked token rejected afterward.</w:t>
+            </w:r>
+          </w:p>
+        </w:tc>
+        <w:tc>
+          <w:tcPr>
+            <w:tcW w:type="dxa" w:w="2340"/>
+            <w:vAlign w:val="center"/>
+          </w:tcPr>
+          <w:p>
+            <w:pPr>
+              <w:spacing w:after="20"/>
+            </w:pPr>
+            <w:r>
+              <w:rPr>
+                <w:rFonts w:ascii="Arial" w:hAnsi="Arial"/>
+                <w:sz w:val="14"/>
+              </w:rPr>
+              <w:t>Logout 200 E16; later same token 401 E17.</w:t>
+            </w:r>
+          </w:p>
+        </w:tc>
+      </w:tr>
+      <w:tr>
+        <w:tc>
+          <w:tcPr>
+            <w:tcW w:type="dxa" w:w="2340"/>
+            <w:vAlign w:val="center"/>
+          </w:tcPr>
+          <w:p>
+            <w:pPr>
+              <w:spacing w:after="20"/>
+            </w:pPr>
+            <w:r>
+              <w:rPr>
+                <w:rFonts w:ascii="Arial" w:hAnsi="Arial"/>
+                <w:sz w:val="14"/>
+              </w:rPr>
+              <w:t>GET /api/protected</w:t>
+            </w:r>
+          </w:p>
+        </w:tc>
+        <w:tc>
+          <w:tcPr>
+            <w:tcW w:type="dxa" w:w="2340"/>
+            <w:vAlign w:val="center"/>
+          </w:tcPr>
+          <w:p>
+            <w:pPr>
+              <w:spacing w:after="20"/>
+            </w:pPr>
+            <w:r>
+              <w:rPr>
+                <w:rFonts w:ascii="Arial" w:hAnsi="Arial"/>
+                <w:sz w:val="14"/>
+              </w:rPr>
+              <w:t>Any authenticated user.</w:t>
+            </w:r>
+          </w:p>
+        </w:tc>
+        <w:tc>
+          <w:tcPr>
+            <w:tcW w:type="dxa" w:w="2340"/>
+            <w:vAlign w:val="center"/>
+          </w:tcPr>
+          <w:p>
+            <w:pPr>
+              <w:spacing w:after="20"/>
+            </w:pPr>
+            <w:r>
+              <w:rPr>
+                <w:rFonts w:ascii="Arial" w:hAnsi="Arial"/>
+                <w:sz w:val="14"/>
+              </w:rPr>
+              <w:t>Missing/invalid token 401.</w:t>
+            </w:r>
+          </w:p>
+        </w:tc>
+        <w:tc>
+          <w:tcPr>
+            <w:tcW w:type="dxa" w:w="2340"/>
+            <w:vAlign w:val="center"/>
+          </w:tcPr>
+          <w:p>
+            <w:pPr>
+              <w:spacing w:after="20"/>
+            </w:pPr>
+            <w:r>
+              <w:rPr>
+                <w:rFonts w:ascii="Arial" w:hAnsi="Arial"/>
+                <w:sz w:val="14"/>
+              </w:rPr>
+              <w:t>Minimal identity only; success E04, missing auth E09.</w:t>
+            </w:r>
+          </w:p>
+        </w:tc>
+      </w:tr>
+      <w:tr>
+        <w:tc>
+          <w:tcPr>
+            <w:tcW w:type="dxa" w:w="2340"/>
+            <w:vAlign w:val="center"/>
+          </w:tcPr>
+          <w:p>
+            <w:pPr>
+              <w:spacing w:after="20"/>
+            </w:pPr>
+            <w:r>
+              <w:rPr>
+                <w:rFonts w:ascii="Arial" w:hAnsi="Arial"/>
+                <w:sz w:val="14"/>
+              </w:rPr>
+              <w:t>GET /api/profile</w:t>
+            </w:r>
+          </w:p>
+        </w:tc>
+        <w:tc>
+          <w:tcPr>
+            <w:tcW w:type="dxa" w:w="2340"/>
+            <w:vAlign w:val="center"/>
+          </w:tcPr>
+          <w:p>
+            <w:pPr>
+              <w:spacing w:after="20"/>
+            </w:pPr>
+            <w:r>
+              <w:rPr>
+                <w:rFonts w:ascii="Arial" w:hAnsi="Arial"/>
+                <w:sz w:val="14"/>
+              </w:rPr>
+              <w:t>Authenticated user; own profile.</w:t>
+            </w:r>
+          </w:p>
+        </w:tc>
+        <w:tc>
+          <w:tcPr>
+            <w:tcW w:type="dxa" w:w="2340"/>
+            <w:vAlign w:val="center"/>
+          </w:tcPr>
+          <w:p>
+            <w:pPr>
+              <w:spacing w:after="20"/>
+            </w:pPr>
+            <w:r>
+              <w:rPr>
+                <w:rFonts w:ascii="Arial" w:hAnsi="Arial"/>
+                <w:sz w:val="14"/>
+              </w:rPr>
+              <w:t>Missing/invalid token 401.</w:t>
+            </w:r>
+          </w:p>
+        </w:tc>
+        <w:tc>
+          <w:tcPr>
+            <w:tcW w:type="dxa" w:w="2340"/>
+            <w:vAlign w:val="center"/>
+          </w:tcPr>
+          <w:p>
+            <w:pPr>
+              <w:spacing w:after="20"/>
+            </w:pPr>
+            <w:r>
+              <w:rPr>
+                <w:rFonts w:ascii="Arial" w:hAnsi="Arial"/>
+                <w:sz w:val="14"/>
+              </w:rPr>
+              <w:t>404 if absent; name/email only. Implemented, no screenshot supplied.</w:t>
+            </w:r>
+          </w:p>
+        </w:tc>
+      </w:tr>
+      <w:tr>
+        <w:tc>
+          <w:tcPr>
+            <w:tcW w:type="dxa" w:w="2340"/>
+            <w:vAlign w:val="center"/>
+          </w:tcPr>
+          <w:p>
+            <w:pPr>
+              <w:spacing w:after="20"/>
+            </w:pPr>
+            <w:r>
+              <w:rPr>
+                <w:rFonts w:ascii="Arial" w:hAnsi="Arial"/>
+                <w:sz w:val="14"/>
+              </w:rPr>
+              <w:t>GET /api/users/:id</w:t>
+            </w:r>
+          </w:p>
+        </w:tc>
+        <w:tc>
+          <w:tcPr>
+            <w:tcW w:type="dxa" w:w="2340"/>
+            <w:vAlign w:val="center"/>
+          </w:tcPr>
+          <w:p>
+            <w:pPr>
+              <w:spacing w:after="20"/>
+            </w:pPr>
+            <w:r>
+              <w:rPr>
+                <w:rFonts w:ascii="Arial" w:hAnsi="Arial"/>
+                <w:sz w:val="14"/>
+              </w:rPr>
+              <w:t>Owner or admin.</w:t>
+            </w:r>
+          </w:p>
+        </w:tc>
+        <w:tc>
+          <w:tcPr>
+            <w:tcW w:type="dxa" w:w="2340"/>
+            <w:vAlign w:val="center"/>
+          </w:tcPr>
+          <w:p>
+            <w:pPr>
+              <w:spacing w:after="20"/>
+            </w:pPr>
+            <w:r>
+              <w:rPr>
+                <w:rFonts w:ascii="Arial" w:hAnsi="Arial"/>
+                <w:sz w:val="14"/>
+              </w:rPr>
+              <w:t>Missing token 401; other student 403.</w:t>
+            </w:r>
+          </w:p>
+        </w:tc>
+        <w:tc>
+          <w:tcPr>
+            <w:tcW w:type="dxa" w:w="2340"/>
+            <w:vAlign w:val="center"/>
+          </w:tcPr>
+          <w:p>
+            <w:pPr>
+              <w:spacing w:after="20"/>
+            </w:pPr>
+            <w:r>
+              <w:rPr>
+                <w:rFonts w:ascii="Arial" w:hAnsi="Arial"/>
+                <w:sz w:val="14"/>
+              </w:rPr>
+              <w:t>Bad ID 400; missing user 404; public fields only. Positive screenshot absent.</w:t>
+            </w:r>
+          </w:p>
+        </w:tc>
+      </w:tr>
+      <w:tr>
+        <w:tc>
+          <w:tcPr>
+            <w:tcW w:type="dxa" w:w="2340"/>
+            <w:vAlign w:val="center"/>
+          </w:tcPr>
+          <w:p>
+            <w:pPr>
+              <w:spacing w:after="20"/>
+            </w:pPr>
+            <w:r>
+              <w:rPr>
+                <w:rFonts w:ascii="Arial" w:hAnsi="Arial"/>
+                <w:sz w:val="14"/>
+              </w:rPr>
+              <w:t>DELETE /api/users/:id</w:t>
+            </w:r>
+          </w:p>
+        </w:tc>
+        <w:tc>
+          <w:tcPr>
+            <w:tcW w:type="dxa" w:w="2340"/>
+            <w:vAlign w:val="center"/>
+          </w:tcPr>
+          <w:p>
+            <w:pPr>
+              <w:spacing w:after="20"/>
+            </w:pPr>
+            <w:r>
+              <w:rPr>
+                <w:rFonts w:ascii="Arial" w:hAnsi="Arial"/>
+                <w:sz w:val="14"/>
+              </w:rPr>
+              <w:t>Administrator only.</w:t>
+            </w:r>
+          </w:p>
+        </w:tc>
+        <w:tc>
+          <w:tcPr>
+            <w:tcW w:type="dxa" w:w="2340"/>
+            <w:vAlign w:val="center"/>
+          </w:tcPr>
+          <w:p>
+            <w:pPr>
+              <w:spacing w:after="20"/>
+            </w:pPr>
+            <w:r>
+              <w:rPr>
+                <w:rFonts w:ascii="Arial" w:hAnsi="Arial"/>
+                <w:sz w:val="14"/>
+              </w:rPr>
+              <w:t>Missing token 401; student 403.</w:t>
+            </w:r>
+          </w:p>
+        </w:tc>
+        <w:tc>
+          <w:tcPr>
+            <w:tcW w:type="dxa" w:w="2340"/>
+            <w:vAlign w:val="center"/>
+          </w:tcPr>
+          <w:p>
+            <w:pPr>
+              <w:spacing w:after="20"/>
+            </w:pPr>
+            <w:r>
+              <w:rPr>
+                <w:rFonts w:ascii="Arial" w:hAnsi="Arial"/>
+                <w:sz w:val="14"/>
+              </w:rPr>
+              <w:t>Bad ID 400; missing user 404; deletes associated in-memory records. No positive admin evidence.</w:t>
+            </w:r>
+          </w:p>
+        </w:tc>
+      </w:tr>
+      <w:tr>
+        <w:tc>
+          <w:tcPr>
+            <w:tcW w:type="dxa" w:w="2340"/>
+            <w:vAlign w:val="center"/>
+          </w:tcPr>
+          <w:p>
+            <w:pPr>
+              <w:spacing w:after="20"/>
+            </w:pPr>
+            <w:r>
+              <w:rPr>
+                <w:rFonts w:ascii="Arial" w:hAnsi="Arial"/>
+                <w:sz w:val="14"/>
+              </w:rPr>
+              <w:t>GET /api/admin</w:t>
+            </w:r>
+          </w:p>
+        </w:tc>
+        <w:tc>
+          <w:tcPr>
+            <w:tcW w:type="dxa" w:w="2340"/>
+            <w:vAlign w:val="center"/>
+          </w:tcPr>
+          <w:p>
+            <w:pPr>
+              <w:spacing w:after="20"/>
+            </w:pPr>
+            <w:r>
+              <w:rPr>
+                <w:rFonts w:ascii="Arial" w:hAnsi="Arial"/>
+                <w:sz w:val="14"/>
+              </w:rPr>
+              <w:t>Administrator only.</w:t>
+            </w:r>
+          </w:p>
+        </w:tc>
+        <w:tc>
+          <w:tcPr>
+            <w:tcW w:type="dxa" w:w="2340"/>
+            <w:vAlign w:val="center"/>
+          </w:tcPr>
+          <w:p>
+            <w:pPr>
+              <w:spacing w:after="20"/>
+            </w:pPr>
+            <w:r>
+              <w:rPr>
+                <w:rFonts w:ascii="Arial" w:hAnsi="Arial"/>
+                <w:sz w:val="14"/>
+              </w:rPr>
+              <w:t>Missing token 401; student 403.</w:t>
+            </w:r>
+          </w:p>
+        </w:tc>
+        <w:tc>
+          <w:tcPr>
+            <w:tcW w:type="dxa" w:w="2340"/>
+            <w:vAlign w:val="center"/>
+          </w:tcPr>
+          <w:p>
+            <w:pPr>
+              <w:spacing w:after="20"/>
+            </w:pPr>
+            <w:r>
+              <w:rPr>
+                <w:rFonts w:ascii="Arial" w:hAnsi="Arial"/>
+                <w:sz w:val="14"/>
+              </w:rPr>
+              <w:t>Student denial E14; successful admin access not captured.</w:t>
+            </w:r>
+          </w:p>
+        </w:tc>
+      </w:tr>
+      <w:tr>
+        <w:tc>
+          <w:tcPr>
+            <w:tcW w:type="dxa" w:w="2340"/>
+            <w:vAlign w:val="center"/>
+          </w:tcPr>
+          <w:p>
+            <w:pPr>
+              <w:spacing w:after="20"/>
+            </w:pPr>
+            <w:r>
+              <w:rPr>
+                <w:rFonts w:ascii="Arial" w:hAnsi="Arial"/>
+                <w:sz w:val="14"/>
+              </w:rPr>
+              <w:t>GET /api/tasks</w:t>
+            </w:r>
+          </w:p>
+        </w:tc>
+        <w:tc>
+          <w:tcPr>
+            <w:tcW w:type="dxa" w:w="2340"/>
+            <w:vAlign w:val="center"/>
+          </w:tcPr>
+          <w:p>
+            <w:pPr>
+              <w:spacing w:after="20"/>
+            </w:pPr>
+            <w:r>
+              <w:rPr>
+                <w:rFonts w:ascii="Arial" w:hAnsi="Arial"/>
+                <w:sz w:val="14"/>
+              </w:rPr>
+              <w:t>Authenticated student sees own tasks; admin all.</w:t>
+            </w:r>
+          </w:p>
+        </w:tc>
+        <w:tc>
+          <w:tcPr>
+            <w:tcW w:type="dxa" w:w="2340"/>
+            <w:vAlign w:val="center"/>
+          </w:tcPr>
+          <w:p>
+            <w:pPr>
+              <w:spacing w:after="20"/>
+            </w:pPr>
+            <w:r>
+              <w:rPr>
+                <w:rFonts w:ascii="Arial" w:hAnsi="Arial"/>
+                <w:sz w:val="14"/>
+              </w:rPr>
+              <w:t>Missing/invalid token 401.</w:t>
+            </w:r>
+          </w:p>
+        </w:tc>
+        <w:tc>
+          <w:tcPr>
+            <w:tcW w:type="dxa" w:w="2340"/>
+            <w:vAlign w:val="center"/>
+          </w:tcPr>
+          <w:p>
+            <w:pPr>
+              <w:spacing w:after="20"/>
+            </w:pPr>
+            <w:r>
+              <w:rPr>
+                <w:rFonts w:ascii="Arial" w:hAnsi="Arial"/>
+                <w:sz w:val="14"/>
+              </w:rPr>
+              <w:t>Task list includes ownerId; own list E06. Admin list not evidenced.</w:t>
+            </w:r>
+          </w:p>
+        </w:tc>
+      </w:tr>
+      <w:tr>
+        <w:tc>
+          <w:tcPr>
+            <w:tcW w:type="dxa" w:w="2340"/>
+            <w:vAlign w:val="center"/>
+          </w:tcPr>
+          <w:p>
+            <w:pPr>
+              <w:spacing w:after="20"/>
+            </w:pPr>
+            <w:r>
+              <w:rPr>
+                <w:rFonts w:ascii="Arial" w:hAnsi="Arial"/>
+                <w:sz w:val="14"/>
+              </w:rPr>
+              <w:t>GET /api/task/:id and /api/tasks/:id</w:t>
+            </w:r>
+          </w:p>
+        </w:tc>
+        <w:tc>
+          <w:tcPr>
+            <w:tcW w:type="dxa" w:w="2340"/>
+            <w:vAlign w:val="center"/>
+          </w:tcPr>
+          <w:p>
+            <w:pPr>
+              <w:spacing w:after="20"/>
+            </w:pPr>
+            <w:r>
+              <w:rPr>
+                <w:rFonts w:ascii="Arial" w:hAnsi="Arial"/>
+                <w:sz w:val="14"/>
+              </w:rPr>
+              <w:t>Task owner or admin.</w:t>
+            </w:r>
+          </w:p>
+        </w:tc>
+        <w:tc>
+          <w:tcPr>
+            <w:tcW w:type="dxa" w:w="2340"/>
+            <w:vAlign w:val="center"/>
+          </w:tcPr>
+          <w:p>
+            <w:pPr>
+              <w:spacing w:after="20"/>
+            </w:pPr>
+            <w:r>
+              <w:rPr>
+                <w:rFonts w:ascii="Arial" w:hAnsi="Arial"/>
+                <w:sz w:val="14"/>
+              </w:rPr>
+              <w:t>Missing token 401; inaccessible/missing 404.</w:t>
+            </w:r>
+          </w:p>
+        </w:tc>
+        <w:tc>
+          <w:tcPr>
+            <w:tcW w:type="dxa" w:w="2340"/>
+            <w:vAlign w:val="center"/>
+          </w:tcPr>
+          <w:p>
+            <w:pPr>
+              <w:spacing w:after="20"/>
+            </w:pPr>
+            <w:r>
+              <w:rPr>
+                <w:rFonts w:ascii="Arial" w:hAnsi="Arial"/>
+                <w:sz w:val="14"/>
+              </w:rPr>
+              <w:t>Bad ID 400; owner success E07, other-owner denial E15.</w:t>
+            </w:r>
+          </w:p>
+        </w:tc>
+      </w:tr>
+      <w:tr>
+        <w:tc>
+          <w:tcPr>
+            <w:tcW w:type="dxa" w:w="2340"/>
+            <w:vAlign w:val="center"/>
+          </w:tcPr>
+          <w:p>
+            <w:pPr>
+              <w:spacing w:after="20"/>
+            </w:pPr>
+            <w:r>
+              <w:rPr>
+                <w:rFonts w:ascii="Arial" w:hAnsi="Arial"/>
+                <w:sz w:val="14"/>
+              </w:rPr>
+              <w:t>POST /api/tasks</w:t>
+            </w:r>
+          </w:p>
+        </w:tc>
+        <w:tc>
+          <w:tcPr>
+            <w:tcW w:type="dxa" w:w="2340"/>
+            <w:vAlign w:val="center"/>
+          </w:tcPr>
+          <w:p>
+            <w:pPr>
+              <w:spacing w:after="20"/>
+            </w:pPr>
+            <w:r>
+              <w:rPr>
+                <w:rFonts w:ascii="Arial" w:hAnsi="Arial"/>
+                <w:sz w:val="14"/>
+              </w:rPr>
+              <w:t>Authenticated user; creates own task.</w:t>
+            </w:r>
+          </w:p>
+        </w:tc>
+        <w:tc>
+          <w:tcPr>
+            <w:tcW w:type="dxa" w:w="2340"/>
+            <w:vAlign w:val="center"/>
+          </w:tcPr>
+          <w:p>
+            <w:pPr>
+              <w:spacing w:after="20"/>
+            </w:pPr>
+            <w:r>
+              <w:rPr>
+                <w:rFonts w:ascii="Arial" w:hAnsi="Arial"/>
+                <w:sz w:val="14"/>
+              </w:rPr>
+              <w:t>Missing/invalid token 401.</w:t>
+            </w:r>
+          </w:p>
+        </w:tc>
+        <w:tc>
+          <w:tcPr>
+            <w:tcW w:type="dxa" w:w="2340"/>
+            <w:vAlign w:val="center"/>
+          </w:tcPr>
+          <w:p>
+            <w:pPr>
+              <w:spacing w:after="20"/>
+            </w:pPr>
+            <w:r>
+              <w:rPr>
+                <w:rFonts w:ascii="Arial" w:hAnsi="Arial"/>
+                <w:sz w:val="14"/>
+              </w:rPr>
+              <w:t>Only title/completed accepted; bad input 400; server sets ownerId. E05 201.</w:t>
+            </w:r>
+          </w:p>
+        </w:tc>
+      </w:tr>
+      <w:tr>
+        <w:tc>
+          <w:tcPr>
+            <w:tcW w:type="dxa" w:w="2340"/>
+            <w:vAlign w:val="center"/>
+          </w:tcPr>
+          <w:p>
+            <w:pPr>
+              <w:spacing w:after="20"/>
+            </w:pPr>
+            <w:r>
+              <w:rPr>
+                <w:rFonts w:ascii="Arial" w:hAnsi="Arial"/>
+                <w:sz w:val="14"/>
+              </w:rPr>
+              <w:t>PUT /api/tasks/:id</w:t>
+            </w:r>
+          </w:p>
+        </w:tc>
+        <w:tc>
+          <w:tcPr>
+            <w:tcW w:type="dxa" w:w="2340"/>
+            <w:vAlign w:val="center"/>
+          </w:tcPr>
+          <w:p>
+            <w:pPr>
+              <w:spacing w:after="20"/>
+            </w:pPr>
+            <w:r>
+              <w:rPr>
+                <w:rFonts w:ascii="Arial" w:hAnsi="Arial"/>
+                <w:sz w:val="14"/>
+              </w:rPr>
+              <w:t>Task owner or admin.</w:t>
+            </w:r>
+          </w:p>
+        </w:tc>
+        <w:tc>
+          <w:tcPr>
+            <w:tcW w:type="dxa" w:w="2340"/>
+            <w:vAlign w:val="center"/>
+          </w:tcPr>
+          <w:p>
+            <w:pPr>
+              <w:spacing w:after="20"/>
+            </w:pPr>
+            <w:r>
+              <w:rPr>
+                <w:rFonts w:ascii="Arial" w:hAnsi="Arial"/>
+                <w:sz w:val="14"/>
+              </w:rPr>
+              <w:t>Missing token 401; inaccessible/missing 404.</w:t>
+            </w:r>
+          </w:p>
+        </w:tc>
+        <w:tc>
+          <w:tcPr>
+            <w:tcW w:type="dxa" w:w="2340"/>
+            <w:vAlign w:val="center"/>
+          </w:tcPr>
+          <w:p>
+            <w:pPr>
+              <w:spacing w:after="20"/>
+            </w:pPr>
+            <w:r>
+              <w:rPr>
+                <w:rFonts w:ascii="Arial" w:hAnsi="Arial"/>
+                <w:sz w:val="14"/>
+              </w:rPr>
+              <w:t>Bad ID/body 400; only title/completed editable. Owner update E08.</w:t>
+            </w:r>
+          </w:p>
+        </w:tc>
+      </w:tr>
+      <w:tr>
+        <w:tc>
+          <w:tcPr>
+            <w:tcW w:type="dxa" w:w="2340"/>
+            <w:vAlign w:val="center"/>
+          </w:tcPr>
+          <w:p>
+            <w:pPr>
+              <w:spacing w:after="20"/>
+            </w:pPr>
+            <w:r>
+              <w:rPr>
+                <w:rFonts w:ascii="Arial" w:hAnsi="Arial"/>
+                <w:sz w:val="14"/>
+              </w:rPr>
+              <w:t>DELETE /api/tasks/:id</w:t>
+            </w:r>
+          </w:p>
+        </w:tc>
+        <w:tc>
+          <w:tcPr>
+            <w:tcW w:type="dxa" w:w="2340"/>
+            <w:vAlign w:val="center"/>
+          </w:tcPr>
+          <w:p>
+            <w:pPr>
+              <w:spacing w:after="20"/>
+            </w:pPr>
+            <w:r>
+              <w:rPr>
+                <w:rFonts w:ascii="Arial" w:hAnsi="Arial"/>
+                <w:sz w:val="14"/>
+              </w:rPr>
+              <w:t>Task owner or admin.</w:t>
+            </w:r>
+          </w:p>
+        </w:tc>
+        <w:tc>
+          <w:tcPr>
+            <w:tcW w:type="dxa" w:w="2340"/>
+            <w:vAlign w:val="center"/>
+          </w:tcPr>
+          <w:p>
+            <w:pPr>
+              <w:spacing w:after="20"/>
+            </w:pPr>
+            <w:r>
+              <w:rPr>
+                <w:rFonts w:ascii="Arial" w:hAnsi="Arial"/>
+                <w:sz w:val="14"/>
+              </w:rPr>
+              <w:t>Missing token 401; inaccessible/missing 404.</w:t>
+            </w:r>
+          </w:p>
+        </w:tc>
+        <w:tc>
+          <w:tcPr>
+            <w:tcW w:type="dxa" w:w="2340"/>
+            <w:vAlign w:val="center"/>
+          </w:tcPr>
+          <w:p>
+            <w:pPr>
+              <w:spacing w:after="20"/>
+            </w:pPr>
+            <w:r>
+              <w:rPr>
+                <w:rFonts w:ascii="Arial" w:hAnsi="Arial"/>
+                <w:sz w:val="14"/>
+              </w:rPr>
+              <w:t>Bad ID 400. No successful delete screenshot in E01-E17; cross-user capture is read-only.</w:t>
+            </w:r>
+          </w:p>
+        </w:tc>
+      </w:tr>
+    </w:tbl>
+    <w:p>
+      <w:pPr/>
+      <w:r>
+        <w:t>The endpoint inventory above applies the seven Part J questions to every route in the committed secure API. The root health route is intentionally public; registration/login are public; remaining routes require authentication and resource/role checks where indicated. No screenshot means that behavior is not claimed as observed.</w:t>
+      </w:r>
+    </w:p>
     <w:p>
       <w:pPr>
         <w:spacing w:before="100" w:beforeAutospacing="1" w:after="100" w:afterAutospacing="1"/>
@@ -18425,6 +19492,90 @@
     </w:p>
     <w:p>
       <w:pPr>
+        <w:pStyle w:val="Heading3"/>
+      </w:pPr>
+      <w:r>
+        <w:t>Section 1 - What I built (continued)</w:t>
+      </w:r>
+    </w:p>
+    <w:p>
+      <w:pPr/>
+      <w:r>
+        <w:t>The request path follows the lab security pipeline: the Express JSON parser limits request size, routes validate registration/task fields, JWT middleware identifies the account, authorization checks role or resource ownership, and responses use limited public fields. Registration and login are public exceptions because users need to create an account and establish identity. Task routes require authentication and do not trust a client-supplied ownerId. These statements describe committed code; only cases with E01-E17 references have supplied Postman screenshots.</w:t>
+      </w:r>
+    </w:p>
+    <w:p>
+      <w:pPr>
+        <w:pStyle w:val="Heading3"/>
+      </w:pPr>
+      <w:r>
+        <w:t>Section 2 - Password security (continued)</w:t>
+      </w:r>
+    </w:p>
+    <w:p>
+      <w:pPr/>
+      <w:r>
+        <w:t>The runtime store is arrays, so it demonstrates hashing/verification but does not provide durable account storage, database permissions, migrations, backups or a stored-hash screenshot. I should not describe it as a database. Source code is the available evidence for bcrypt.hash and bcrypt.compare, and response assertions check that the hash is not returned. Repeated login attempts are not rate-limited in this prototype.</w:t>
+      </w:r>
+    </w:p>
+    <w:p>
+      <w:pPr>
+        <w:pStyle w:val="Heading3"/>
+      </w:pPr>
+      <w:r>
+        <w:t>Section 3 - Risks, cause, impact and mitigation</w:t>
+      </w:r>
+    </w:p>
+    <w:p>
+      <w:pPr/>
+      <w:r>
+        <w:t>Broken access control is relevant because task IDs appear in URLs. The server checks task ownership and returns 404 for missing or inaccessible tasks, avoiding a clear existence disclosure; E15 is the supplied cross-user denial. Credential compromise is another risk: bcrypt reduces harm if stored data is disclosed, but weak/reused passwords and online guessing remain concerns. The prototype has no rate limiter or lockout. A third risk is bearer-token theft: a stolen live token can be replayed until expiry or revocation. The 15-minute expiry, signature verification and logout revocation help, but the revocation map is process-local and not shared after restart or across instances. HTTPS and safe client token storage are necessary before deployment. A signing-secret leak is also serious: secure-api loads its secret from protected local configuration and fails startup if missing/short; the exposed local key was rotated. The separate vulnerable-api intentionally contains an unsafe demo secret and must remain local-only.</w:t>
+      </w:r>
+    </w:p>
+    <w:p>
+      <w:pPr>
+        <w:pStyle w:val="Heading3"/>
+      </w:pPr>
+      <w:r>
+        <w:t>Section 4 - Evidence interpretation</w:t>
+      </w:r>
+    </w:p>
+    <w:p>
+      <w:pPr/>
+      <w:r>
+        <w:t>E01-E17 are the only evidence images included. E02 has the bearer token obscured; no signing-secret screenshot or password-variable screenshot is included. The screenshots support the status codes explicitly recorded in the matrix, but do not prove unpictured cases. In particular, there is no expired-token Postman response and no successful administrator-route response. Earlier notes say automated-test source contains expiry/admin-success assertions; these are source assertions, not a test run in this update. The committed Postman collection also has no expiry request. To close these evidence gaps, I should run a short-lived token test and configure an optional administrator, then save sanitized Postman results. Until then, those rows remain not tested/not evidenced.</w:t>
+      </w:r>
+    </w:p>
+    <w:p>
+      <w:pPr>
+        <w:pStyle w:val="Heading3"/>
+      </w:pPr>
+      <w:r>
+        <w:t>Section 5 - Personal reflection draft (verify and personalize)</w:t>
+      </w:r>
+    </w:p>
+    <w:p>
+      <w:pPr/>
+      <w:r>
+        <w:t>The following is a writing prompt, not a statement of my actual experience: ?One lesson I want to take from this lab is that authentication and authorization answer different questions. A valid login establishes identity, but a separate permission check decides whether that identity may use a particular operation or resource. A useful security test therefore tries a valid identity against an action that should be denied.? Replace this with my own honest reflection: What did I believe before this lab? Which test did I personally perform? What result did I see and what did I learn? Do not say I ran a test unless I did.</w:t>
+      </w:r>
+    </w:p>
+    <w:p>
+      <w:pPr>
+        <w:pStyle w:val="Heading3"/>
+      </w:pPr>
+      <w:r>
+        <w:t>Section 5 - Production changes</w:t>
+      </w:r>
+    </w:p>
+    <w:p>
+      <w:pPr/>
+      <w:r>
+        <w:t>Before production, I would replace the in-memory arrays with a persistent database and define a schema with a unique normalized username, password hash, role and task-owner relationship. I would add migrations, backups, retention rules, race-safe uniqueness and least-privilege DB credentials. I would add login throttling and monitoring, account recovery, HTTPS, secret management/rotation and a shared revocation design across restarts/instances. I would review client token storage and applicable XSS/CSRF defenses. Finally, I would add repeatable tests for expired tokens, invalid signatures, successful and denied admin access, and ownership checks for read/update/delete. These controls are recommendations, not implemented features.</w:t>
+      </w:r>
+    </w:p>
+    <w:p>
+      <w:pPr>
         <w:spacing w:before="100" w:beforeAutospacing="1" w:after="100" w:afterAutospacing="1"/>
         <w:outlineLvl w:val="0"/>
         <w:rPr>
@@ -21230,7 +22381,7 @@
     </w:p>
     <w:p>
       <w:r>
-        <w:t>Important limitations: the application uses an in-memory store, not a persistent database. No expired-token Postman screenshot or successful administrator-access screenshot was supplied. Part M is a draft based on the implementation and supplied evidence; personalize it before submitting.</w:t>
+        <w:t>Important limitations: the application uses an in-memory store, not a persistent database. The evidence set contains screenshots E01-E17 only. It has no stored-hash/database screenshot, expired-token Postman response, or successful administrator-access response. Do not claim these demonstrations occurred. Part M is a draft to personalize; source assertions are not test results from a run in this update.</w:t>
       </w:r>
     </w:p>
     <w:p>
@@ -21732,12 +22883,12 @@
         <w:pStyle w:val="Heading2"/>
       </w:pPr>
       <w:r>
-        <w:t>Tasks D1–D2 — Structure and secrecy</w:t>
-      </w:r>
-    </w:p>
-    <w:p>
-      <w:r>
-        <w:t>A JWT is HEADER.PAYLOAD.SIGNATURE. The header specifies HS256 and JWT type. This implementation issues sub (user ID), jti (unique token ID), iss (issuer), iat and exp; it does not place username, role or password in the payload. Middleware verifies algorithm, signature, issuer and expiry, then looks up the user and current role server-side. A normal JWT payload is encoded, not encrypted or secret; anyone holding the token can decode it. The signature detects tampering when properly verified.</w:t>
+        <w:t>Task D1 - Inspect a JWT</w:t>
+      </w:r>
+    </w:p>
+    <w:p>
+      <w:r>
+        <w:t>A JWT has three dot-separated parts: HEADER.PAYLOAD.SIGNATURE. In this implementation, the header identifies JWT and HS256 (HMAC-SHA-256). The payload claims are sub (user ID), jti (unique token ID), iss (issuer), iat (issued-at time) and exp (expiry). The signature is the HMAC-SHA-256 integrity/authenticity value computed with the server secret. These claims come from the committed signing code; the supplied successful-login screenshot has its token redacted, so I am not claiming to have decoded that screenshot token. No raw token is included as evidence.</w:t>
       </w:r>
     </w:p>
     <w:p>
@@ -21745,12 +22896,12 @@
         <w:pStyle w:val="Heading2"/>
       </w:pPr>
       <w:r>
-        <w:t>Tasks D3–D4 — Login and middleware</w:t>
-      </w:r>
-    </w:p>
-    <w:p>
-      <w:r>
-        <w:t>POST /auth/login returns a signed JWT after bcrypt verification. Clients send Authorization: Bearer &lt;token&gt;. Middleware extracts and verifies it, checks expiry and revocation, finds the current user, and attaches trusted identity for downstream authorization. GET /api/protected uses this middleware.</w:t>
+        <w:t>Task D3 - JWT login</w:t>
+      </w:r>
+    </w:p>
+    <w:p>
+      <w:r>
+        <w:t>POST /auth/login receives username/password, finds the user, and verifies the submitted password with bcrypt.compare against the stored bcrypt hash. Invalid/unknown credentials receive the generic 401 response. On success the server signs a JWT with HS256, subject=user ID, a unique jti, issuer cbe204-week06 and a 15-minute expiry, then returns the token and public user fields. Supplied screenshot E02 shows 200 OK and public student fields; the bearer token is covered in the evidence copy. Registration is separately shown in E01 (201).</w:t>
       </w:r>
     </w:p>
     <w:p>
@@ -21943,7 +23094,7 @@
           </w:tcPr>
           <w:p>
             <w:r>
-              <w:t>No Postman screenshot supplied; a test exists in secure-api/test/auth-tasks.test.js but was not rerun for this document.</w:t>
+              <w:t>Not captured / not tested in supplied Postman evidence. Source includes an expiry test assertion, but that test was not rerun for this document update.</w:t>
             </w:r>
           </w:p>
         </w:tc>
@@ -22976,6 +24127,7 @@
       <w:tblPr>
         <w:tblW w:type="auto" w:w="0"/>
         <w:tblLook w:firstColumn="1" w:firstRow="1" w:lastColumn="0" w:lastRow="0" w:noHBand="0" w:noVBand="1" w:val="04A0"/>
+        <w:jc w:val="center"/>
         <w:tblBorders>
           <w:top w:val="single" w:sz="4" w:space="0" w:color="A6A6A6"/>
           <w:left w:val="single" w:sz="4" w:space="0" w:color="A6A6A6"/>
@@ -22990,16 +24142,23 @@
         <w:gridCol w:w="2340"/>
         <w:gridCol w:w="2340"/>
         <w:gridCol w:w="2340"/>
+        <w:gridCol w:w="1800"/>
       </w:tblGrid>
       <w:tr>
         <w:tc>
           <w:tcPr>
             <w:tcW w:type="dxa" w:w="2340"/>
-          </w:tcPr>
-          <w:p>
+            <w:vAlign w:val="center"/>
+          </w:tcPr>
+          <w:p>
+            <w:pPr>
+              <w:spacing w:after="20"/>
+            </w:pPr>
             <w:r>
               <w:rPr>
+                <w:rFonts w:ascii="Arial" w:hAnsi="Arial"/>
                 <w:b/>
+                <w:sz w:val="14"/>
               </w:rPr>
               <w:t>#</w:t>
             </w:r>
@@ -23008,11 +24167,17 @@
         <w:tc>
           <w:tcPr>
             <w:tcW w:type="dxa" w:w="2340"/>
-          </w:tcPr>
-          <w:p>
+            <w:vAlign w:val="center"/>
+          </w:tcPr>
+          <w:p>
+            <w:pPr>
+              <w:spacing w:after="20"/>
+            </w:pPr>
             <w:r>
               <w:rPr>
+                <w:rFonts w:ascii="Arial" w:hAnsi="Arial"/>
                 <w:b/>
+                <w:sz w:val="14"/>
               </w:rPr>
               <w:t>Test</w:t>
             </w:r>
@@ -23021,11 +24186,17 @@
         <w:tc>
           <w:tcPr>
             <w:tcW w:type="dxa" w:w="2340"/>
-          </w:tcPr>
-          <w:p>
+            <w:vAlign w:val="center"/>
+          </w:tcPr>
+          <w:p>
+            <w:pPr>
+              <w:spacing w:after="20"/>
+            </w:pPr>
             <w:r>
               <w:rPr>
+                <w:rFonts w:ascii="Arial" w:hAnsi="Arial"/>
                 <w:b/>
+                <w:sz w:val="14"/>
               </w:rPr>
               <w:t>Expected</w:t>
             </w:r>
@@ -23034,13 +24205,38 @@
         <w:tc>
           <w:tcPr>
             <w:tcW w:type="dxa" w:w="2340"/>
-          </w:tcPr>
-          <w:p>
+            <w:vAlign w:val="center"/>
+          </w:tcPr>
+          <w:p>
+            <w:pPr>
+              <w:spacing w:after="20"/>
+            </w:pPr>
             <w:r>
               <w:rPr>
+                <w:rFonts w:ascii="Arial" w:hAnsi="Arial"/>
                 <w:b/>
+                <w:sz w:val="14"/>
               </w:rPr>
-              <w:t>Actual/evidence</w:t>
+              <w:t>Actual</w:t>
+            </w:r>
+          </w:p>
+        </w:tc>
+        <w:tc>
+          <w:tcPr>
+            <w:tcW w:type="dxa" w:w="1800"/>
+            <w:vAlign w:val="center"/>
+          </w:tcPr>
+          <w:p>
+            <w:pPr>
+              <w:spacing w:after="20"/>
+            </w:pPr>
+            <w:r>
+              <w:rPr>
+                <w:rFonts w:ascii="Arial" w:hAnsi="Arial"/>
+                <w:b/>
+                <w:sz w:val="14"/>
+              </w:rPr>
+              <w:t>Pass/Fail / Evidence</w:t>
             </w:r>
           </w:p>
         </w:tc>
@@ -23049,9 +24245,17 @@
         <w:tc>
           <w:tcPr>
             <w:tcW w:type="dxa" w:w="2340"/>
-          </w:tcPr>
-          <w:p>
-            <w:r>
+            <w:vAlign w:val="center"/>
+          </w:tcPr>
+          <w:p>
+            <w:pPr>
+              <w:spacing w:after="20"/>
+            </w:pPr>
+            <w:r>
+              <w:rPr>
+                <w:rFonts w:ascii="Arial" w:hAnsi="Arial"/>
+                <w:sz w:val="14"/>
+              </w:rPr>
               <w:t>1</w:t>
             </w:r>
           </w:p>
@@ -23059,9 +24263,17 @@
         <w:tc>
           <w:tcPr>
             <w:tcW w:type="dxa" w:w="2340"/>
-          </w:tcPr>
-          <w:p>
-            <w:r>
+            <w:vAlign w:val="center"/>
+          </w:tcPr>
+          <w:p>
+            <w:pPr>
+              <w:spacing w:after="20"/>
+            </w:pPr>
+            <w:r>
+              <w:rPr>
+                <w:rFonts w:ascii="Arial" w:hAnsi="Arial"/>
+                <w:sz w:val="14"/>
+              </w:rPr>
               <w:t>Protected endpoint without login</w:t>
             </w:r>
           </w:p>
@@ -23069,9 +24281,17 @@
         <w:tc>
           <w:tcPr>
             <w:tcW w:type="dxa" w:w="2340"/>
-          </w:tcPr>
-          <w:p>
-            <w:r>
+            <w:vAlign w:val="center"/>
+          </w:tcPr>
+          <w:p>
+            <w:pPr>
+              <w:spacing w:after="20"/>
+            </w:pPr>
+            <w:r>
+              <w:rPr>
+                <w:rFonts w:ascii="Arial" w:hAnsi="Arial"/>
+                <w:sz w:val="14"/>
+              </w:rPr>
               <w:t>401</w:t>
             </w:r>
           </w:p>
@@ -23079,10 +24299,36 @@
         <w:tc>
           <w:tcPr>
             <w:tcW w:type="dxa" w:w="2340"/>
-          </w:tcPr>
-          <w:p>
-            <w:r>
-              <w:t>401 E09.</w:t>
+            <w:vAlign w:val="center"/>
+          </w:tcPr>
+          <w:p>
+            <w:pPr>
+              <w:spacing w:after="20"/>
+            </w:pPr>
+            <w:r>
+              <w:rPr>
+                <w:rFonts w:ascii="Arial" w:hAnsi="Arial"/>
+                <w:sz w:val="14"/>
+              </w:rPr>
+              <w:t>401 Unauthorized (E09)</w:t>
+            </w:r>
+          </w:p>
+        </w:tc>
+        <w:tc>
+          <w:tcPr>
+            <w:tcW w:type="dxa" w:w="1800"/>
+            <w:vAlign w:val="center"/>
+          </w:tcPr>
+          <w:p>
+            <w:pPr>
+              <w:spacing w:after="20"/>
+            </w:pPr>
+            <w:r>
+              <w:rPr>
+                <w:rFonts w:ascii="Arial" w:hAnsi="Arial"/>
+                <w:sz w:val="14"/>
+              </w:rPr>
+              <w:t>PASS - screenshot</w:t>
             </w:r>
           </w:p>
         </w:tc>
@@ -23091,9 +24337,17 @@
         <w:tc>
           <w:tcPr>
             <w:tcW w:type="dxa" w:w="2340"/>
-          </w:tcPr>
-          <w:p>
-            <w:r>
+            <w:vAlign w:val="center"/>
+          </w:tcPr>
+          <w:p>
+            <w:pPr>
+              <w:spacing w:after="20"/>
+            </w:pPr>
+            <w:r>
+              <w:rPr>
+                <w:rFonts w:ascii="Arial" w:hAnsi="Arial"/>
+                <w:sz w:val="14"/>
+              </w:rPr>
               <w:t>2</w:t>
             </w:r>
           </w:p>
@@ -23101,9 +24355,17 @@
         <w:tc>
           <w:tcPr>
             <w:tcW w:type="dxa" w:w="2340"/>
-          </w:tcPr>
-          <w:p>
-            <w:r>
+            <w:vAlign w:val="center"/>
+          </w:tcPr>
+          <w:p>
+            <w:pPr>
+              <w:spacing w:after="20"/>
+            </w:pPr>
+            <w:r>
+              <w:rPr>
+                <w:rFonts w:ascii="Arial" w:hAnsi="Arial"/>
+                <w:sz w:val="14"/>
+              </w:rPr>
               <w:t>Incorrect password</w:t>
             </w:r>
           </w:p>
@@ -23111,20 +24373,54 @@
         <w:tc>
           <w:tcPr>
             <w:tcW w:type="dxa" w:w="2340"/>
-          </w:tcPr>
-          <w:p>
-            <w:r>
-              <w:t>401 generic failure</w:t>
+            <w:vAlign w:val="center"/>
+          </w:tcPr>
+          <w:p>
+            <w:pPr>
+              <w:spacing w:after="20"/>
+            </w:pPr>
+            <w:r>
+              <w:rPr>
+                <w:rFonts w:ascii="Arial" w:hAnsi="Arial"/>
+                <w:sz w:val="14"/>
+              </w:rPr>
+              <w:t>401 / generic failure</w:t>
             </w:r>
           </w:p>
         </w:tc>
         <w:tc>
           <w:tcPr>
             <w:tcW w:type="dxa" w:w="2340"/>
-          </w:tcPr>
-          <w:p>
-            <w:r>
-              <w:t>401 “Invalid credentials” E11.</w:t>
+            <w:vAlign w:val="center"/>
+          </w:tcPr>
+          <w:p>
+            <w:pPr>
+              <w:spacing w:after="20"/>
+            </w:pPr>
+            <w:r>
+              <w:rPr>
+                <w:rFonts w:ascii="Arial" w:hAnsi="Arial"/>
+                <w:sz w:val="14"/>
+              </w:rPr>
+              <w:t>401 Invalid credentials (E11)</w:t>
+            </w:r>
+          </w:p>
+        </w:tc>
+        <w:tc>
+          <w:tcPr>
+            <w:tcW w:type="dxa" w:w="1800"/>
+            <w:vAlign w:val="center"/>
+          </w:tcPr>
+          <w:p>
+            <w:pPr>
+              <w:spacing w:after="20"/>
+            </w:pPr>
+            <w:r>
+              <w:rPr>
+                <w:rFonts w:ascii="Arial" w:hAnsi="Arial"/>
+                <w:sz w:val="14"/>
+              </w:rPr>
+              <w:t>PASS - screenshot</w:t>
             </w:r>
           </w:p>
         </w:tc>
@@ -23133,9 +24429,17 @@
         <w:tc>
           <w:tcPr>
             <w:tcW w:type="dxa" w:w="2340"/>
-          </w:tcPr>
-          <w:p>
-            <w:r>
+            <w:vAlign w:val="center"/>
+          </w:tcPr>
+          <w:p>
+            <w:pPr>
+              <w:spacing w:after="20"/>
+            </w:pPr>
+            <w:r>
+              <w:rPr>
+                <w:rFonts w:ascii="Arial" w:hAnsi="Arial"/>
+                <w:sz w:val="14"/>
+              </w:rPr>
               <w:t>3</w:t>
             </w:r>
           </w:p>
@@ -23143,9 +24447,17 @@
         <w:tc>
           <w:tcPr>
             <w:tcW w:type="dxa" w:w="2340"/>
-          </w:tcPr>
-          <w:p>
-            <w:r>
+            <w:vAlign w:val="center"/>
+          </w:tcPr>
+          <w:p>
+            <w:pPr>
+              <w:spacing w:after="20"/>
+            </w:pPr>
+            <w:r>
+              <w:rPr>
+                <w:rFonts w:ascii="Arial" w:hAnsi="Arial"/>
+                <w:sz w:val="14"/>
+              </w:rPr>
               <w:t>Valid login</w:t>
             </w:r>
           </w:p>
@@ -23153,20 +24465,54 @@
         <w:tc>
           <w:tcPr>
             <w:tcW w:type="dxa" w:w="2340"/>
-          </w:tcPr>
-          <w:p>
-            <w:r>
-              <w:t>200</w:t>
+            <w:vAlign w:val="center"/>
+          </w:tcPr>
+          <w:p>
+            <w:pPr>
+              <w:spacing w:after="20"/>
+            </w:pPr>
+            <w:r>
+              <w:rPr>
+                <w:rFonts w:ascii="Arial" w:hAnsi="Arial"/>
+                <w:sz w:val="14"/>
+              </w:rPr>
+              <w:t>200 / token issued</w:t>
             </w:r>
           </w:p>
         </w:tc>
         <w:tc>
           <w:tcPr>
             <w:tcW w:type="dxa" w:w="2340"/>
-          </w:tcPr>
-          <w:p>
-            <w:r>
-              <w:t>200 E02, token redacted.</w:t>
+            <w:vAlign w:val="center"/>
+          </w:tcPr>
+          <w:p>
+            <w:pPr>
+              <w:spacing w:after="20"/>
+            </w:pPr>
+            <w:r>
+              <w:rPr>
+                <w:rFonts w:ascii="Arial" w:hAnsi="Arial"/>
+                <w:sz w:val="14"/>
+              </w:rPr>
+              <w:t>200 OK (E02; token redacted)</w:t>
+            </w:r>
+          </w:p>
+        </w:tc>
+        <w:tc>
+          <w:tcPr>
+            <w:tcW w:type="dxa" w:w="1800"/>
+            <w:vAlign w:val="center"/>
+          </w:tcPr>
+          <w:p>
+            <w:pPr>
+              <w:spacing w:after="20"/>
+            </w:pPr>
+            <w:r>
+              <w:rPr>
+                <w:rFonts w:ascii="Arial" w:hAnsi="Arial"/>
+                <w:sz w:val="14"/>
+              </w:rPr>
+              <w:t>PASS - screenshot</w:t>
             </w:r>
           </w:p>
         </w:tc>
@@ -23175,9 +24521,17 @@
         <w:tc>
           <w:tcPr>
             <w:tcW w:type="dxa" w:w="2340"/>
-          </w:tcPr>
-          <w:p>
-            <w:r>
+            <w:vAlign w:val="center"/>
+          </w:tcPr>
+          <w:p>
+            <w:pPr>
+              <w:spacing w:after="20"/>
+            </w:pPr>
+            <w:r>
+              <w:rPr>
+                <w:rFonts w:ascii="Arial" w:hAnsi="Arial"/>
+                <w:sz w:val="14"/>
+              </w:rPr>
               <w:t>4</w:t>
             </w:r>
           </w:p>
@@ -23185,9 +24539,17 @@
         <w:tc>
           <w:tcPr>
             <w:tcW w:type="dxa" w:w="2340"/>
-          </w:tcPr>
-          <w:p>
-            <w:r>
+            <w:vAlign w:val="center"/>
+          </w:tcPr>
+          <w:p>
+            <w:pPr>
+              <w:spacing w:after="20"/>
+            </w:pPr>
+            <w:r>
+              <w:rPr>
+                <w:rFonts w:ascii="Arial" w:hAnsi="Arial"/>
+                <w:sz w:val="14"/>
+              </w:rPr>
               <w:t>Valid authenticated request</w:t>
             </w:r>
           </w:p>
@@ -23195,9 +24557,17 @@
         <w:tc>
           <w:tcPr>
             <w:tcW w:type="dxa" w:w="2340"/>
-          </w:tcPr>
-          <w:p>
-            <w:r>
+            <w:vAlign w:val="center"/>
+          </w:tcPr>
+          <w:p>
+            <w:pPr>
+              <w:spacing w:after="20"/>
+            </w:pPr>
+            <w:r>
+              <w:rPr>
+                <w:rFonts w:ascii="Arial" w:hAnsi="Arial"/>
+                <w:sz w:val="14"/>
+              </w:rPr>
               <w:t>200</w:t>
             </w:r>
           </w:p>
@@ -23205,10 +24575,36 @@
         <w:tc>
           <w:tcPr>
             <w:tcW w:type="dxa" w:w="2340"/>
-          </w:tcPr>
-          <w:p>
-            <w:r>
-              <w:t>200 E04; /auth/me 200 E03.</w:t>
+            <w:vAlign w:val="center"/>
+          </w:tcPr>
+          <w:p>
+            <w:pPr>
+              <w:spacing w:after="20"/>
+            </w:pPr>
+            <w:r>
+              <w:rPr>
+                <w:rFonts w:ascii="Arial" w:hAnsi="Arial"/>
+                <w:sz w:val="14"/>
+              </w:rPr>
+              <w:t>200 OK protected response (E04); current user 200 (E03)</w:t>
+            </w:r>
+          </w:p>
+        </w:tc>
+        <w:tc>
+          <w:tcPr>
+            <w:tcW w:type="dxa" w:w="1800"/>
+            <w:vAlign w:val="center"/>
+          </w:tcPr>
+          <w:p>
+            <w:pPr>
+              <w:spacing w:after="20"/>
+            </w:pPr>
+            <w:r>
+              <w:rPr>
+                <w:rFonts w:ascii="Arial" w:hAnsi="Arial"/>
+                <w:sz w:val="14"/>
+              </w:rPr>
+              <w:t>PASS - screenshots</w:t>
             </w:r>
           </w:p>
         </w:tc>
@@ -23217,9 +24613,17 @@
         <w:tc>
           <w:tcPr>
             <w:tcW w:type="dxa" w:w="2340"/>
-          </w:tcPr>
-          <w:p>
-            <w:r>
+            <w:vAlign w:val="center"/>
+          </w:tcPr>
+          <w:p>
+            <w:pPr>
+              <w:spacing w:after="20"/>
+            </w:pPr>
+            <w:r>
+              <w:rPr>
+                <w:rFonts w:ascii="Arial" w:hAnsi="Arial"/>
+                <w:sz w:val="14"/>
+              </w:rPr>
               <w:t>5</w:t>
             </w:r>
           </w:p>
@@ -23227,19 +24631,35 @@
         <w:tc>
           <w:tcPr>
             <w:tcW w:type="dxa" w:w="2340"/>
-          </w:tcPr>
-          <w:p>
-            <w:r>
-              <w:t>Other user’s task</w:t>
+            <w:vAlign w:val="center"/>
+          </w:tcPr>
+          <w:p>
+            <w:pPr>
+              <w:spacing w:after="20"/>
+            </w:pPr>
+            <w:r>
+              <w:rPr>
+                <w:rFonts w:ascii="Arial" w:hAnsi="Arial"/>
+                <w:sz w:val="14"/>
+              </w:rPr>
+              <w:t>Other user task</w:t>
             </w:r>
           </w:p>
         </w:tc>
         <w:tc>
           <w:tcPr>
             <w:tcW w:type="dxa" w:w="2340"/>
-          </w:tcPr>
-          <w:p>
-            <w:r>
+            <w:vAlign w:val="center"/>
+          </w:tcPr>
+          <w:p>
+            <w:pPr>
+              <w:spacing w:after="20"/>
+            </w:pPr>
+            <w:r>
+              <w:rPr>
+                <w:rFonts w:ascii="Arial" w:hAnsi="Arial"/>
+                <w:sz w:val="14"/>
+              </w:rPr>
               <w:t>Denied</w:t>
             </w:r>
           </w:p>
@@ -23247,10 +24667,36 @@
         <w:tc>
           <w:tcPr>
             <w:tcW w:type="dxa" w:w="2340"/>
-          </w:tcPr>
-          <w:p>
-            <w:r>
-              <w:t>404 E15.</w:t>
+            <w:vAlign w:val="center"/>
+          </w:tcPr>
+          <w:p>
+            <w:pPr>
+              <w:spacing w:after="20"/>
+            </w:pPr>
+            <w:r>
+              <w:rPr>
+                <w:rFonts w:ascii="Arial" w:hAnsi="Arial"/>
+                <w:sz w:val="14"/>
+              </w:rPr>
+              <w:t>404 Not Found (E15)</w:t>
+            </w:r>
+          </w:p>
+        </w:tc>
+        <w:tc>
+          <w:tcPr>
+            <w:tcW w:type="dxa" w:w="1800"/>
+            <w:vAlign w:val="center"/>
+          </w:tcPr>
+          <w:p>
+            <w:pPr>
+              <w:spacing w:after="20"/>
+            </w:pPr>
+            <w:r>
+              <w:rPr>
+                <w:rFonts w:ascii="Arial" w:hAnsi="Arial"/>
+                <w:sz w:val="14"/>
+              </w:rPr>
+              <w:t>PASS - screenshot</w:t>
             </w:r>
           </w:p>
         </w:tc>
@@ -23259,9 +24705,17 @@
         <w:tc>
           <w:tcPr>
             <w:tcW w:type="dxa" w:w="2340"/>
-          </w:tcPr>
-          <w:p>
-            <w:r>
+            <w:vAlign w:val="center"/>
+          </w:tcPr>
+          <w:p>
+            <w:pPr>
+              <w:spacing w:after="20"/>
+            </w:pPr>
+            <w:r>
+              <w:rPr>
+                <w:rFonts w:ascii="Arial" w:hAnsi="Arial"/>
+                <w:sz w:val="14"/>
+              </w:rPr>
               <w:t>6</w:t>
             </w:r>
           </w:p>
@@ -23269,9 +24723,17 @@
         <w:tc>
           <w:tcPr>
             <w:tcW w:type="dxa" w:w="2340"/>
-          </w:tcPr>
-          <w:p>
-            <w:r>
+            <w:vAlign w:val="center"/>
+          </w:tcPr>
+          <w:p>
+            <w:pPr>
+              <w:spacing w:after="20"/>
+            </w:pPr>
+            <w:r>
+              <w:rPr>
+                <w:rFonts w:ascii="Arial" w:hAnsi="Arial"/>
+                <w:sz w:val="14"/>
+              </w:rPr>
               <w:t>Student admin operation</w:t>
             </w:r>
           </w:p>
@@ -23279,9 +24741,17 @@
         <w:tc>
           <w:tcPr>
             <w:tcW w:type="dxa" w:w="2340"/>
-          </w:tcPr>
-          <w:p>
-            <w:r>
+            <w:vAlign w:val="center"/>
+          </w:tcPr>
+          <w:p>
+            <w:pPr>
+              <w:spacing w:after="20"/>
+            </w:pPr>
+            <w:r>
+              <w:rPr>
+                <w:rFonts w:ascii="Arial" w:hAnsi="Arial"/>
+                <w:sz w:val="14"/>
+              </w:rPr>
               <w:t>403</w:t>
             </w:r>
           </w:p>
@@ -23289,10 +24759,36 @@
         <w:tc>
           <w:tcPr>
             <w:tcW w:type="dxa" w:w="2340"/>
-          </w:tcPr>
-          <w:p>
-            <w:r>
-              <w:t>403 E14.</w:t>
+            <w:vAlign w:val="center"/>
+          </w:tcPr>
+          <w:p>
+            <w:pPr>
+              <w:spacing w:after="20"/>
+            </w:pPr>
+            <w:r>
+              <w:rPr>
+                <w:rFonts w:ascii="Arial" w:hAnsi="Arial"/>
+                <w:sz w:val="14"/>
+              </w:rPr>
+              <w:t>403 Forbidden (E14)</w:t>
+            </w:r>
+          </w:p>
+        </w:tc>
+        <w:tc>
+          <w:tcPr>
+            <w:tcW w:type="dxa" w:w="1800"/>
+            <w:vAlign w:val="center"/>
+          </w:tcPr>
+          <w:p>
+            <w:pPr>
+              <w:spacing w:after="20"/>
+            </w:pPr>
+            <w:r>
+              <w:rPr>
+                <w:rFonts w:ascii="Arial" w:hAnsi="Arial"/>
+                <w:sz w:val="14"/>
+              </w:rPr>
+              <w:t>PASS - screenshot</w:t>
             </w:r>
           </w:p>
         </w:tc>
@@ -23301,9 +24797,17 @@
         <w:tc>
           <w:tcPr>
             <w:tcW w:type="dxa" w:w="2340"/>
-          </w:tcPr>
-          <w:p>
-            <w:r>
+            <w:vAlign w:val="center"/>
+          </w:tcPr>
+          <w:p>
+            <w:pPr>
+              <w:spacing w:after="20"/>
+            </w:pPr>
+            <w:r>
+              <w:rPr>
+                <w:rFonts w:ascii="Arial" w:hAnsi="Arial"/>
+                <w:sz w:val="14"/>
+              </w:rPr>
               <w:t>7</w:t>
             </w:r>
           </w:p>
@@ -23311,9 +24815,17 @@
         <w:tc>
           <w:tcPr>
             <w:tcW w:type="dxa" w:w="2340"/>
-          </w:tcPr>
-          <w:p>
-            <w:r>
+            <w:vAlign w:val="center"/>
+          </w:tcPr>
+          <w:p>
+            <w:pPr>
+              <w:spacing w:after="20"/>
+            </w:pPr>
+            <w:r>
+              <w:rPr>
+                <w:rFonts w:ascii="Arial" w:hAnsi="Arial"/>
+                <w:sz w:val="14"/>
+              </w:rPr>
               <w:t>Modified JWT</w:t>
             </w:r>
           </w:p>
@@ -23321,9 +24833,17 @@
         <w:tc>
           <w:tcPr>
             <w:tcW w:type="dxa" w:w="2340"/>
-          </w:tcPr>
-          <w:p>
-            <w:r>
+            <w:vAlign w:val="center"/>
+          </w:tcPr>
+          <w:p>
+            <w:pPr>
+              <w:spacing w:after="20"/>
+            </w:pPr>
+            <w:r>
+              <w:rPr>
+                <w:rFonts w:ascii="Arial" w:hAnsi="Arial"/>
+                <w:sz w:val="14"/>
+              </w:rPr>
               <w:t>401</w:t>
             </w:r>
           </w:p>
@@ -23331,10 +24851,36 @@
         <w:tc>
           <w:tcPr>
             <w:tcW w:type="dxa" w:w="2340"/>
-          </w:tcPr>
-          <w:p>
-            <w:r>
-              <w:t>401 E12.</w:t>
+            <w:vAlign w:val="center"/>
+          </w:tcPr>
+          <w:p>
+            <w:pPr>
+              <w:spacing w:after="20"/>
+            </w:pPr>
+            <w:r>
+              <w:rPr>
+                <w:rFonts w:ascii="Arial" w:hAnsi="Arial"/>
+                <w:sz w:val="14"/>
+              </w:rPr>
+              <w:t>401 Unauthorized (E12)</w:t>
+            </w:r>
+          </w:p>
+        </w:tc>
+        <w:tc>
+          <w:tcPr>
+            <w:tcW w:type="dxa" w:w="1800"/>
+            <w:vAlign w:val="center"/>
+          </w:tcPr>
+          <w:p>
+            <w:pPr>
+              <w:spacing w:after="20"/>
+            </w:pPr>
+            <w:r>
+              <w:rPr>
+                <w:rFonts w:ascii="Arial" w:hAnsi="Arial"/>
+                <w:sz w:val="14"/>
+              </w:rPr>
+              <w:t>PASS - screenshot</w:t>
             </w:r>
           </w:p>
         </w:tc>
@@ -23343,9 +24889,17 @@
         <w:tc>
           <w:tcPr>
             <w:tcW w:type="dxa" w:w="2340"/>
-          </w:tcPr>
-          <w:p>
-            <w:r>
+            <w:vAlign w:val="center"/>
+          </w:tcPr>
+          <w:p>
+            <w:pPr>
+              <w:spacing w:after="20"/>
+            </w:pPr>
+            <w:r>
+              <w:rPr>
+                <w:rFonts w:ascii="Arial" w:hAnsi="Arial"/>
+                <w:sz w:val="14"/>
+              </w:rPr>
               <w:t>8</w:t>
             </w:r>
           </w:p>
@@ -23353,9 +24907,17 @@
         <w:tc>
           <w:tcPr>
             <w:tcW w:type="dxa" w:w="2340"/>
-          </w:tcPr>
-          <w:p>
-            <w:r>
+            <w:vAlign w:val="center"/>
+          </w:tcPr>
+          <w:p>
+            <w:pPr>
+              <w:spacing w:after="20"/>
+            </w:pPr>
+            <w:r>
+              <w:rPr>
+                <w:rFonts w:ascii="Arial" w:hAnsi="Arial"/>
+                <w:sz w:val="14"/>
+              </w:rPr>
               <w:t>Expired JWT</w:t>
             </w:r>
           </w:p>
@@ -23363,9 +24925,17 @@
         <w:tc>
           <w:tcPr>
             <w:tcW w:type="dxa" w:w="2340"/>
-          </w:tcPr>
-          <w:p>
-            <w:r>
+            <w:vAlign w:val="center"/>
+          </w:tcPr>
+          <w:p>
+            <w:pPr>
+              <w:spacing w:after="20"/>
+            </w:pPr>
+            <w:r>
+              <w:rPr>
+                <w:rFonts w:ascii="Arial" w:hAnsi="Arial"/>
+                <w:sz w:val="14"/>
+              </w:rPr>
               <w:t>401</w:t>
             </w:r>
           </w:p>
@@ -23373,10 +24943,36 @@
         <w:tc>
           <w:tcPr>
             <w:tcW w:type="dxa" w:w="2340"/>
-          </w:tcPr>
-          <w:p>
-            <w:r>
-              <w:t>No Postman evidence; automated test source has assertion, not rerun for this document.</w:t>
+            <w:vAlign w:val="center"/>
+          </w:tcPr>
+          <w:p>
+            <w:pPr>
+              <w:spacing w:after="20"/>
+            </w:pPr>
+            <w:r>
+              <w:rPr>
+                <w:rFonts w:ascii="Arial" w:hAnsi="Arial"/>
+                <w:sz w:val="14"/>
+              </w:rPr>
+              <w:t>No expired-token Postman result supplied</w:t>
+            </w:r>
+          </w:p>
+        </w:tc>
+        <w:tc>
+          <w:tcPr>
+            <w:tcW w:type="dxa" w:w="1800"/>
+            <w:vAlign w:val="center"/>
+          </w:tcPr>
+          <w:p>
+            <w:pPr>
+              <w:spacing w:after="20"/>
+            </w:pPr>
+            <w:r>
+              <w:rPr>
+                <w:rFonts w:ascii="Arial" w:hAnsi="Arial"/>
+                <w:sz w:val="14"/>
+              </w:rPr>
+              <w:t>NOT TESTED - no evidence</w:t>
             </w:r>
           </w:p>
         </w:tc>
@@ -23385,9 +24981,17 @@
         <w:tc>
           <w:tcPr>
             <w:tcW w:type="dxa" w:w="2340"/>
-          </w:tcPr>
-          <w:p>
-            <w:r>
+            <w:vAlign w:val="center"/>
+          </w:tcPr>
+          <w:p>
+            <w:pPr>
+              <w:spacing w:after="20"/>
+            </w:pPr>
+            <w:r>
+              <w:rPr>
+                <w:rFonts w:ascii="Arial" w:hAnsi="Arial"/>
+                <w:sz w:val="14"/>
+              </w:rPr>
               <w:t>9</w:t>
             </w:r>
           </w:p>
@@ -23395,30 +24999,72 @@
         <w:tc>
           <w:tcPr>
             <w:tcW w:type="dxa" w:w="2340"/>
-          </w:tcPr>
-          <w:p>
-            <w:r>
-              <w:t>Logout then protected request</w:t>
+            <w:vAlign w:val="center"/>
+          </w:tcPr>
+          <w:p>
+            <w:pPr>
+              <w:spacing w:after="20"/>
+            </w:pPr>
+            <w:r>
+              <w:rPr>
+                <w:rFonts w:ascii="Arial" w:hAnsi="Arial"/>
+                <w:sz w:val="14"/>
+              </w:rPr>
+              <w:t>Logout then protected resource</w:t>
             </w:r>
           </w:p>
         </w:tc>
         <w:tc>
           <w:tcPr>
             <w:tcW w:type="dxa" w:w="2340"/>
-          </w:tcPr>
-          <w:p>
-            <w:r>
-              <w:t>Logout success, then 401</w:t>
+            <w:vAlign w:val="center"/>
+          </w:tcPr>
+          <w:p>
+            <w:pPr>
+              <w:spacing w:after="20"/>
+            </w:pPr>
+            <w:r>
+              <w:rPr>
+                <w:rFonts w:ascii="Arial" w:hAnsi="Arial"/>
+                <w:sz w:val="14"/>
+              </w:rPr>
+              <w:t>Logout success then 401</w:t>
             </w:r>
           </w:p>
         </w:tc>
         <w:tc>
           <w:tcPr>
             <w:tcW w:type="dxa" w:w="2340"/>
-          </w:tcPr>
-          <w:p>
-            <w:r>
-              <w:t>200 E16; 401 E17.</w:t>
+            <w:vAlign w:val="center"/>
+          </w:tcPr>
+          <w:p>
+            <w:pPr>
+              <w:spacing w:after="20"/>
+            </w:pPr>
+            <w:r>
+              <w:rPr>
+                <w:rFonts w:ascii="Arial" w:hAnsi="Arial"/>
+                <w:sz w:val="14"/>
+              </w:rPr>
+              <w:t>Logout 200; revoked-token 401 (E16,E17)</w:t>
+            </w:r>
+          </w:p>
+        </w:tc>
+        <w:tc>
+          <w:tcPr>
+            <w:tcW w:type="dxa" w:w="1800"/>
+            <w:vAlign w:val="center"/>
+          </w:tcPr>
+          <w:p>
+            <w:pPr>
+              <w:spacing w:after="20"/>
+            </w:pPr>
+            <w:r>
+              <w:rPr>
+                <w:rFonts w:ascii="Arial" w:hAnsi="Arial"/>
+                <w:sz w:val="14"/>
+              </w:rPr>
+              <w:t>PASS - screenshots</w:t>
             </w:r>
           </w:p>
         </w:tc>
@@ -23427,9 +25073,17 @@
         <w:tc>
           <w:tcPr>
             <w:tcW w:type="dxa" w:w="2340"/>
-          </w:tcPr>
-          <w:p>
-            <w:r>
+            <w:vAlign w:val="center"/>
+          </w:tcPr>
+          <w:p>
+            <w:pPr>
+              <w:spacing w:after="20"/>
+            </w:pPr>
+            <w:r>
+              <w:rPr>
+                <w:rFonts w:ascii="Arial" w:hAnsi="Arial"/>
+                <w:sz w:val="14"/>
+              </w:rPr>
               <w:t>10</w:t>
             </w:r>
           </w:p>
@@ -23437,9 +25091,17 @@
         <w:tc>
           <w:tcPr>
             <w:tcW w:type="dxa" w:w="2340"/>
-          </w:tcPr>
-          <w:p>
-            <w:r>
+            <w:vAlign w:val="center"/>
+          </w:tcPr>
+          <w:p>
+            <w:pPr>
+              <w:spacing w:after="20"/>
+            </w:pPr>
+            <w:r>
+              <w:rPr>
+                <w:rFonts w:ascii="Arial" w:hAnsi="Arial"/>
+                <w:sz w:val="14"/>
+              </w:rPr>
               <w:t>Invalid input</w:t>
             </w:r>
           </w:p>
@@ -23447,9 +25109,17 @@
         <w:tc>
           <w:tcPr>
             <w:tcW w:type="dxa" w:w="2340"/>
-          </w:tcPr>
-          <w:p>
-            <w:r>
+            <w:vAlign w:val="center"/>
+          </w:tcPr>
+          <w:p>
+            <w:pPr>
+              <w:spacing w:after="20"/>
+            </w:pPr>
+            <w:r>
+              <w:rPr>
+                <w:rFonts w:ascii="Arial" w:hAnsi="Arial"/>
+                <w:sz w:val="14"/>
+              </w:rPr>
               <w:t>4xx</w:t>
             </w:r>
           </w:p>
@@ -23457,10 +25127,128 @@
         <w:tc>
           <w:tcPr>
             <w:tcW w:type="dxa" w:w="2340"/>
-          </w:tcPr>
-          <w:p>
-            <w:r>
-              <w:t>400 E10.</w:t>
+            <w:vAlign w:val="center"/>
+          </w:tcPr>
+          <w:p>
+            <w:pPr>
+              <w:spacing w:after="20"/>
+            </w:pPr>
+            <w:r>
+              <w:rPr>
+                <w:rFonts w:ascii="Arial" w:hAnsi="Arial"/>
+                <w:sz w:val="14"/>
+              </w:rPr>
+              <w:t>400 Bad Request (E10)</w:t>
+            </w:r>
+          </w:p>
+        </w:tc>
+        <w:tc>
+          <w:tcPr>
+            <w:tcW w:type="dxa" w:w="1800"/>
+            <w:vAlign w:val="center"/>
+          </w:tcPr>
+          <w:p>
+            <w:pPr>
+              <w:spacing w:after="20"/>
+            </w:pPr>
+            <w:r>
+              <w:rPr>
+                <w:rFonts w:ascii="Arial" w:hAnsi="Arial"/>
+                <w:sz w:val="14"/>
+              </w:rPr>
+              <w:t>PASS - screenshot</w:t>
+            </w:r>
+          </w:p>
+        </w:tc>
+      </w:tr>
+      <w:tr>
+        <w:tc>
+          <w:tcPr>
+            <w:tcW w:type="dxa" w:w="2340"/>
+            <w:vAlign w:val="center"/>
+          </w:tcPr>
+          <w:p>
+            <w:pPr>
+              <w:spacing w:after="20"/>
+            </w:pPr>
+            <w:r>
+              <w:rPr>
+                <w:rFonts w:ascii="Arial" w:hAnsi="Arial"/>
+                <w:sz w:val="14"/>
+              </w:rPr>
+              <w:t>11</w:t>
+            </w:r>
+          </w:p>
+        </w:tc>
+        <w:tc>
+          <w:tcPr>
+            <w:tcW w:type="dxa" w:w="2340"/>
+            <w:vAlign w:val="center"/>
+          </w:tcPr>
+          <w:p>
+            <w:pPr>
+              <w:spacing w:after="20"/>
+            </w:pPr>
+            <w:r>
+              <w:rPr>
+                <w:rFonts w:ascii="Arial" w:hAnsi="Arial"/>
+                <w:sz w:val="14"/>
+              </w:rPr>
+              <w:t>Administrator access with valid admin token</w:t>
+            </w:r>
+          </w:p>
+        </w:tc>
+        <w:tc>
+          <w:tcPr>
+            <w:tcW w:type="dxa" w:w="2340"/>
+            <w:vAlign w:val="center"/>
+          </w:tcPr>
+          <w:p>
+            <w:pPr>
+              <w:spacing w:after="20"/>
+            </w:pPr>
+            <w:r>
+              <w:rPr>
+                <w:rFonts w:ascii="Arial" w:hAnsi="Arial"/>
+                <w:sz w:val="14"/>
+              </w:rPr>
+              <w:t>200 OK for configured admin</w:t>
+            </w:r>
+          </w:p>
+        </w:tc>
+        <w:tc>
+          <w:tcPr>
+            <w:tcW w:type="dxa" w:w="2340"/>
+            <w:vAlign w:val="center"/>
+          </w:tcPr>
+          <w:p>
+            <w:pPr>
+              <w:spacing w:after="20"/>
+            </w:pPr>
+            <w:r>
+              <w:rPr>
+                <w:rFonts w:ascii="Arial" w:hAnsi="Arial"/>
+                <w:sz w:val="14"/>
+              </w:rPr>
+              <w:t>No successful admin response supplied. Reported admin-login 401 and unauthenticated-route 401 are not proof of admin authorization.</w:t>
+            </w:r>
+          </w:p>
+        </w:tc>
+        <w:tc>
+          <w:tcPr>
+            <w:tcW w:type="dxa" w:w="1800"/>
+            <w:vAlign w:val="center"/>
+          </w:tcPr>
+          <w:p>
+            <w:pPr>
+              <w:spacing w:after="20"/>
+            </w:pPr>
+            <w:r>
+              <w:rPr>
+                <w:rFonts w:ascii="Arial" w:hAnsi="Arial"/>
+                <w:sz w:val="14"/>
+              </w:rPr>
+              <w:t>NOT TESTED / NOT CAPTURED</w:t>
             </w:r>
           </w:p>
         </w:tc>
@@ -23542,7 +25330,7 @@
           </w:tcPr>
           <w:p>
             <w:r>
-              <w:t>Register/login are public; /auth/me, logout, protected/task/profile/user routes require JWT; admin route requires admin role.</w:t>
+              <w:t>See the endpoint-by-endpoint inventory in Part J above. Registration/login and health are public; /auth/me, logout, protected, profile and task routes require a valid JWT; user and admin operations additionally enforce owner/admin roles.</w:t>
             </w:r>
           </w:p>
         </w:tc>
@@ -23564,7 +25352,7 @@
           </w:tcPr>
           <w:p>
             <w:r>
-              <w:t>Students access their own tasks/profile; admin can access broader records and admin operations.</w:t>
+              <w:t>The server permits each authenticated student to access their own profile/tasks; an administrator may perform the documented broader operations. Task ownership comes from req.user, not a client-supplied ownerId.</w:t>
             </w:r>
           </w:p>
         </w:tc>
@@ -23586,7 +25374,7 @@
           </w:tcPr>
           <w:p>
             <w:r>
-              <w:t>Protected route returns 401 (E09).</w:t>
+              <w:t>Protected requests without a bearer token return 401; E09 captures /api/protected.</w:t>
             </w:r>
           </w:p>
         </w:tc>
@@ -23608,7 +25396,7 @@
           </w:tcPr>
           <w:p>
             <w:r>
-              <w:t>Student admin route returns 403; other student task returns 404 (E14/E15).</w:t>
+              <w:t>A student calling the admin route receives 403 (E14); a second student reading another user task receives 404 (E15). Successful admin access has no supplied screenshot.</w:t>
             </w:r>
           </w:p>
         </w:tc>
@@ -23630,7 +25418,7 @@
           </w:tcPr>
           <w:p>
             <w:r>
-              <w:t>Invalid registration/task data and malformed JSON return 4xx; invalid/modified token returns 401 (E10/E12/E13).</w:t>
+              <w:t>Invalid registration returns 400 (E10); wrong credentials return 401 (E11); modified/malformed JWTs return 401 (E12/E13). No expired-token Postman result was supplied.</w:t>
             </w:r>
           </w:p>
         </w:tc>
@@ -23652,7 +25440,7 @@
           </w:tcPr>
           <w:p>
             <w:r>
-              <w:t>Check passwords, hashes, signing secret and unnecessary claims; treat the bearer token itself as secret.</w:t>
+              <w:t>Responses must not reveal plaintext passwords, passwordHash or signing secrets. The bearer token is itself sensitive; E02 has it covered. There is no persistent database/hash-inspection screenshot.</w:t>
             </w:r>
           </w:p>
         </w:tc>
@@ -23674,7 +25462,7 @@
           </w:tcPr>
           <w:p>
             <w:r>
-              <w:t>Use positive and negative Postman/automated cases, record statuses and sanitize screenshots. Expiry and admin-success Postman proof remain missing.</w:t>
+              <w:t>Use positive and negative Postman requests, record expected and actual status/evidence, and sanitize captures. E01-E17 document the supplied cases. Expired-token and successful-admin Postman cases remain uncaptured/not tested.</w:t>
             </w:r>
           </w:p>
         </w:tc>
@@ -23778,7 +25566,7 @@
           </w:tcPr>
           <w:p>
             <w:r>
-              <w:t>E01, 201.</w:t>
+              <w:t>E01, 201; E10 invalid registration, 400.</w:t>
             </w:r>
           </w:p>
         </w:tc>
@@ -23788,7 +25576,7 @@
           </w:tcPr>
           <w:p>
             <w:r>
-              <w:t>Shows API success.</w:t>
+              <w:t>Supplied safe Postman captures.</w:t>
             </w:r>
           </w:p>
         </w:tc>
@@ -23810,7 +25598,7 @@
           </w:tcPr>
           <w:p>
             <w:r>
-              <w:t>Source and test references: server.js bcrypt.hash; store.js passwordHash.</w:t>
+              <w:t>Source: server.js hashes with bcrypt (12 rounds) and store.js holds passwordHash in memory; test source asserts response omission.</w:t>
             </w:r>
           </w:p>
         </w:tc>
@@ -23820,7 +25608,7 @@
           </w:tcPr>
           <w:p>
             <w:r>
-              <w:t>No persistent DB or screenshot of stored hash.</w:t>
+              <w:t>No persistent database and no stored-hash screenshot; this is not database evidence.</w:t>
             </w:r>
           </w:p>
         </w:tc>
@@ -23842,7 +25630,7 @@
           </w:tcPr>
           <w:p>
             <w:r>
-              <w:t>E02, 200.</w:t>
+              <w:t>E02, 200; evidence copy redacts the full bearer token.</w:t>
             </w:r>
           </w:p>
         </w:tc>
@@ -23852,7 +25640,7 @@
           </w:tcPr>
           <w:p>
             <w:r>
-              <w:t>Bearer token blacked out in copied image.</w:t>
+              <w:t>Raw token screenshot intentionally excluded.</w:t>
             </w:r>
           </w:p>
         </w:tc>
@@ -23874,7 +25662,7 @@
           </w:tcPr>
           <w:p>
             <w:r>
-              <w:t>E09 401 and E04 200.</w:t>
+              <w:t>E09, 401 without token; E04, 200 authenticated.</w:t>
             </w:r>
           </w:p>
         </w:tc>
@@ -23884,7 +25672,7 @@
           </w:tcPr>
           <w:p>
             <w:r>
-              <w:t>Both statuses captured.</w:t>
+              <w:t>Both supplied screenshots.</w:t>
             </w:r>
           </w:p>
         </w:tc>
@@ -23906,7 +25694,7 @@
           </w:tcPr>
           <w:p>
             <w:r>
-              <w:t>E14 403 and E15 404.</w:t>
+              <w:t>E14 student-to-admin 403; E15 other student task 404.</w:t>
             </w:r>
           </w:p>
         </w:tc>
@@ -23916,7 +25704,7 @@
           </w:tcPr>
           <w:p>
             <w:r>
-              <w:t>No successful admin screenshot.</w:t>
+              <w:t>No successful admin-route evidence; do not infer it from denial or admin-login failure.</w:t>
             </w:r>
           </w:p>
         </w:tc>
@@ -23938,7 +25726,7 @@
           </w:tcPr>
           <w:p>
             <w:r>
-              <w:t>E10 400; E12/E13 401.</w:t>
+              <w:t>E10 400 validation; E11 401 wrong credentials; E12 modified JWT 401; E13 malformed JWT 401.</w:t>
             </w:r>
           </w:p>
         </w:tc>
@@ -23948,7 +25736,7 @@
           </w:tcPr>
           <w:p>
             <w:r>
-              <w:t>No expired-token Postman capture.</w:t>
+              <w:t>No expired-token Postman capture/test result supplied with this submission.</w:t>
             </w:r>
           </w:p>
         </w:tc>
@@ -23970,7 +25758,7 @@
           </w:tcPr>
           <w:p>
             <w:r>
-              <w:t>secure-api/src and secure-api/test.</w:t>
+              <w:t>secure-api/src, secure-api/test, Postman collection and README.</w:t>
             </w:r>
           </w:p>
         </w:tc>
@@ -23980,7 +25768,7 @@
           </w:tcPr>
           <w:p>
             <w:r>
-              <w:t>Committed implementation.</w:t>
+              <w:t>Automated test assertions are not represented as a test run in this document.</w:t>
             </w:r>
           </w:p>
         </w:tc>
@@ -24462,7 +26250,7 @@
           </w:tcPr>
           <w:p>
             <w:r>
-              <w:t>README documents no persistent database/schema; in-memory arrays only. A real DB is unmet if required.</w:t>
+              <w:t>No database or schema/migration: secure-api/src/store.js uses in-memory arrays for users, profiles, tasks and revoked token IDs; process restart clears data. No external DB dependency.</w:t>
             </w:r>
           </w:p>
         </w:tc>
@@ -24506,7 +26294,7 @@
           </w:tcPr>
           <w:p>
             <w:r>
-              <w:t>E01–E04 and E11; token redacted.</w:t>
+              <w:t>E01-E04 and E11; E02 token redacted. Supplied screenshots only.</w:t>
             </w:r>
           </w:p>
         </w:tc>
@@ -24528,7 +26316,7 @@
           </w:tcPr>
           <w:p>
             <w:r>
-              <w:t>E14/E15 show denials; successful admin access not captured.</w:t>
+              <w:t>E14/E15 demonstrate denied student actions; successful admin authorization was not captured.</w:t>
             </w:r>
           </w:p>
         </w:tc>
@@ -24550,7 +26338,7 @@
           </w:tcPr>
           <w:p>
             <w:r>
-              <w:t>E09–E17 plus E10–E13; expired-token Postman proof missing.</w:t>
+              <w:t>Safe screenshots E01-E17 only. Expired-token Postman response and successful-admin response are absent; stored-hash inspection is absent.</w:t>
             </w:r>
           </w:p>
         </w:tc>
@@ -24638,7 +26426,7 @@
           </w:tcPr>
           <w:p>
             <w:r>
-              <w:t>Draft answers in Parts H/M; personal statements must be revised honestly.</w:t>
+              <w:t>Draft analysis is in Parts H/M; source assertions are distinguished from executed test results, and personal reflection requires the student?s own revision.</w:t>
             </w:r>
           </w:p>
         </w:tc>
@@ -24655,7 +26443,7 @@
     </w:p>
     <w:p>
       <w:r>
-        <w:t>The repository adapts the suggested structure to the existing project: secure-api/src/server.js has routes; src/middleware/auth.js handles JWT authentication/role authorization; src/store.js holds in-memory data; secure-api/test/auth-tasks.test.js has integration checks; postman/ contains the collection; README documents setup. vulnerable-api and session-api remain separate teaching demos. The lab allows adapting structure to the Week 5 project.</w:t>
+        <w:t>The repository adapts the suggested layout: secure-api/src/server.js contains Express routes and request handling; secure-api/src/middleware/auth.js contains JWT authentication and role middleware; secure-api/src/store.js is the in-memory store; secure-api/test/auth-tasks.test.js contains Node test-runner integration checks; postman/CBE204-Week06-Security.postman_collection.json contains the request collection; README.md describes setup, endpoints and limitations. session-api/ is a separate session/cookie classroom example, and vulnerable-api/ is intentionally insecure teaching material, not the secure submission. submission/CBE204_Week6_Lab_Sheet_Completed_DRAFT.docx is the answer copy and submission/evidence/E01.png-E17.png are the sanitized screenshots referenced by its index. There is no persistent database, schema/migration directory, front-end app or separate personal-reflection file. This adapts the suggested structure to the existing project; the cheat sheet is guidance, not an additional deliverable.</w:t>
       </w:r>
     </w:p>
     <w:p>

</xml_diff>

<commit_message>
Integrate lab answers with verified evidence status
Co-authored-by: Copilot App <223556219+Copilot@users.noreply.github.com>
</commit_message>
<xml_diff>
--- a/submission/CBE204_Week6_Lab_Sheet_Completed_DRAFT.docx
+++ b/submission/CBE204_Week6_Lab_Sheet_Completed_DRAFT.docx
@@ -1730,14 +1730,9 @@
             <w:hideMark/>
           </w:tcPr>
           <w:p>
-            <w:pPr>
-              <w:rPr>
-                <w:rFonts w:ascii="Times New Roman" w:eastAsia="Times New Roman" w:hAnsi="Times New Roman" w:cs="Times New Roman"/>
-                <w:kern w:val="0"/>
-                <w:szCs w:val="24"/>
-                <w14:ligatures w14:val="none"/>
-              </w:rPr>
-            </w:pPr>
+            <w:r>
+              <w:t>Authentication</w:t>
+            </w:r>
           </w:p>
         </w:tc>
       </w:tr>
@@ -1802,14 +1797,9 @@
             <w:hideMark/>
           </w:tcPr>
           <w:p>
-            <w:pPr>
-              <w:rPr>
-                <w:rFonts w:ascii="Times New Roman" w:eastAsia="Times New Roman" w:hAnsi="Times New Roman" w:cs="Times New Roman"/>
-                <w:kern w:val="0"/>
-                <w:szCs w:val="24"/>
-                <w14:ligatures w14:val="none"/>
-              </w:rPr>
-            </w:pPr>
+            <w:r>
+              <w:t>Authorization</w:t>
+            </w:r>
           </w:p>
         </w:tc>
       </w:tr>
@@ -1874,14 +1864,9 @@
             <w:hideMark/>
           </w:tcPr>
           <w:p>
-            <w:pPr>
-              <w:rPr>
-                <w:rFonts w:ascii="Times New Roman" w:eastAsia="Times New Roman" w:hAnsi="Times New Roman" w:cs="Times New Roman"/>
-                <w:kern w:val="0"/>
-                <w:szCs w:val="24"/>
-                <w14:ligatures w14:val="none"/>
-              </w:rPr>
-            </w:pPr>
+            <w:r>
+              <w:t>Authentication</w:t>
+            </w:r>
           </w:p>
         </w:tc>
       </w:tr>
@@ -1946,14 +1931,9 @@
             <w:hideMark/>
           </w:tcPr>
           <w:p>
-            <w:pPr>
-              <w:rPr>
-                <w:rFonts w:ascii="Times New Roman" w:eastAsia="Times New Roman" w:hAnsi="Times New Roman" w:cs="Times New Roman"/>
-                <w:kern w:val="0"/>
-                <w:szCs w:val="24"/>
-                <w14:ligatures w14:val="none"/>
-              </w:rPr>
-            </w:pPr>
+            <w:r>
+              <w:t>Authorization</w:t>
+            </w:r>
           </w:p>
         </w:tc>
       </w:tr>
@@ -2018,14 +1998,9 @@
             <w:hideMark/>
           </w:tcPr>
           <w:p>
-            <w:pPr>
-              <w:rPr>
-                <w:rFonts w:ascii="Times New Roman" w:eastAsia="Times New Roman" w:hAnsi="Times New Roman" w:cs="Times New Roman"/>
-                <w:kern w:val="0"/>
-                <w:szCs w:val="24"/>
-                <w14:ligatures w14:val="none"/>
-              </w:rPr>
-            </w:pPr>
+            <w:r>
+              <w:t>Authorization</w:t>
+            </w:r>
           </w:p>
         </w:tc>
       </w:tr>
@@ -2090,14 +2065,9 @@
             <w:hideMark/>
           </w:tcPr>
           <w:p>
-            <w:pPr>
-              <w:rPr>
-                <w:rFonts w:ascii="Times New Roman" w:eastAsia="Times New Roman" w:hAnsi="Times New Roman" w:cs="Times New Roman"/>
-                <w:kern w:val="0"/>
-                <w:szCs w:val="24"/>
-                <w14:ligatures w14:val="none"/>
-              </w:rPr>
-            </w:pPr>
+            <w:r>
+              <w:t>Authentication state management (logout invalidates current state).</w:t>
+            </w:r>
           </w:p>
         </w:tc>
       </w:tr>
@@ -8483,6 +8453,7 @@
         <w:gridCol w:w="3513"/>
         <w:gridCol w:w="3913"/>
         <w:gridCol w:w="1918"/>
+        <w:gridCol w:w="2600"/>
       </w:tblGrid>
       <w:tr>
         <w:trPr>
@@ -8624,6 +8595,16 @@
             </w:r>
           </w:p>
         </w:tc>
+        <w:tc>
+          <w:tcPr>
+            <w:tcW w:type="dxa" w:w="2600"/>
+          </w:tcPr>
+          <w:p>
+            <w:r>
+              <w:t>Observed / evidence status</w:t>
+            </w:r>
+          </w:p>
+        </w:tc>
       </w:tr>
       <w:tr>
         <w:tc>
@@ -8746,6 +8727,16 @@
             </w:r>
           </w:p>
         </w:tc>
+        <w:tc>
+          <w:tcPr>
+            <w:tcW w:type="dxa" w:w="2600"/>
+          </w:tcPr>
+          <w:p>
+            <w:r>
+              <w:t>Implemented; /auth/me 200 (E03). No dedicated profile-route screenshot.</w:t>
+            </w:r>
+          </w:p>
+        </w:tc>
       </w:tr>
       <w:tr>
         <w:tc>
@@ -8868,6 +8859,16 @@
             </w:r>
           </w:p>
         </w:tc>
+        <w:tc>
+          <w:tcPr>
+            <w:tcW w:type="dxa" w:w="2600"/>
+          </w:tcPr>
+          <w:p>
+            <w:r>
+              <w:t>403 Forbidden for student (E14).</w:t>
+            </w:r>
+          </w:p>
+        </w:tc>
       </w:tr>
       <w:tr>
         <w:tc>
@@ -8990,6 +8991,16 @@
             </w:r>
           </w:p>
         </w:tc>
+        <w:tc>
+          <w:tcPr>
+            <w:tcW w:type="dxa" w:w="2600"/>
+          </w:tcPr>
+          <w:p>
+            <w:r>
+              <w:t>Not tested: supplied admin login attempt returned 401; no valid admin token or admin-route success was demonstrated.</w:t>
+            </w:r>
+          </w:p>
+        </w:tc>
       </w:tr>
       <w:tr>
         <w:tc>
@@ -9109,6 +9120,16 @@
                 <w14:ligatures w14:val="none"/>
               </w:rPr>
               <w:t>Denied</w:t>
+            </w:r>
+          </w:p>
+        </w:tc>
+        <w:tc>
+          <w:tcPr>
+            <w:tcW w:type="dxa" w:w="2600"/>
+          </w:tcPr>
+          <w:p>
+            <w:r>
+              <w:t>401 Unauthorized (E09).</w:t>
             </w:r>
           </w:p>
         </w:tc>
@@ -11206,20 +11227,12 @@
           </w:tcPr>
           <w:p>
             <w:pPr>
-              <w:spacing w:before="100" w:beforeAutospacing="1" w:after="100" w:afterAutospacing="1"/>
+              <w:spacing w:after="20"/>
+            </w:pPr>
+            <w:r>
               <w:rPr>
-                <w:rFonts w:ascii="Times New Roman" w:eastAsia="Times New Roman" w:hAnsi="Times New Roman" w:cs="Times New Roman"/>
-                <w:kern w:val="0"/>
-                <w:szCs w:val="24"/>
-                <w14:ligatures w14:val="none"/>
-              </w:rPr>
-            </w:pPr>
-            <w:r>
-              <w:rPr>
-                <w:rFonts w:ascii="Times New Roman" w:eastAsia="Times New Roman" w:hAnsi="Times New Roman" w:cs="Times New Roman"/>
-                <w:kern w:val="0"/>
-                <w:szCs w:val="24"/>
-                <w14:ligatures w14:val="none"/>
+                <w:rFonts w:ascii="Arial" w:hAnsi="Arial"/>
+                <w:sz w:val="14"/>
               </w:rPr>
               <w:t>Plaintext passwords</w:t>
             </w:r>
@@ -11246,13 +11259,15 @@
           </w:tcPr>
           <w:p>
             <w:pPr>
+              <w:spacing w:after="20"/>
+            </w:pPr>
+            <w:r>
               <w:rPr>
-                <w:rFonts w:ascii="Times New Roman" w:eastAsia="Times New Roman" w:hAnsi="Times New Roman" w:cs="Times New Roman"/>
-                <w:kern w:val="0"/>
-                <w:szCs w:val="24"/>
-                <w14:ligatures w14:val="none"/>
+                <w:rFonts w:ascii="Arial" w:hAnsi="Arial"/>
+                <w:sz w:val="14"/>
               </w:rPr>
-            </w:pPr>
+              <w:t>If a credential store contains raw passwords, a breach directly exposes reusable credentials.</w:t>
+            </w:r>
           </w:p>
         </w:tc>
         <w:tc>
@@ -11276,14 +11291,15 @@
           </w:tcPr>
           <w:p>
             <w:pPr>
+              <w:spacing w:after="20"/>
+            </w:pPr>
+            <w:r>
               <w:rPr>
-                <w:rFonts w:ascii="Times New Roman" w:eastAsia="Times New Roman" w:hAnsi="Times New Roman" w:cs="Times New Roman"/>
-                <w:kern w:val="0"/>
-                <w:sz w:val="20"/>
-                <w:szCs w:val="20"/>
-                <w14:ligatures w14:val="none"/>
+                <w:rFonts w:ascii="Arial" w:hAnsi="Arial"/>
+                <w:sz w:val="14"/>
               </w:rPr>
-            </w:pPr>
+              <w:t>Account takeover and credential reuse on other sites.</w:t>
+            </w:r>
           </w:p>
         </w:tc>
         <w:tc>
@@ -11307,14 +11323,15 @@
           </w:tcPr>
           <w:p>
             <w:pPr>
+              <w:spacing w:after="20"/>
+            </w:pPr>
+            <w:r>
               <w:rPr>
-                <w:rFonts w:ascii="Times New Roman" w:eastAsia="Times New Roman" w:hAnsi="Times New Roman" w:cs="Times New Roman"/>
-                <w:kern w:val="0"/>
-                <w:sz w:val="20"/>
-                <w:szCs w:val="20"/>
-                <w14:ligatures w14:val="none"/>
+                <w:rFonts w:ascii="Arial" w:hAnsi="Arial"/>
+                <w:sz w:val="14"/>
               </w:rPr>
-            </w:pPr>
+              <w:t>A02 Cryptographic Failures; A07 Identification and Authentication Failures</w:t>
+            </w:r>
           </w:p>
         </w:tc>
         <w:tc>
@@ -11338,14 +11355,15 @@
           </w:tcPr>
           <w:p>
             <w:pPr>
+              <w:spacing w:after="20"/>
+            </w:pPr>
+            <w:r>
               <w:rPr>
-                <w:rFonts w:ascii="Times New Roman" w:eastAsia="Times New Roman" w:hAnsi="Times New Roman" w:cs="Times New Roman"/>
-                <w:kern w:val="0"/>
-                <w:sz w:val="20"/>
-                <w:szCs w:val="20"/>
-                <w14:ligatures w14:val="none"/>
+                <w:rFonts w:ascii="Arial" w:hAnsi="Arial"/>
+                <w:sz w:val="14"/>
               </w:rPr>
-            </w:pPr>
+              <w:t>Use salted password hashing (bcrypt is used by secure-api). This project has an in-memory store, not a persistent database.</w:t>
+            </w:r>
           </w:p>
         </w:tc>
       </w:tr>
@@ -11371,22 +11389,14 @@
           </w:tcPr>
           <w:p>
             <w:pPr>
-              <w:spacing w:before="100" w:beforeAutospacing="1" w:after="100" w:afterAutospacing="1"/>
+              <w:spacing w:after="20"/>
+            </w:pPr>
+            <w:r>
               <w:rPr>
-                <w:rFonts w:ascii="Times New Roman" w:eastAsia="Times New Roman" w:hAnsi="Times New Roman" w:cs="Times New Roman"/>
-                <w:kern w:val="0"/>
-                <w:szCs w:val="24"/>
-                <w14:ligatures w14:val="none"/>
+                <w:rFonts w:ascii="Arial" w:hAnsi="Arial"/>
+                <w:sz w:val="14"/>
               </w:rPr>
-            </w:pPr>
-            <w:r>
-              <w:rPr>
-                <w:rFonts w:ascii="Times New Roman" w:eastAsia="Times New Roman" w:hAnsi="Times New Roman" w:cs="Times New Roman"/>
-                <w:kern w:val="0"/>
-                <w:szCs w:val="24"/>
-                <w14:ligatures w14:val="none"/>
-              </w:rPr>
-              <w:t>No authorization</w:t>
+              <w:t>Missing authorization</w:t>
             </w:r>
           </w:p>
         </w:tc>
@@ -11411,13 +11421,15 @@
           </w:tcPr>
           <w:p>
             <w:pPr>
+              <w:spacing w:after="20"/>
+            </w:pPr>
+            <w:r>
               <w:rPr>
-                <w:rFonts w:ascii="Times New Roman" w:eastAsia="Times New Roman" w:hAnsi="Times New Roman" w:cs="Times New Roman"/>
-                <w:kern w:val="0"/>
-                <w:szCs w:val="24"/>
-                <w14:ligatures w14:val="none"/>
+                <w:rFonts w:ascii="Arial" w:hAnsi="Arial"/>
+                <w:sz w:val="14"/>
               </w:rPr>
-            </w:pPr>
+              <w:t>If a route trusts authentication alone and omits ownership/role checks, users may access another account or admin functions.</w:t>
+            </w:r>
           </w:p>
         </w:tc>
         <w:tc>
@@ -11441,14 +11453,15 @@
           </w:tcPr>
           <w:p>
             <w:pPr>
+              <w:spacing w:after="20"/>
+            </w:pPr>
+            <w:r>
               <w:rPr>
-                <w:rFonts w:ascii="Times New Roman" w:eastAsia="Times New Roman" w:hAnsi="Times New Roman" w:cs="Times New Roman"/>
-                <w:kern w:val="0"/>
-                <w:sz w:val="20"/>
-                <w:szCs w:val="20"/>
-                <w14:ligatures w14:val="none"/>
+                <w:rFonts w:ascii="Arial" w:hAnsi="Arial"/>
+                <w:sz w:val="14"/>
               </w:rPr>
-            </w:pPr>
+              <w:t>Unauthorized disclosure or changes.</w:t>
+            </w:r>
           </w:p>
         </w:tc>
         <w:tc>
@@ -11472,14 +11485,15 @@
           </w:tcPr>
           <w:p>
             <w:pPr>
+              <w:spacing w:after="20"/>
+            </w:pPr>
+            <w:r>
               <w:rPr>
-                <w:rFonts w:ascii="Times New Roman" w:eastAsia="Times New Roman" w:hAnsi="Times New Roman" w:cs="Times New Roman"/>
-                <w:kern w:val="0"/>
-                <w:sz w:val="20"/>
-                <w:szCs w:val="20"/>
-                <w14:ligatures w14:val="none"/>
+                <w:rFonts w:ascii="Arial" w:hAnsi="Arial"/>
+                <w:sz w:val="14"/>
               </w:rPr>
-            </w:pPr>
+              <w:t>A01 Broken Access Control</w:t>
+            </w:r>
           </w:p>
         </w:tc>
         <w:tc>
@@ -11503,14 +11517,15 @@
           </w:tcPr>
           <w:p>
             <w:pPr>
+              <w:spacing w:after="20"/>
+            </w:pPr>
+            <w:r>
               <w:rPr>
-                <w:rFonts w:ascii="Times New Roman" w:eastAsia="Times New Roman" w:hAnsi="Times New Roman" w:cs="Times New Roman"/>
-                <w:kern w:val="0"/>
-                <w:sz w:val="20"/>
-                <w:szCs w:val="20"/>
-                <w14:ligatures w14:val="none"/>
+                <w:rFonts w:ascii="Arial" w:hAnsi="Arial"/>
+                <w:sz w:val="14"/>
               </w:rPr>
-            </w:pPr>
+              <w:t>Check ownership/role on the server. E14 shows student admin denial (403); E15 shows other-user task denial (404).</w:t>
+            </w:r>
           </w:p>
         </w:tc>
       </w:tr>
@@ -11536,22 +11551,14 @@
           </w:tcPr>
           <w:p>
             <w:pPr>
-              <w:spacing w:before="100" w:beforeAutospacing="1" w:after="100" w:afterAutospacing="1"/>
+              <w:spacing w:after="20"/>
+            </w:pPr>
+            <w:r>
               <w:rPr>
-                <w:rFonts w:ascii="Times New Roman" w:eastAsia="Times New Roman" w:hAnsi="Times New Roman" w:cs="Times New Roman"/>
-                <w:kern w:val="0"/>
-                <w:szCs w:val="24"/>
-                <w14:ligatures w14:val="none"/>
+                <w:rFonts w:ascii="Arial" w:hAnsi="Arial"/>
+                <w:sz w:val="14"/>
               </w:rPr>
-            </w:pPr>
-            <w:r>
-              <w:rPr>
-                <w:rFonts w:ascii="Times New Roman" w:eastAsia="Times New Roman" w:hAnsi="Times New Roman" w:cs="Times New Roman"/>
-                <w:kern w:val="0"/>
-                <w:szCs w:val="24"/>
-                <w14:ligatures w14:val="none"/>
-              </w:rPr>
-              <w:t>Raw database input</w:t>
+              <w:t>Raw database input / SQL injection</w:t>
             </w:r>
           </w:p>
         </w:tc>
@@ -11576,13 +11583,15 @@
           </w:tcPr>
           <w:p>
             <w:pPr>
+              <w:spacing w:after="20"/>
+            </w:pPr>
+            <w:r>
               <w:rPr>
-                <w:rFonts w:ascii="Times New Roman" w:eastAsia="Times New Roman" w:hAnsi="Times New Roman" w:cs="Times New Roman"/>
-                <w:kern w:val="0"/>
-                <w:szCs w:val="24"/>
-                <w14:ligatures w14:val="none"/>
+                <w:rFonts w:ascii="Arial" w:hAnsi="Arial"/>
+                <w:sz w:val="14"/>
               </w:rPr>
-            </w:pPr>
+              <w:t>Unsafe SQL string construction can let attacker-controlled input change a query.</w:t>
+            </w:r>
           </w:p>
         </w:tc>
         <w:tc>
@@ -11606,14 +11615,15 @@
           </w:tcPr>
           <w:p>
             <w:pPr>
+              <w:spacing w:after="20"/>
+            </w:pPr>
+            <w:r>
               <w:rPr>
-                <w:rFonts w:ascii="Times New Roman" w:eastAsia="Times New Roman" w:hAnsi="Times New Roman" w:cs="Times New Roman"/>
-                <w:kern w:val="0"/>
-                <w:sz w:val="20"/>
-                <w:szCs w:val="20"/>
-                <w14:ligatures w14:val="none"/>
+                <w:rFonts w:ascii="Arial" w:hAnsi="Arial"/>
+                <w:sz w:val="14"/>
               </w:rPr>
-            </w:pPr>
+              <w:t>Data disclosure or modification.</w:t>
+            </w:r>
           </w:p>
         </w:tc>
         <w:tc>
@@ -11637,14 +11647,15 @@
           </w:tcPr>
           <w:p>
             <w:pPr>
+              <w:spacing w:after="20"/>
+            </w:pPr>
+            <w:r>
               <w:rPr>
-                <w:rFonts w:ascii="Times New Roman" w:eastAsia="Times New Roman" w:hAnsi="Times New Roman" w:cs="Times New Roman"/>
-                <w:kern w:val="0"/>
-                <w:sz w:val="20"/>
-                <w:szCs w:val="20"/>
-                <w14:ligatures w14:val="none"/>
+                <w:rFonts w:ascii="Arial" w:hAnsi="Arial"/>
+                <w:sz w:val="14"/>
               </w:rPr>
-            </w:pPr>
+              <w:t>A03 Injection</w:t>
+            </w:r>
           </w:p>
         </w:tc>
         <w:tc>
@@ -11668,14 +11679,15 @@
           </w:tcPr>
           <w:p>
             <w:pPr>
+              <w:spacing w:after="20"/>
+            </w:pPr>
+            <w:r>
               <w:rPr>
-                <w:rFonts w:ascii="Times New Roman" w:eastAsia="Times New Roman" w:hAnsi="Times New Roman" w:cs="Times New Roman"/>
-                <w:kern w:val="0"/>
-                <w:sz w:val="20"/>
-                <w:szCs w:val="20"/>
-                <w14:ligatures w14:val="none"/>
+                <w:rFonts w:ascii="Arial" w:hAnsi="Arial"/>
+                <w:sz w:val="14"/>
               </w:rPr>
-            </w:pPr>
+              <w:t>Use parameterized queries if a SQL database is added. This prototype uses in-memory arrays; SQL injection is a general risk scenario, not a demonstrated flaw here.</w:t>
+            </w:r>
           </w:p>
         </w:tc>
       </w:tr>
@@ -11701,22 +11713,14 @@
           </w:tcPr>
           <w:p>
             <w:pPr>
-              <w:spacing w:before="100" w:beforeAutospacing="1" w:after="100" w:afterAutospacing="1"/>
+              <w:spacing w:after="20"/>
+            </w:pPr>
+            <w:r>
               <w:rPr>
-                <w:rFonts w:ascii="Times New Roman" w:eastAsia="Times New Roman" w:hAnsi="Times New Roman" w:cs="Times New Roman"/>
-                <w:kern w:val="0"/>
-                <w:szCs w:val="24"/>
-                <w14:ligatures w14:val="none"/>
+                <w:rFonts w:ascii="Arial" w:hAnsi="Arial"/>
+                <w:sz w:val="14"/>
               </w:rPr>
-            </w:pPr>
-            <w:r>
-              <w:rPr>
-                <w:rFonts w:ascii="Times New Roman" w:eastAsia="Times New Roman" w:hAnsi="Times New Roman" w:cs="Times New Roman"/>
-                <w:kern w:val="0"/>
-                <w:szCs w:val="24"/>
-                <w14:ligatures w14:val="none"/>
-              </w:rPr>
-              <w:t>Detailed errors</w:t>
+              <w:t>Detailed internal errors</w:t>
             </w:r>
           </w:p>
         </w:tc>
@@ -11741,13 +11745,15 @@
           </w:tcPr>
           <w:p>
             <w:pPr>
+              <w:spacing w:after="20"/>
+            </w:pPr>
+            <w:r>
               <w:rPr>
-                <w:rFonts w:ascii="Times New Roman" w:eastAsia="Times New Roman" w:hAnsi="Times New Roman" w:cs="Times New Roman"/>
-                <w:kern w:val="0"/>
-                <w:szCs w:val="24"/>
-                <w14:ligatures w14:val="none"/>
+                <w:rFonts w:ascii="Arial" w:hAnsi="Arial"/>
+                <w:sz w:val="14"/>
               </w:rPr>
-            </w:pPr>
+              <w:t>Returning stack traces or operational details can help attackers understand internals.</w:t>
+            </w:r>
           </w:p>
         </w:tc>
         <w:tc>
@@ -11771,14 +11777,15 @@
           </w:tcPr>
           <w:p>
             <w:pPr>
+              <w:spacing w:after="20"/>
+            </w:pPr>
+            <w:r>
               <w:rPr>
-                <w:rFonts w:ascii="Times New Roman" w:eastAsia="Times New Roman" w:hAnsi="Times New Roman" w:cs="Times New Roman"/>
-                <w:kern w:val="0"/>
-                <w:sz w:val="20"/>
-                <w:szCs w:val="20"/>
-                <w14:ligatures w14:val="none"/>
+                <w:rFonts w:ascii="Arial" w:hAnsi="Arial"/>
+                <w:sz w:val="14"/>
               </w:rPr>
-            </w:pPr>
+              <w:t>Information disclosure and easier follow-on attacks.</w:t>
+            </w:r>
           </w:p>
         </w:tc>
         <w:tc>
@@ -11802,14 +11809,15 @@
           </w:tcPr>
           <w:p>
             <w:pPr>
+              <w:spacing w:after="20"/>
+            </w:pPr>
+            <w:r>
               <w:rPr>
-                <w:rFonts w:ascii="Times New Roman" w:eastAsia="Times New Roman" w:hAnsi="Times New Roman" w:cs="Times New Roman"/>
-                <w:kern w:val="0"/>
-                <w:sz w:val="20"/>
-                <w:szCs w:val="20"/>
-                <w14:ligatures w14:val="none"/>
+                <w:rFonts w:ascii="Arial" w:hAnsi="Arial"/>
+                <w:sz w:val="14"/>
               </w:rPr>
-            </w:pPr>
+              <w:t>A05 Security Misconfiguration</w:t>
+            </w:r>
           </w:p>
         </w:tc>
         <w:tc>
@@ -11833,14 +11841,15 @@
           </w:tcPr>
           <w:p>
             <w:pPr>
+              <w:spacing w:after="20"/>
+            </w:pPr>
+            <w:r>
               <w:rPr>
-                <w:rFonts w:ascii="Times New Roman" w:eastAsia="Times New Roman" w:hAnsi="Times New Roman" w:cs="Times New Roman"/>
-                <w:kern w:val="0"/>
-                <w:sz w:val="20"/>
-                <w:szCs w:val="20"/>
-                <w14:ligatures w14:val="none"/>
+                <w:rFonts w:ascii="Arial" w:hAnsi="Arial"/>
+                <w:sz w:val="14"/>
               </w:rPr>
-            </w:pPr>
+              <w:t>Return safe client errors and log details server-side; secure-api avoids exposing stack traces in client responses.</w:t>
+            </w:r>
           </w:p>
         </w:tc>
       </w:tr>
@@ -11866,20 +11875,12 @@
           </w:tcPr>
           <w:p>
             <w:pPr>
-              <w:spacing w:before="100" w:beforeAutospacing="1" w:after="100" w:afterAutospacing="1"/>
+              <w:spacing w:after="20"/>
+            </w:pPr>
+            <w:r>
               <w:rPr>
-                <w:rFonts w:ascii="Times New Roman" w:eastAsia="Times New Roman" w:hAnsi="Times New Roman" w:cs="Times New Roman"/>
-                <w:kern w:val="0"/>
-                <w:szCs w:val="24"/>
-                <w14:ligatures w14:val="none"/>
-              </w:rPr>
-            </w:pPr>
-            <w:r>
-              <w:rPr>
-                <w:rFonts w:ascii="Times New Roman" w:eastAsia="Times New Roman" w:hAnsi="Times New Roman" w:cs="Times New Roman"/>
-                <w:kern w:val="0"/>
-                <w:szCs w:val="24"/>
-                <w14:ligatures w14:val="none"/>
+                <w:rFonts w:ascii="Arial" w:hAnsi="Arial"/>
+                <w:sz w:val="14"/>
               </w:rPr>
               <w:t>Hardcoded JWT secret</w:t>
             </w:r>
@@ -11906,13 +11907,15 @@
           </w:tcPr>
           <w:p>
             <w:pPr>
+              <w:spacing w:after="20"/>
+            </w:pPr>
+            <w:r>
               <w:rPr>
-                <w:rFonts w:ascii="Times New Roman" w:eastAsia="Times New Roman" w:hAnsi="Times New Roman" w:cs="Times New Roman"/>
-                <w:kern w:val="0"/>
-                <w:szCs w:val="24"/>
-                <w14:ligatures w14:val="none"/>
+                <w:rFonts w:ascii="Arial" w:hAnsi="Arial"/>
+                <w:sz w:val="14"/>
               </w:rPr>
-            </w:pPr>
+              <w:t>A source-visible signing key could let an attacker mint tokens and impersonate users.</w:t>
+            </w:r>
           </w:p>
         </w:tc>
         <w:tc>
@@ -11936,14 +11939,15 @@
           </w:tcPr>
           <w:p>
             <w:pPr>
+              <w:spacing w:after="20"/>
+            </w:pPr>
+            <w:r>
               <w:rPr>
-                <w:rFonts w:ascii="Times New Roman" w:eastAsia="Times New Roman" w:hAnsi="Times New Roman" w:cs="Times New Roman"/>
-                <w:kern w:val="0"/>
-                <w:sz w:val="20"/>
-                <w:szCs w:val="20"/>
-                <w14:ligatures w14:val="none"/>
+                <w:rFonts w:ascii="Arial" w:hAnsi="Arial"/>
+                <w:sz w:val="14"/>
               </w:rPr>
-            </w:pPr>
+              <w:t>Account impersonation, potentially elevated access.</w:t>
+            </w:r>
           </w:p>
         </w:tc>
         <w:tc>
@@ -11967,14 +11971,15 @@
           </w:tcPr>
           <w:p>
             <w:pPr>
+              <w:spacing w:after="20"/>
+            </w:pPr>
+            <w:r>
               <w:rPr>
-                <w:rFonts w:ascii="Times New Roman" w:eastAsia="Times New Roman" w:hAnsi="Times New Roman" w:cs="Times New Roman"/>
-                <w:kern w:val="0"/>
-                <w:sz w:val="20"/>
-                <w:szCs w:val="20"/>
-                <w14:ligatures w14:val="none"/>
+                <w:rFonts w:ascii="Arial" w:hAnsi="Arial"/>
+                <w:sz w:val="14"/>
               </w:rPr>
-            </w:pPr>
+              <w:t>A02 Cryptographic Failures; A05 Security Misconfiguration</w:t>
+            </w:r>
           </w:p>
         </w:tc>
         <w:tc>
@@ -11998,14 +12003,15 @@
           </w:tcPr>
           <w:p>
             <w:pPr>
+              <w:spacing w:after="20"/>
+            </w:pPr>
+            <w:r>
               <w:rPr>
-                <w:rFonts w:ascii="Times New Roman" w:eastAsia="Times New Roman" w:hAnsi="Times New Roman" w:cs="Times New Roman"/>
-                <w:kern w:val="0"/>
-                <w:sz w:val="20"/>
-                <w:szCs w:val="20"/>
-                <w14:ligatures w14:val="none"/>
+                <w:rFonts w:ascii="Arial" w:hAnsi="Arial"/>
+                <w:sz w:val="14"/>
               </w:rPr>
-            </w:pPr>
+              <w:t>Load a strong key from environment/secret management and rotate after exposure. secure-api uses JWT_SECRET from the environment; vulnerable-api is intentionally insecure teaching material.</w:t>
+            </w:r>
           </w:p>
         </w:tc>
       </w:tr>
@@ -14425,15 +14431,8 @@
             <w:hideMark/>
           </w:tcPr>
           <w:p>
-            <w:pPr>
-              <w:spacing w:after="20"/>
-            </w:pPr>
-            <w:r>
-              <w:rPr>
-                <w:rFonts w:ascii="Arial" w:hAnsi="Arial"/>
-                <w:sz w:val="14"/>
-              </w:rPr>
-              <w:t>No Postman expiry response supplied</w:t>
+            <w:r>
+              <w:t>Not tested: expired-token generation attempt failed; no valid expired token reached the protected route. Failed attempt only, not an observed 401 expiry response.</w:t>
             </w:r>
           </w:p>
         </w:tc>
@@ -14457,15 +14456,8 @@
             <w:hideMark/>
           </w:tcPr>
           <w:p>
-            <w:pPr>
-              <w:spacing w:after="20"/>
-            </w:pPr>
-            <w:r>
-              <w:rPr>
-                <w:rFonts w:ascii="Arial" w:hAnsi="Arial"/>
-                <w:sz w:val="14"/>
-              </w:rPr>
-              <w:t>NOT TESTED - no evidence</w:t>
+            <w:r>
+              <w:t>NOT TESTED / expiry evidence not captured</w:t>
             </w:r>
           </w:p>
         </w:tc>
@@ -14855,15 +14847,8 @@
             <w:vAlign w:val="center"/>
           </w:tcPr>
           <w:p>
-            <w:pPr>
-              <w:spacing w:after="20"/>
-            </w:pPr>
-            <w:r>
-              <w:rPr>
-                <w:rFonts w:ascii="Arial" w:hAnsi="Arial"/>
-                <w:sz w:val="14"/>
-              </w:rPr>
-              <w:t>No successful admin response supplied. Reported admin-login 401 and unauthenticated-route 401 are not proof of admin authorization.</w:t>
+            <w:r>
+              <w:t>Not tested: supplied admin login attempt returned 401; no valid admin token and no successful admin-route response.</w:t>
             </w:r>
           </w:p>
         </w:tc>
@@ -14873,15 +14858,8 @@
             <w:vAlign w:val="center"/>
           </w:tcPr>
           <w:p>
-            <w:pPr>
-              <w:spacing w:after="20"/>
-            </w:pPr>
-            <w:r>
-              <w:rPr>
-                <w:rFonts w:ascii="Arial" w:hAnsi="Arial"/>
-                <w:sz w:val="14"/>
-              </w:rPr>
-              <w:t>NOT TESTED / NOT CAPTURED</w:t>
+            <w:r>
+              <w:t>NOT TESTED / admin-success evidence not captured</w:t>
             </w:r>
           </w:p>
         </w:tc>
@@ -19543,7 +19521,7 @@
     <w:p>
       <w:pPr/>
       <w:r>
-        <w:t>E01-E17 are the only evidence images included. E02 has the bearer token obscured; no signing-secret screenshot or password-variable screenshot is included. The screenshots support the status codes explicitly recorded in the matrix, but do not prove unpictured cases. In particular, there is no expired-token Postman response and no successful administrator-route response. Earlier notes say automated-test source contains expiry/admin-success assertions; these are source assertions, not a test run in this update. The committed Postman collection also has no expiry request. To close these evidence gaps, I should run a short-lived token test and configure an optional administrator, then save sanitized Postman results. Until then, those rows remain not tested/not evidenced.</w:t>
+        <w:t>E01-E17 are the curated evidence images included in this submission. E02 has the bearer token obscured. The supplied expired-token-generation and administrator-login attempts did not establish successful test outcomes and are not counted as passing evidence or added to the E01-E17 index. In particular, expiry behavior and successful administrator access remain untested/not evidenced. There is no persistent database/hash-inspection screenshot. Part M remains a draft that must be personalized.</w:t>
       </w:r>
     </w:p>
     <w:p>
@@ -23094,7 +23072,7 @@
           </w:tcPr>
           <w:p>
             <w:r>
-              <w:t>Not captured / not tested in supplied Postman evidence. Source includes an expiry test assertion, but that test was not rerun for this document update.</w:t>
+              <w:t>Not tested: the expired-token generation attempt failed, so no valid expired token was sent to a protected route. The failed attempt is not an expiry-behavior result.</w:t>
             </w:r>
           </w:p>
         </w:tc>
@@ -23240,7 +23218,7 @@
           </w:tcPr>
           <w:p>
             <w:r>
-              <w:t>/auth/me 200, E03; profile route exists but no profile screenshot supplied.</w:t>
+              <w:t>/auth/me returns 200 (E03); the profile route exists, but no dedicated profile-route screenshot was supplied.</w:t>
             </w:r>
           </w:p>
         </w:tc>
@@ -23304,7 +23282,7 @@
           </w:tcPr>
           <w:p>
             <w:r>
-              <w:t>No successful admin screenshot supplied. Context reports an admin login attempt 401; that is not an admin success.</w:t>
+              <w:t>Not tested: supplied admin login attempt returned 401; no valid admin token or successful admin-route response. This is not admin-success evidence.</w:t>
             </w:r>
           </w:p>
         </w:tc>
@@ -23583,7 +23561,7 @@
           </w:tcPr>
           <w:p>
             <w:r>
-              <w:t>Registration and task validation implemented; invalid registration 400 E10; JSON limited to 16 KB.</w:t>
+              <w:t>Source review: registration/task validation implemented; invalid registration 400 (E10); JSON limited to 16 KB.</w:t>
             </w:r>
           </w:p>
         </w:tc>
@@ -23605,7 +23583,7 @@
           </w:tcPr>
           <w:p>
             <w:r>
-              <w:t>bcrypt hash/compare; password/hash are not returned; store is in-memory.</w:t>
+              <w:t>Source review: bcrypt hash/compare; response omits password/hash. In-memory storage; not a persistent-database inspection.</w:t>
             </w:r>
           </w:p>
         </w:tc>
@@ -23627,7 +23605,7 @@
           </w:tcPr>
           <w:p>
             <w:r>
-              <w:t>Generic error avoids username enumeration; rate limiting/lockout is absent.</w:t>
+              <w:t>Generic invalid-credentials response; E11 shows wrong-password 401. Rate limiting/lockout is absent.</w:t>
             </w:r>
           </w:p>
         </w:tc>
@@ -23649,7 +23627,7 @@
           </w:tcPr>
           <w:p>
             <w:r>
-              <w:t>JWT middleware enforces authentication; no token yields 401 E09.</w:t>
+              <w:t>Source review: JWT middleware protects routes; missing token returns 401 (E09).</w:t>
             </w:r>
           </w:p>
         </w:tc>
@@ -23671,7 +23649,7 @@
           </w:tcPr>
           <w:p>
             <w:r>
-              <w:t>User/task ownership and role checks; E14 and E15 show denial.</w:t>
+              <w:t>Source review: role/ownership checks; student admin denial 403 (E14) and other-user task denial 404 (E15).</w:t>
             </w:r>
           </w:p>
         </w:tc>
@@ -23715,7 +23693,7 @@
           </w:tcPr>
           <w:p>
             <w:r>
-              <w:t>DELETE /api/users/:id and GET /api/admin require admin; positive admin use not shown in supplied screenshots.</w:t>
+              <w:t>Admin-only routes are implemented; positive admin access not tested because supplied admin login attempt returned 401.</w:t>
             </w:r>
           </w:p>
         </w:tc>
@@ -23781,7 +23759,7 @@
           </w:tcPr>
           <w:p>
             <w:r>
-              <w:t>Invalid input 400, unauthenticated 401, forbidden 403, hidden task 404; generic 500 without stack trace in client response.</w:t>
+              <w:t>Source review and supplied responses show 400/401/403/404 examples; no client stack trace is intended. This is not a fresh automated test run.</w:t>
             </w:r>
           </w:p>
         </w:tc>
@@ -24112,7 +24090,7 @@
     </w:p>
     <w:p>
       <w:r>
-        <w:t>The committed collection groups authentication/CRUD and security checks. It includes registration, login, current user, protected access, task CRUD, invalid registration/password, missing authentication, modified/malformed token, student admin denial, second-student task denial, logout and revoked-token denial. It does not include an expired-token request although the lab?s suggested collection structure lists one.</w:t>
+        <w:t>The committed collection groups authentication/CRUD and security checks. It includes registration, login, current user, protected access, task CRUD, invalid registration/password, missing authentication, modified/malformed token, student admin denial, second-student task denial, logout and revoked-token denial. It does not provide a valid expired-token request/response. The supplied generation attempt failed and therefore is not evidence that expiry handling returned 401.</w:t>
       </w:r>
     </w:p>
     <w:p>
@@ -24946,15 +24924,8 @@
             <w:vAlign w:val="center"/>
           </w:tcPr>
           <w:p>
-            <w:pPr>
-              <w:spacing w:after="20"/>
-            </w:pPr>
-            <w:r>
-              <w:rPr>
-                <w:rFonts w:ascii="Arial" w:hAnsi="Arial"/>
-                <w:sz w:val="14"/>
-              </w:rPr>
-              <w:t>No expired-token Postman result supplied</w:t>
+            <w:r>
+              <w:t>Not tested: expired-token generation attempt failed; no valid expired token reached the protected route. Failed attempt only, not an observed 401 expiry response.</w:t>
             </w:r>
           </w:p>
         </w:tc>
@@ -24964,15 +24935,8 @@
             <w:vAlign w:val="center"/>
           </w:tcPr>
           <w:p>
-            <w:pPr>
-              <w:spacing w:after="20"/>
-            </w:pPr>
-            <w:r>
-              <w:rPr>
-                <w:rFonts w:ascii="Arial" w:hAnsi="Arial"/>
-                <w:sz w:val="14"/>
-              </w:rPr>
-              <w:t>NOT TESTED - no evidence</w:t>
+            <w:r>
+              <w:t>NOT TESTED / expiry evidence not captured</w:t>
             </w:r>
           </w:p>
         </w:tc>
@@ -25222,15 +25186,8 @@
             <w:vAlign w:val="center"/>
           </w:tcPr>
           <w:p>
-            <w:pPr>
-              <w:spacing w:after="20"/>
-            </w:pPr>
-            <w:r>
-              <w:rPr>
-                <w:rFonts w:ascii="Arial" w:hAnsi="Arial"/>
-                <w:sz w:val="14"/>
-              </w:rPr>
-              <w:t>No successful admin response supplied. Reported admin-login 401 and unauthenticated-route 401 are not proof of admin authorization.</w:t>
+            <w:r>
+              <w:t>Not tested: supplied admin login attempt returned 401; no valid admin token and no successful admin-route response.</w:t>
             </w:r>
           </w:p>
         </w:tc>
@@ -25240,15 +25197,8 @@
             <w:vAlign w:val="center"/>
           </w:tcPr>
           <w:p>
-            <w:pPr>
-              <w:spacing w:after="20"/>
-            </w:pPr>
-            <w:r>
-              <w:rPr>
-                <w:rFonts w:ascii="Arial" w:hAnsi="Arial"/>
-                <w:sz w:val="14"/>
-              </w:rPr>
-              <w:t>NOT TESTED / NOT CAPTURED</w:t>
+            <w:r>
+              <w:t>NOT TESTED / admin-success evidence not captured</w:t>
             </w:r>
           </w:p>
         </w:tc>
@@ -25257,7 +25207,7 @@
     <w:p/>
     <w:p>
       <w:r>
-        <w:t>Successful admin access is not evidenced. The context reports an admin login attempt 401 and an unauthenticated admin route 401; neither proves admin authorization. E14 proves only student denial. The automated test source contains admin success, but was not rerun while creating this worksheet.</w:t>
+        <w:t>A supplied admin-login attempt returned 401, so it did not produce a valid administrator token and did not test successful access to /api/admin. A separate expired-token generation attempt failed before a valid expired JWT was sent to a protected route. These attempts are not passing evidence for the respective security behaviors. E14 remains evidence only of student denial (403); the E01-E17 index is unchanged. Automated-test source assertions are not test results for this document update.</w:t>
       </w:r>
     </w:p>
     <w:p>
@@ -26516,7 +26466,7 @@
           </w:tcPr>
           <w:p>
             <w:r>
-              <w:t>Authentication asks who you are; authorization asks what you may do/access.</w:t>
+              <w:t>Authentication verifies a user's identity; authorization determines what that user is allowed to do.</w:t>
             </w:r>
           </w:p>
         </w:tc>
@@ -26538,7 +26488,7 @@
           </w:tcPr>
           <w:p>
             <w:r>
-              <w:t>A salted, slow hash avoids recoverable plaintext and increases cost of offline guessing.</w:t>
+              <w:t>Hashing protects passwords from being exposed as usable plaintext if stored data is compromised; users reset passwords rather than recover originals.</w:t>
             </w:r>
           </w:p>
         </w:tc>
@@ -26560,7 +26510,7 @@
           </w:tcPr>
           <w:p>
             <w:r>
-              <w:t>A session identifier used by the server to find authenticated server-side state; it is a bearer credential.</w:t>
+              <w:t>A session cookie carries a session identifier that the server uses to find authenticated server-side state. It is a bearer credential. This is a conceptual answer; the submitted prototype uses JWT.</w:t>
             </w:r>
           </w:p>
         </w:tc>
@@ -26582,7 +26532,7 @@
           </w:tcPr>
           <w:p>
             <w:r>
-              <w:t>No; normally encoded, not encrypted. Do not put passwords/secrets in it.</w:t>
+              <w:t>No. A normal JWT payload is encoded, not encrypted, so its claims can be read by someone holding the token.</w:t>
             </w:r>
           </w:p>
         </w:tc>
@@ -26604,7 +26554,7 @@
           </w:tcPr>
           <w:p>
             <w:r>
-              <w:t>401 Unauthorized.</w:t>
+              <w:t>Return 401 Unauthorized because the request has no valid authentication credential.</w:t>
             </w:r>
           </w:p>
         </w:tc>
@@ -26626,7 +26576,7 @@
           </w:tcPr>
           <w:p>
             <w:r>
-              <w:t>403 Forbidden.</w:t>
+              <w:t>Return 403 Forbidden when an authenticated student lacks the administrator permission. E14 shows the student-denial case.</w:t>
             </w:r>
           </w:p>
         </w:tc>
@@ -26648,7 +26598,7 @@
           </w:tcPr>
           <w:p>
             <w:r>
-              <w:t>Student A’s valid token requests Student B’s task; expect denial, here 404.</w:t>
+              <w:t>Use Student A's valid token to request Student B's task; expect denial rather than another user's task data (404, E15).</w:t>
             </w:r>
           </w:p>
         </w:tc>
@@ -26670,7 +26620,7 @@
           </w:tcPr>
           <w:p>
             <w:r>
-              <w:t>Client input, including role/ownership claims and client-side validation.</w:t>
+              <w:t>Client input, including role and resource-ownership values; the server must validate and authorize them.</w:t>
             </w:r>
           </w:p>
         </w:tc>

</xml_diff>

<commit_message>
Polish Week 6 lab answers for readability
Co-authored-by: Copilot App <223556219+Copilot@users.noreply.github.com>
</commit_message>
<xml_diff>
--- a/submission/CBE204_Week6_Lab_Sheet_Completed_DRAFT.docx
+++ b/submission/CBE204_Week6_Lab_Sheet_Completed_DRAFT.docx
@@ -2066,7 +2066,7 @@
           </w:tcPr>
           <w:p>
             <w:r>
-              <w:t>Authentication state management (logout invalidates current state).</w:t>
+              <w:t>Logout ends or changes the current authenticated state.</w:t>
             </w:r>
           </w:p>
         </w:tc>
@@ -15463,15 +15463,7 @@
             <w:vAlign w:val="center"/>
           </w:tcPr>
           <w:p>
-            <w:pPr>
-              <w:spacing w:after="20"/>
-            </w:pPr>
-            <w:r>
-              <w:rPr>
-                <w:rFonts w:ascii="Arial" w:hAnsi="Arial"/>
-                <w:b/>
-                <w:sz w:val="14"/>
-              </w:rPr>
+            <w:r>
               <w:t>J1: who may call?</w:t>
             </w:r>
           </w:p>
@@ -22464,7 +22456,7 @@
           </w:tcPr>
           <w:p>
             <w:r>
-              <w:t>Verify claimed identity.</w:t>
+              <w:t>The server checks whether the signed-in user has permission to do this.</w:t>
             </w:r>
           </w:p>
         </w:tc>
@@ -22496,7 +22488,7 @@
           </w:tcPr>
           <w:p>
             <w:r>
-              <w:t>Check permission for the operation.</w:t>
+              <w:t>The server checks the token to confirm who is making the request.</w:t>
             </w:r>
           </w:p>
         </w:tc>
@@ -22528,7 +22520,7 @@
           </w:tcPr>
           <w:p>
             <w:r>
-              <w:t>Verify signed credential and identify subject.</w:t>
+              <w:t>The server checks the user's role before allowing access to the admin area.</w:t>
             </w:r>
           </w:p>
         </w:tc>
@@ -22560,7 +22552,7 @@
           </w:tcPr>
           <w:p>
             <w:r>
-              <w:t>Check role/permission after identity is known.</w:t>
+              <w:t>The owner check determines whether this user may access the resource.</w:t>
             </w:r>
           </w:p>
         </w:tc>
@@ -22592,7 +22584,7 @@
           </w:tcPr>
           <w:p>
             <w:r>
-              <w:t>Ownership determines resource access.</w:t>
+              <w:t>Logout ends the current authenticated state; later protected requests should fail.</w:t>
             </w:r>
           </w:p>
         </w:tc>
@@ -22633,7 +22625,7 @@
     <w:p/>
     <w:p>
       <w:r>
-        <w:t>Reflection: Being logged in proves identity, not permission. A student can be authenticated and still must be denied administrator operations or other users’ private resources. Every protected operation needs a server-side authorization check.</w:t>
+        <w:t>Logging in tells the server who I am, but it does not give me permission to do everything. A student can sign in successfully and still must be blocked from administrator actions or another student's private tasks. The server needs to check permission for each protected action.</w:t>
       </w:r>
     </w:p>
     <w:p>
@@ -22654,7 +22646,7 @@
     </w:p>
     <w:p>
       <w:r>
-        <w:t>If an attacker obtains plaintext passwords, they can immediately access those accounts and try reused credentials on other services. Plaintext storage makes a database breach expose credentials directly. Administrators should not recover original passwords; users should reset them. Store salted, deliberately expensive password hashes such as bcrypt instead.</w:t>
+        <w:t>If someone stole a database containing plaintext passwords, they could use those passwords right away and might also try them on other websites. That is why passwords should not be stored as readable text. An administrator should not recover a user's original password; the user should reset it instead. The system should store a salted password hash, such as a bcrypt hash.</w:t>
       </w:r>
     </w:p>
     <w:p>
@@ -22667,12 +22659,12 @@
     </w:p>
     <w:p>
       <w:r>
-        <w:t>secure-api/src/server.js validates registration input, hashes passwords with bcrypt (12 rounds), stores passwordHash in an in-memory user record, and returns only publicUser fields. Login verifies with bcrypt.compare and returns the same generic 401 “Invalid credentials” for an unknown user or wrong password. Tests check that hashes/passwords are not returned.</w:t>
-      </w:r>
-    </w:p>
-    <w:p>
-      <w:r>
-        <w:t>Storage evidence limitation: there is no persistent database to inspect and no screenshot of stored hash data. Source shows bcrypt hashing and tests check response minimization; this is not a database screenshot and does not prove a persistent DB was audited.</w:t>
+        <w:t>In the secure API, registration checks the submitted fields and hashes the password with bcrypt before storing it in the in-memory user record. At login, the server checks the password with bcrypt.compare. An unknown username and a wrong password receive the same "Invalid credentials" response, and public responses leave out passwordHash. This describes the implementation and test assertions; I did not rerun the suite for this document update.</w:t>
+      </w:r>
+    </w:p>
+    <w:p>
+      <w:r>
+        <w:t>There is no persistent database in this prototype, so there is no database screen or stored-hash screenshot to include. The source code shows where bcrypt is used, and the test code checks that password data is not returned. Those are useful references, but they are not proof that a database was inspected.</w:t>
       </w:r>
     </w:p>
     <w:p>
@@ -22693,7 +22685,7 @@
     </w:p>
     <w:p>
       <w:r>
-        <w:t>Client POSTs /auth/login → Express verifies credentials and creates authenticated session state → session store saves state and returns a session ID → server sends Set-Cookie to client. On later requests, the browser sends the cookie and the server looks up the session to identify the user.</w:t>
+        <w:t>For a session-based design, the client sends its login details to /auth/login. After checking them, the server creates session state and sends the session ID in a cookie. The browser sends that cookie with later requests, and the server uses the ID to find the signed-in user. This is a conceptual flow; the submitted prototype uses JWTs instead.</w:t>
       </w:r>
     </w:p>
     <w:p>
@@ -22706,7 +22698,7 @@
     </w:p>
     <w:p>
       <w:r>
-        <w:t>In a session design, successful login creates a server-side session and cookie; GET /auth/me reads it; POST /auth/logout destroys it and clears the cookie; GET /api/protected returns 401 without a valid session. The final prototype selects JWT instead. A separate session-api demo exists, but is not the chosen submission implementation.</w:t>
+        <w:t>With sessions, a successful login would create server-side state and send a cookie. GET /auth/me could read the current user, and POST /auth/logout would remove the session and clear the cookie. A protected route should return 401 when the session is missing or invalid. The submitted secure API uses JWTs instead; session-api is a separate classroom example, not the chosen submission.</w:t>
       </w:r>
     </w:p>
     <w:p>
@@ -22779,7 +22771,7 @@
           </w:tcPr>
           <w:p>
             <w:r>
-              <w:t>Prevents JavaScript from directly reading the cookie; reduces some XSS cookie-theft impact.</w:t>
+              <w:t>HttpOnly keeps page JavaScript from reading the cookie, which can limit some XSS-based cookie theft.</w:t>
             </w:r>
           </w:p>
         </w:tc>
@@ -22801,7 +22793,7 @@
           </w:tcPr>
           <w:p>
             <w:r>
-              <w:t>Sends the cookie only over HTTPS.</w:t>
+              <w:t>Secure tells the browser to send the cookie only over HTTPS.</w:t>
             </w:r>
           </w:p>
         </w:tc>
@@ -22823,7 +22815,7 @@
           </w:tcPr>
           <w:p>
             <w:r>
-              <w:t>Controls cross-site cookie sending and helps mitigate CSRF.</w:t>
+              <w:t>SameSite controls when the browser sends the cookie with cross-site requests.</w:t>
             </w:r>
           </w:p>
         </w:tc>
@@ -22832,7 +22824,7 @@
     <w:p/>
     <w:p>
       <w:r>
-        <w:t>A session cookie is a bearer credential, so exposure or cross-site abuse can let an attacker act as the user. The separate session demo uses secure:false for local HTTP; production should use HTTPS and secure:true.</w:t>
+        <w:t>A session cookie acts like a key to the signed-in account. If it is stolen or sent in an unsafe cross-site request, someone else may be able to act as that user. The separate session demo uses secure:false for local HTTP testing; a real deployment should use HTTPS and set Secure. HttpOnly prevents page scripts from reading the cookie, while SameSite helps control when browsers send it across sites.</w:t>
       </w:r>
     </w:p>
     <w:p>
@@ -22845,7 +22837,7 @@
     </w:p>
     <w:p>
       <w:r>
-        <w:t>A session logout should destroy server-side session state and clear/expire the cookie, after which protected requests return 401. The submitted JWT evidence instead shows logout 200 (E16), followed by the revoked token receiving 401 (E17).</w:t>
+        <w:t>In a session design, logout should remove the server-side session and clear or expire its cookie. In this JWT prototype, the supplied captures show a successful logout (E16) and then a 401 when the same revoked token is used again (E17).</w:t>
       </w:r>
     </w:p>
     <w:p>
@@ -22866,7 +22858,7 @@
     </w:p>
     <w:p>
       <w:r>
-        <w:t>A JWT has three dot-separated parts: HEADER.PAYLOAD.SIGNATURE. In this implementation, the header identifies JWT and HS256 (HMAC-SHA-256). The payload claims are sub (user ID), jti (unique token ID), iss (issuer), iat (issued-at time) and exp (expiry). The signature is the HMAC-SHA-256 integrity/authenticity value computed with the server secret. These claims come from the committed signing code; the supplied successful-login screenshot has its token redacted, so I am not claiming to have decoded that screenshot token. No raw token is included as evidence.</w:t>
+        <w:t>A JWT has three parts: a header, a payload, and a signature. In this project, the signing code uses HS256. The payload contains the subject (user ID), token ID (jti), issuer (iss), issued-at time (iat), and expiry (exp). The signature helps the server detect changes; it does not hide the payload. I am describing the claims from the source code, not decoding the login screenshot, because the token in E02 is deliberately covered.</w:t>
       </w:r>
     </w:p>
     <w:p>
@@ -22879,7 +22871,7 @@
     </w:p>
     <w:p>
       <w:r>
-        <w:t>POST /auth/login receives username/password, finds the user, and verifies the submitted password with bcrypt.compare against the stored bcrypt hash. Invalid/unknown credentials receive the generic 401 response. On success the server signs a JWT with HS256, subject=user ID, a unique jti, issuer cbe204-week06 and a 15-minute expiry, then returns the token and public user fields. Supplied screenshot E02 shows 200 OK and public student fields; the bearer token is covered in the evidence copy. Registration is separately shown in E01 (201).</w:t>
+        <w:t>When a user calls POST /auth/login, the server looks up the account and compares the submitted password with its bcrypt hash. A wrong password or unknown username gets the same 401 response. For a successful login, the server signs an HS256 token with the user ID, a unique token ID, the issuer, and a 15-minute expiry, then returns it with public user fields. E02 shows the 200 response with the bearer token covered; E01 shows registration returning 201.</w:t>
       </w:r>
     </w:p>
     <w:p>
@@ -22976,7 +22968,7 @@
           </w:tcPr>
           <w:p>
             <w:r>
-              <w:t>401, E09.</w:t>
+              <w:t>401 Unauthorized (E09).</w:t>
             </w:r>
           </w:p>
         </w:tc>
@@ -23008,7 +23000,7 @@
           </w:tcPr>
           <w:p>
             <w:r>
-              <w:t>Login 200 and protected 200, E02 (token redacted) and E04.</w:t>
+              <w:t>200 for login and protected access (E02, token redacted; E04).</w:t>
             </w:r>
           </w:p>
         </w:tc>
@@ -23040,7 +23032,7 @@
           </w:tcPr>
           <w:p>
             <w:r>
-              <w:t>401, E12.</w:t>
+              <w:t>401 Unauthorized (E12).</w:t>
             </w:r>
           </w:p>
         </w:tc>
@@ -23072,7 +23064,7 @@
           </w:tcPr>
           <w:p>
             <w:r>
-              <w:t>Not tested: the expired-token generation attempt failed, so no valid expired token was sent to a protected route. The failed attempt is not an expiry-behavior result.</w:t>
+              <w:t>Not tested: the expired-token setup attempt failed before a token was sent to a protected route. No expiry response was observed.</w:t>
             </w:r>
           </w:p>
         </w:tc>
@@ -23104,7 +23096,7 @@
           </w:tcPr>
           <w:p>
             <w:r>
-              <w:t>401, E13.</w:t>
+              <w:t>401 Unauthorized (E13).</w:t>
             </w:r>
           </w:p>
         </w:tc>
@@ -23129,7 +23121,7 @@
     </w:p>
     <w:p>
       <w:r>
-        <w:t>Student registration always assigns student; an administrator is provisioned only through ADMIN_USERNAME and ADMIN_PASSWORD in the local environment. Clients cannot choose their role. Supplied captures demonstrate student denial, not successful administrator access.</w:t>
+        <w:t>Public registration creates student accounts, so a client cannot choose its own role. The optional administrator is configured through local environment variables instead. E14 shows a student being denied access to the admin route (403). The supplied admin-login attempt returned 401, so successful administrator access was not demonstrated.</w:t>
       </w:r>
     </w:p>
     <w:tbl>
@@ -23218,7 +23210,7 @@
           </w:tcPr>
           <w:p>
             <w:r>
-              <w:t>/auth/me returns 200 (E03); the profile route exists, but no dedicated profile-route screenshot was supplied.</w:t>
+              <w:t>/auth/me returns 200 (E03). The separate profile route has no supplied screenshot.</w:t>
             </w:r>
           </w:p>
         </w:tc>
@@ -23250,7 +23242,7 @@
           </w:tcPr>
           <w:p>
             <w:r>
-              <w:t>403, E14.</w:t>
+              <w:t>403 Forbidden for a student (E14).</w:t>
             </w:r>
           </w:p>
         </w:tc>
@@ -23282,7 +23274,7 @@
           </w:tcPr>
           <w:p>
             <w:r>
-              <w:t>Not tested: supplied admin login attempt returned 401; no valid admin token or successful admin-route response. This is not admin-success evidence.</w:t>
+              <w:t>Not tested: the supplied admin-login attempt returned 401. No valid admin token or successful admin-route response was shown.</w:t>
             </w:r>
           </w:p>
         </w:tc>
@@ -23314,7 +23306,7 @@
           </w:tcPr>
           <w:p>
             <w:r>
-              <w:t>401, E09.</w:t>
+              <w:t>401 Unauthorized (E09).</w:t>
             </w:r>
           </w:p>
         </w:tc>
@@ -23331,7 +23323,7 @@
     </w:p>
     <w:p>
       <w:r>
-        <w:t>A valid login does not automatically authorize GET /api/users/:id or another user’s task. The server must compare authenticated ID/role against the resource owner. Trusting an ID in the URL creates broken access control/IDOR and can disclose or alter another user’s data.</w:t>
+        <w:t>Being signed in is not enough to read any user's information. For a request such as GET /api/users/:id or a task lookup, the server checks whether the signed-in user owns that resource or has an administrator role. If the server trusted only the ID in the URL, one student could try to view or change another student's data. E15 shows the other-student task request being denied with 404.</w:t>
       </w:r>
     </w:p>
     <w:tbl>
@@ -23420,7 +23412,7 @@
           </w:tcPr>
           <w:p>
             <w:r>
-              <w:t>200, E07.</w:t>
+              <w:t>Allowed: the supplied owner read is 200 (E07).</w:t>
             </w:r>
           </w:p>
         </w:tc>
@@ -23452,7 +23444,7 @@
           </w:tcPr>
           <w:p>
             <w:r>
-              <w:t>404 “Task not found”, E15; same response is used for inaccessible/missing tasks.</w:t>
+              <w:t>Denied: 404 Not Found (E15), so the other student's task is not returned.</w:t>
             </w:r>
           </w:p>
         </w:tc>
@@ -23484,7 +23476,7 @@
           </w:tcPr>
           <w:p>
             <w:r>
-              <w:t>Automated test asserts 403; not rerun for this document and no screenshot supplied.</w:t>
+              <w:t>The test source asserts 403, but it was not rerun and there is no screenshot for this case.</w:t>
             </w:r>
           </w:p>
         </w:tc>
@@ -23561,7 +23553,7 @@
           </w:tcPr>
           <w:p>
             <w:r>
-              <w:t>Source review: registration/task validation implemented; invalid registration 400 (E10); JSON limited to 16 KB.</w:t>
+              <w:t>The source checks required fields, types, and limits. Invalid registration returns 400 (E10); JSON bodies are limited to 16 KB.</w:t>
             </w:r>
           </w:p>
         </w:tc>
@@ -23583,7 +23575,7 @@
           </w:tcPr>
           <w:p>
             <w:r>
-              <w:t>Source review: bcrypt hash/compare; response omits password/hash. In-memory storage; not a persistent-database inspection.</w:t>
+              <w:t>The source uses bcrypt hash/compare and omits password data from public responses. Storage is in memory, not a persistent database.</w:t>
             </w:r>
           </w:p>
         </w:tc>
@@ -23605,7 +23597,7 @@
           </w:tcPr>
           <w:p>
             <w:r>
-              <w:t>Generic invalid-credentials response; E11 shows wrong-password 401. Rate limiting/lockout is absent.</w:t>
+              <w:t>Wrong credentials get a generic 401 (E11). The prototype does not include rate limiting or account lockout.</w:t>
             </w:r>
           </w:p>
         </w:tc>
@@ -23627,7 +23619,7 @@
           </w:tcPr>
           <w:p>
             <w:r>
-              <w:t>Source review: JWT middleware protects routes; missing token returns 401 (E09).</w:t>
+              <w:t>JWT middleware protects the routes; the missing-token response is 401 (E09).</w:t>
             </w:r>
           </w:p>
         </w:tc>
@@ -23649,7 +23641,7 @@
           </w:tcPr>
           <w:p>
             <w:r>
-              <w:t>Source review: role/ownership checks; student admin denial 403 (E14) and other-user task denial 404 (E15).</w:t>
+              <w:t>The server checks roles and task ownership. E14 and E15 show student requests being denied.</w:t>
             </w:r>
           </w:p>
         </w:tc>
@@ -23671,7 +23663,7 @@
           </w:tcPr>
           <w:p>
             <w:r>
-              <w:t>Registration assigns student; task owner derives from authenticated identity.</w:t>
+              <w:t>Registration assigns the student role, and task ownership comes from the authenticated user rather than a client-supplied owner ID.</w:t>
             </w:r>
           </w:p>
         </w:tc>
@@ -23693,7 +23685,7 @@
           </w:tcPr>
           <w:p>
             <w:r>
-              <w:t>Admin-only routes are implemented; positive admin access not tested because supplied admin login attempt returned 401.</w:t>
+              <w:t>Admin-only routes are implemented, but positive admin access was not tested: the supplied admin login attempt returned 401.</w:t>
             </w:r>
           </w:p>
         </w:tc>
@@ -23715,7 +23707,7 @@
           </w:tcPr>
           <w:p>
             <w:r>
-              <w:t>publicUser omits passwordHash; JWT has no password/role; E02 token redacted.</w:t>
+              <w:t>Public responses omit passwordHash. E02's bearer token is redacted; the JWT payload is readable, not encrypted.</w:t>
             </w:r>
           </w:p>
         </w:tc>
@@ -23737,7 +23729,7 @@
           </w:tcPr>
           <w:p>
             <w:r>
-              <w:t>secure-api requires JWT_SECRET &gt;=32 bytes from environment; .env ignored. vulnerable-api intentionally has an insecure classroom-only secret.</w:t>
+              <w:t>The secure API reads JWT_SECRET from the environment and ignores .env. vulnerable-api is intentionally insecure classroom material.</w:t>
             </w:r>
           </w:p>
         </w:tc>
@@ -23759,7 +23751,7 @@
           </w:tcPr>
           <w:p>
             <w:r>
-              <w:t>Source review and supplied responses show 400/401/403/404 examples; no client stack trace is intended. This is not a fresh automated test run.</w:t>
+              <w:t>The supplied examples include 400, 401, 403, and 404 responses. These are captured examples, not a new automated test run.</w:t>
             </w:r>
           </w:p>
         </w:tc>
@@ -24077,7 +24069,7 @@
     </w:p>
     <w:p>
       <w:r>
-        <w:t>A hardcoded signing secret is serious because anyone with source access could mint valid tokens and impersonate users, potentially including administrators. Remove the literal, provision a high-entropy secret outside source control, reject startup if missing/weak, and test that valid tokens work while a token signed with an incorrect/old key returns 401. Scan history and rotate exposed secrets. secure-api performs a startup check; vulnerable-api intentionally preserves an unsafe teaching example and must never be deployed.</w:t>
+        <w:t>A hardcoded JWT signing key is dangerous because someone who finds it could create tokens that appear valid and impersonate users. The secure API reads JWT_SECRET from the environment and checks it when starting; an exposed key must be rotated. The separate vulnerable-api is intentionally unsafe teaching material and must not be deployed. A useful test would sign a token with the wrong key and confirm the server rejects it; I am not claiming a new test run here.</w:t>
       </w:r>
     </w:p>
     <w:p>
@@ -24090,7 +24082,7 @@
     </w:p>
     <w:p>
       <w:r>
-        <w:t>The committed collection groups authentication/CRUD and security checks. It includes registration, login, current user, protected access, task CRUD, invalid registration/password, missing authentication, modified/malformed token, student admin denial, second-student task denial, logout and revoked-token denial. It does not provide a valid expired-token request/response. The supplied generation attempt failed and therefore is not evidence that expiry handling returned 401.</w:t>
+        <w:t>The Postman collection covers registration and login, current-user and protected requests, task CRUD, invalid registration and password, missing authentication, modified and malformed tokens, student admin denial, another student's task, logout, and use of a revoked token. It does not contain a successful expired-token request. The supplied attempt to create an expired token failed before it was sent to a protected route, so it cannot show how the API handles expiry.</w:t>
       </w:r>
     </w:p>
     <w:p>
@@ -25207,7 +25199,7 @@
     <w:p/>
     <w:p>
       <w:r>
-        <w:t>A supplied admin-login attempt returned 401, so it did not produce a valid administrator token and did not test successful access to /api/admin. A separate expired-token generation attempt failed before a valid expired JWT was sent to a protected route. These attempts are not passing evidence for the respective security behaviors. E14 remains evidence only of student denial (403); the E01-E17 index is unchanged. Automated-test source assertions are not test results for this document update.</w:t>
+        <w:t>The admin-login attempt returned 401, so it never produced a valid admin token and did not test successful access to /api/admin. The expired-token setup attempt also failed before a token was sent to the route. Neither attempt counts as a passing result. E14 is valid evidence of student denial only. The evidence index remains E01-E17, and automated-test assertions are not presented as a test run for this document update.</w:t>
       </w:r>
     </w:p>
     <w:p>
@@ -25280,7 +25272,7 @@
           </w:tcPr>
           <w:p>
             <w:r>
-              <w:t>See the endpoint-by-endpoint inventory in Part J above. Registration/login and health are public; /auth/me, logout, protected, profile and task routes require a valid JWT; user and admin operations additionally enforce owner/admin roles.</w:t>
+              <w:t>The route-by-route table above lists this for each endpoint. In short, registration and login are public; most other routes need a valid JWT. User and admin routes also check ownership or role.</w:t>
             </w:r>
           </w:p>
         </w:tc>
@@ -25302,7 +25294,7 @@
           </w:tcPr>
           <w:p>
             <w:r>
-              <w:t>The server permits each authenticated student to access their own profile/tasks; an administrator may perform the documented broader operations. Task ownership comes from req.user, not a client-supplied ownerId.</w:t>
+              <w:t>Students can work with their own profile and tasks. Admins can perform the broader operations listed above. The server uses the authenticated user as the task owner, not an owner ID supplied by the client.</w:t>
             </w:r>
           </w:p>
         </w:tc>
@@ -25324,7 +25316,7 @@
           </w:tcPr>
           <w:p>
             <w:r>
-              <w:t>Protected requests without a bearer token return 401; E09 captures /api/protected.</w:t>
+              <w:t>The protected route returns 401 when no bearer token is sent (E09).</w:t>
             </w:r>
           </w:p>
         </w:tc>
@@ -25346,7 +25338,7 @@
           </w:tcPr>
           <w:p>
             <w:r>
-              <w:t>A student calling the admin route receives 403 (E14); a second student reading another user task receives 404 (E15). Successful admin access has no supplied screenshot.</w:t>
+              <w:t>A student is denied the admin route with 403 (E14); another student's task request receives 404 (E15). Successful admin access was not captured.</w:t>
             </w:r>
           </w:p>
         </w:tc>
@@ -25368,7 +25360,7 @@
           </w:tcPr>
           <w:p>
             <w:r>
-              <w:t>Invalid registration returns 400 (E10); wrong credentials return 401 (E11); modified/malformed JWTs return 401 (E12/E13). No expired-token Postman result was supplied.</w:t>
+              <w:t>Invalid registration returns 400 (E10), wrong credentials return 401 (E11), and modified or malformed tokens return 401 (E12/E13). Expiry was not demonstrated.</w:t>
             </w:r>
           </w:p>
         </w:tc>
@@ -25390,7 +25382,7 @@
           </w:tcPr>
           <w:p>
             <w:r>
-              <w:t>Responses must not reveal plaintext passwords, passwordHash or signing secrets. The bearer token is itself sensitive; E02 has it covered. There is no persistent database/hash-inspection screenshot.</w:t>
+              <w:t>Responses should not expose passwords, password hashes, signing secrets, or another user's data. A bearer token is sensitive too, which is why it is covered in E02.</w:t>
             </w:r>
           </w:p>
         </w:tc>
@@ -25412,7 +25404,7 @@
           </w:tcPr>
           <w:p>
             <w:r>
-              <w:t>Use positive and negative Postman requests, record expected and actual status/evidence, and sanitize captures. E01-E17 document the supplied cases. Expired-token and successful-admin Postman cases remain uncaptured/not tested.</w:t>
+              <w:t>Try both allowed and denied requests in Postman, compare the actual status with the expected one, and keep sanitized captures. E01-E17 are the supplied evidence; expiry and successful admin access remain untested.</w:t>
             </w:r>
           </w:p>
         </w:tc>
@@ -25429,7 +25421,7 @@
     </w:p>
     <w:p>
       <w:r>
-        <w:t>Option B (JWT) is implemented in secure-api/src/server.js, src/middleware/auth.js and src/store.js. The minimum five endpoints are present, alongside owner-scoped Week 5 task CRUD. Passwords use bcrypt; authentication checks JWT signature/issuer/expiry and logout revokes jti in a process-local map. Server-side authorization checks role/ownership. Inputs are validated; public responses omit hashes; JWT_SECRET comes from the environment. Postman collection and automated test source cover security behavior. The in-memory store and revocation list reset on restart and are not shared across processes; this is not production-grade persistence/revocation.</w:t>
+        <w:t>This project uses the JWT option and includes the required register, login, current-user, protected-resource, and logout routes. It also carries the Week 5 task CRUD forward, so the API checks who owns a task rather than protecting login alone. Passwords are hashed with bcrypt; the middleware checks token signature, issuer, expiry, and revocation; the server checks roles and ownership; and responses omit password hashes. Data and revoked token IDs are kept in memory and disappear when the server restarts, so this is a classroom prototype rather than production storage.</w:t>
       </w:r>
     </w:p>
     <w:p>
@@ -25735,7 +25727,7 @@
     </w:p>
     <w:p>
       <w:r>
-        <w:t>This draft summarizes the implementation and supplied captures; it does not claim private feelings or unverified tests. Edit the first-person reflection so it honestly describes your own learning and work before submitting.</w:t>
+        <w:t>This is a draft based on the code and screenshots available for the submission. It does not claim personal feelings or tests that I cannot verify. Before handing it in, I should revise the reflection prompts so they match what I actually learned and did.</w:t>
       </w:r>
     </w:p>
     <w:p>
@@ -25748,17 +25740,17 @@
     </w:p>
     <w:p>
       <w:r>
-        <w:t>The minimum routes are registration, login, current-user lookup, a protected resource and logout. I also integrated Week 5 task CRUD so authentication is applied to actual resources: every task is assigned to the authenticated user by the server, and clients cannot submit an owner ID to take ownership. Unsupported task fields are rejected. This illustrates that the security layer protects application operations rather than acting as a separate login-only feature.</w:t>
-      </w:r>
-    </w:p>
-    <w:p>
-      <w:r>
-        <w:t>The evidence captures show registration, login, authenticated access and task CRUD, as well as negative authorization cases. They are supplied screenshots, not proof that I reran every request while preparing this document. The automated test source offers repeatable checks, but the suite was not rerun during preparation.</w:t>
-      </w:r>
-    </w:p>
-    <w:p>
-      <w:r>
-        <w:t>I built a JWT login prototype by combining Week 5 task CRUD behavior with the Week 6 authentication/authorization layer. Registration validates a student account and login returns a short-lived JWT. Protected requests send a Bearer token. Middleware verifies algorithm, signature, issuer, expiry and revocation, then looks up the current user. Role information is not trusted from the token. Students can create, list, read, update and delete their own tasks; administrators can access broader resources. User, task and revocation data are in memory and reset on restart.</w:t>
+        <w:t>I combined the Week 5 task features with the Week 6 login and authorization work. The main routes let a user register, log in, see their current account, use a protected resource, and log out. Task routes use the identity from the verified token to set the owner; a client cannot assign a task to someone else by sending an owner ID. This means the security checks protect real operations as well as the login flow.</w:t>
+      </w:r>
+    </w:p>
+    <w:p>
+      <w:r>
+        <w:t>The included screenshots show the requests that were captured, including successful registration, login, protected access, task operations, and several denied requests. They do not mean that every possible case was tested again while preparing this document. The repository contains automated test code, but I did not rerun the suite for this update.</w:t>
+      </w:r>
+    </w:p>
+    <w:p>
+      <w:r>
+        <w:t>For this project, the token is sent as a bearer credential with protected requests. The middleware checks its signing algorithm, signature, issuer, expiry, and revocation status, then looks up the current user. The server does not rely on a role supplied by the client. Students can work with their own tasks; administrator operations require the configured admin role. Users, tasks, and revoked-token IDs are stored in memory and are cleared when the process restarts.</w:t>
       </w:r>
     </w:p>
     <w:p>
@@ -25771,12 +25763,12 @@
     </w:p>
     <w:p>
       <w:r>
-        <w:t>bcrypt generates salts and makes password guessing more costly than a fast general-purpose hash. Hashing is different from encryption: encryption is reversible with a key, while password verification can compare a candidate without recovering the original password. The implementation also bounds password length to bcrypt's supported byte limit. A remaining account-security gap is that repeated login attempts are not rate-limited in this prototype.</w:t>
-      </w:r>
-    </w:p>
-    <w:p>
-      <w:r>
-        <w:t>Registration stores a bcrypt hash (12 rounds), not the submitted password. Login verifies it using bcrypt.compare; hashes are not decrypted. Generic login errors reduce username enumeration, and public user responses omit passwordHash. Hashing makes offline guessing more costly and avoids exposing reusable plaintext after a data breach. Because the store is in-memory, there is no database screenshot to prove persisted hash storage; the source and response tests are the available evidence.</w:t>
+        <w:t>bcrypt makes password guessing more expensive than a fast general-purpose hash, and it stores a salted hash rather than a reversible copy of the password. Login compares the submitted password with that hash; it does not decrypt anything. The API also limits password length to what bcrypt can handle. One gap is that the prototype does not limit repeated login attempts, so rate limiting and monitoring would be needed before deployment.</w:t>
+      </w:r>
+    </w:p>
+    <w:p>
+      <w:r>
+        <w:t>Registration stores a bcrypt hash using 12 rounds, and login checks it with bcrypt.compare. The API returns public user fields rather than passwordHash, and generic login errors avoid saying whether the username or password was wrong. Because this project stores data in memory, it has no persistent database or stored-hash screenshot. The source code and test assertions are the references available for those implementation details; they are not a database inspection or a fresh test result.</w:t>
       </w:r>
     </w:p>
     <w:p>
@@ -26040,22 +26032,22 @@
     </w:p>
     <w:p>
       <w:r>
-        <w:t>Test example 1 — ownership/IDOR: using a second student's valid token, request the first student's task. Expected: deny access without returning the task. The supplied result is 404 Not Found with a generic “Task not found” response (E15). A conventional functional test might only prove that the owner can read a task; this test checks whether a different identity can read it.</w:t>
-      </w:r>
-    </w:p>
-    <w:p>
-      <w:r>
-        <w:t>Test example 2 — logout invalidation: call logout with the active token and then request the protected route with that same token. Expected: logout succeeds, then access is denied. The supplied results are 200 for logout (E16) and 401 for the revoked token (E17). This tests server-side invalidation instead of relying only on a client to hide its logout button or discard the token.</w:t>
-      </w:r>
-    </w:p>
-    <w:p>
-      <w:r>
-        <w:t>Other supplied captures show no token 401 (E09), wrong password 401 (E11), invalid registration 400 (E10), modified/malformed token 401 (E12/E13), student admin denial 403 (E14), and successful registration/login/protected task workflow (E01–E08). Together these exercise rejection boundaries as well as the happy path.</w:t>
-      </w:r>
-    </w:p>
-    <w:p>
-      <w:r>
-        <w:t>Supplied screenshots show registration 201, login 200 (token redacted), /auth/me and protected route 200, and task create/list/read/update 201/200. Negative tests show missing auth 401, bad registration 400, wrong password 401, modified/malformed JWT 401, student admin denial 403, other student task denial 404, logout 200 and revoked token 401. These check security boundaries beyond ordinary happy-path CRUD. No expired-token Postman screenshot or successful admin route screenshot was supplied. Automated test code has corresponding expiry/admin cases, but I did not rerun them while preparing this document.</w:t>
+        <w:t>One useful security check is to sign in as Student B and request Student A's task. I would expect the server to deny access without returning the task. The supplied capture shows 404 Not Found (E15), which is the response used for a missing or inaccessible task. A normal CRUD test might only check that the owner can read the task; this request checks the boundary between users.</w:t>
+      </w:r>
+    </w:p>
+    <w:p>
+      <w:r>
+        <w:t>Another useful check is to log out and then try the same token again. I would expect logout to succeed and the protected request to fail. The supplied captures show 200 for logout (E16), followed by 401 for the revoked token (E17). This demonstrates invalidation on the running server, rather than only clearing a token from the client.</w:t>
+      </w:r>
+    </w:p>
+    <w:p>
+      <w:r>
+        <w:t>The other supplied captures show a missing token returning 401 (E09), invalid registration returning 400 (E10), and a wrong password returning 401 (E11). Modified and malformed tokens return 401 (E12 and E13), the student admin request returns 403 (E14), and another student's task request returns 404 (E15). These are the outcomes visible in the provided screenshots; they do not cover every possible test.</w:t>
+      </w:r>
+    </w:p>
+    <w:p>
+      <w:r>
+        <w:t>The screenshots also show registration (201, E01), login (200, E02; token redacted), /auth/me (200, E03), protected access (200, E04), and task create/list/read/update (E05-E08). The negative cases are listed above and in the Part I matrix. No expired-token response or successful admin-route response was captured: the expired-token setup failed, and the supplied admin login returned 401. The automated test code contains related assertions, but it was not rerun for this document update.</w:t>
       </w:r>
     </w:p>
     <w:p>
@@ -26068,22 +26060,22 @@
     </w:p>
     <w:p>
       <w:r>
-        <w:t>The contrast between the happy path and denial cases illustrates why authentication and authorization are separate. A valid token establishes identity, but the server must still check the requested operation and resource owner. Here 401 means authentication is missing/invalid, while 403 means an authenticated caller lacks the role; a 404 is used for missing or inaccessible tasks to avoid confirming another user's resource.</w:t>
-      </w:r>
-    </w:p>
-    <w:p>
-      <w:r>
-        <w:t>A signed token is not automatically secret or safe from theft. JWT payloads are readable, bearer tokens can be stolen, and a compromised signing key can undermine token trust. Tokens should contain only needed claims, have an appropriate lifetime, travel over HTTPS in real deployments, and be protected on the client. This prototype does not claim that JWT encrypts payload data.</w:t>
-      </w:r>
-    </w:p>
-    <w:p>
-      <w:r>
-        <w:t>Personalize this draft: “Before this lab, I thought a successful login might be enough to permit actions. The API demonstrates that authentication identifies the caller while authorization checks whether that caller owns the resource or has the required role. A valid token is not permission for every operation.” Keep only if it reflects your own prior understanding.</w:t>
-      </w:r>
-    </w:p>
-    <w:p>
-      <w:r>
-        <w:t>Before production, I would replace in-memory data and revocation with persistent/shared storage, add migrations and race-safe uniqueness, login rate limiting and monitoring, enforce HTTPS, manage/rotate secrets, review token storage and CSRF/XSS risks, and test expiry/admin success and denial. Those items are not all implemented here.</w:t>
+        <w:t>The examples help show that authentication and authorization are different checks. A valid token tells the server who is making the request, but the server still needs to ask whether that user may perform the requested action or access that resource. In this API, 401 means the credential is missing or invalid, 403 means the user lacks permission, and 404 is used for tasks that are missing or not accessible to that user.</w:t>
+      </w:r>
+    </w:p>
+    <w:p>
+      <w:r>
+        <w:t>A signed JWT is not automatically secret: its payload can be read, and a stolen bearer token can be replayed. A compromised signing key would also undermine trust in tokens. The payload should contain only necessary claims, tokens should have a suitable lifetime, and a real deployment should use HTTPS and protect tokens on the client. This prototype does not encrypt JWT payloads.</w:t>
+      </w:r>
+    </w:p>
+    <w:p>
+      <w:r>
+        <w:t>Personal reflection prompt - replace this with my own honest answer: "Before this lab, I may have treated a successful login as if it allowed every action. The examples here separate identity from permission: a valid token identifies the caller, while the server still checks the role or resource owner." Keep this wording only if it matches my actual prior understanding; otherwise rewrite it.</w:t>
+      </w:r>
+    </w:p>
+    <w:p>
+      <w:r>
+        <w:t>Before using this beyond a lab, I would move users, tasks, and revocation data into persistent/shared storage, add migrations and safe uniqueness checks, and introduce login rate limits and monitoring. I would also require HTTPS, use a managed secret and rotation process, review client token storage and XSS/CSRF protections, and test expiry and both successful and denied admin access. These are recommendations, not features I am claiming are already implemented.</w:t>
       </w:r>
     </w:p>
     <w:p>
@@ -26376,7 +26368,7 @@
           </w:tcPr>
           <w:p>
             <w:r>
-              <w:t>Draft analysis is in Parts H/M; source assertions are distinguished from executed test results, and personal reflection requires the student?s own revision.</w:t>
+              <w:t>Draft analysis is in Parts H/M; source assertions are distinguished from executed test results, and personal reflection requires the student's own revision.</w:t>
             </w:r>
           </w:p>
         </w:tc>
@@ -26393,7 +26385,7 @@
     </w:p>
     <w:p>
       <w:r>
-        <w:t>The repository adapts the suggested layout: secure-api/src/server.js contains Express routes and request handling; secure-api/src/middleware/auth.js contains JWT authentication and role middleware; secure-api/src/store.js is the in-memory store; secure-api/test/auth-tasks.test.js contains Node test-runner integration checks; postman/CBE204-Week06-Security.postman_collection.json contains the request collection; README.md describes setup, endpoints and limitations. session-api/ is a separate session/cookie classroom example, and vulnerable-api/ is intentionally insecure teaching material, not the secure submission. submission/CBE204_Week6_Lab_Sheet_Completed_DRAFT.docx is the answer copy and submission/evidence/E01.png-E17.png are the sanitized screenshots referenced by its index. There is no persistent database, schema/migration directory, front-end app or separate personal-reflection file. This adapts the suggested structure to the existing project; the cheat sheet is guidance, not an additional deliverable.</w:t>
+        <w:t>I adapted the suggested layout to the existing repository instead of copying it exactly. The secure API is under secure-api/src, with routes in server.js, authentication middleware in middleware/auth.js, and the in-memory store in store.js. Automated test code is in secure-api/test, the Postman collection is under postman, and README.md explains setup and limitations. session-api is a separate session example, while vulnerable-api is intentionally insecure teaching material - not part of the secure submission. The answer copy is in submission, with the safe E01-E17 screenshots in submission/evidence. There is no persistent database or migration/schema folder. The cheat sheet is guidance, not another deliverable.</w:t>
       </w:r>
     </w:p>
     <w:p>
@@ -26642,7 +26634,7 @@
     </w:p>
     <w:p>
       <w:r>
-        <w:t>Exhibit files are separate PNGs in submission/evidence/ and referenced by ID in Parts D, E, I and L. E02 is the only altered screenshot: an opaque black box covers the complete JWT response value. Original screenshot is not copied.</w:t>
+        <w:t>The safe evidence images are stored separately in submission/evidence and referenced by exhibit ID in the answers. E02 has an opaque black cover over the complete bearer-token value. The unredacted original was not copied into the submission.</w:t>
       </w:r>
     </w:p>
     <w:tbl>
@@ -27252,7 +27244,7 @@
     <w:p/>
     <w:p>
       <w:r>
-        <w:t>Not supplied/not claimed: persistent database hash inspection, expired-token Postman response, successful administrator-route response, or a student-authored personal reflection. Supplied screenshots that disclose credentials are excluded; only safe evidence copies are included.</w:t>
+        <w:t>Not supplied and not claimed: a persistent-database hash inspection, a protected-route response to a valid expired token, a successful administrator-route response, or a student-authored personal reflection. Screenshots that expose credentials are excluded; only the safe E01-E17 copies are included.</w:t>
       </w:r>
     </w:p>
     <w:sectPr>

</xml_diff>